<commit_message>
fixed table & gambar counter
</commit_message>
<xml_diff>
--- a/NASKAH/Dokumen Proposal Skripsi - NIM - NAMA - TAHUN ANGKATAN - TAHUN SKRIPSI.docx
+++ b/NASKAH/Dokumen Proposal Skripsi - NIM - NAMA - TAHUN ANGKATAN - TAHUN SKRIPSI.docx
@@ -4234,7 +4234,7 @@
         </w:rPr>
         <w:fldChar w:fldCharType="separate"/>
       </w:r>
-      <w:hyperlink w:anchor="_Toc221109400" w:history="1">
+      <w:hyperlink w:anchor="_Toc221665222" w:history="1">
         <w:r>
           <w:rPr>
             <w:rStyle w:val="Hyperlink"/>
@@ -4284,7 +4284,7 @@
             <w:noProof/>
             <w:webHidden/>
           </w:rPr>
-          <w:instrText xml:space="preserve"> PAGEREF _Toc221109400 \h </w:instrText>
+          <w:instrText xml:space="preserve"> PAGEREF _Toc221665222 \h </w:instrText>
         </w:r>
         <w:r>
           <w:rPr>
@@ -4327,7 +4327,7 @@
           <w:lang w:val="en-US"/>
         </w:rPr>
       </w:pPr>
-      <w:hyperlink w:anchor="_Toc221109401" w:history="1">
+      <w:hyperlink w:anchor="_Toc221665223" w:history="1">
         <w:r>
           <w:rPr>
             <w:rStyle w:val="Hyperlink"/>
@@ -4386,7 +4386,7 @@
             <w:noProof/>
             <w:webHidden/>
           </w:rPr>
-          <w:instrText xml:space="preserve"> PAGEREF _Toc221109401 \h </w:instrText>
+          <w:instrText xml:space="preserve"> PAGEREF _Toc221665223 \h </w:instrText>
         </w:r>
         <w:r>
           <w:rPr>
@@ -4429,13 +4429,13 @@
           <w:lang w:val="en-US"/>
         </w:rPr>
       </w:pPr>
-      <w:hyperlink w:anchor="_Toc221109402" w:history="1">
+      <w:hyperlink w:anchor="_Toc221665224" w:history="1">
         <w:r>
           <w:rPr>
             <w:rStyle w:val="Hyperlink"/>
             <w:noProof/>
           </w:rPr>
-          <w:t>Gambar 3</w:t>
+          <w:t xml:space="preserve">Gambar </w:t>
         </w:r>
         <w:r>
           <w:rPr>
@@ -4443,14 +4443,14 @@
             <w:noProof/>
             <w:lang w:val="en-US"/>
           </w:rPr>
-          <w:t>.3</w:t>
+          <w:t>3.</w:t>
         </w:r>
         <w:r>
           <w:rPr>
             <w:rStyle w:val="Hyperlink"/>
             <w:noProof/>
           </w:rPr>
-          <w:t xml:space="preserve">. </w:t>
+          <w:t xml:space="preserve">3. </w:t>
         </w:r>
         <w:r>
           <w:rPr>
@@ -4488,7 +4488,7 @@
             <w:noProof/>
             <w:webHidden/>
           </w:rPr>
-          <w:instrText xml:space="preserve"> PAGEREF _Toc221109402 \h </w:instrText>
+          <w:instrText xml:space="preserve"> PAGEREF _Toc221665224 \h </w:instrText>
         </w:r>
         <w:r>
           <w:rPr>
@@ -4553,6 +4553,8 @@
       <w:bookmarkEnd w:id="6"/>
       <w:bookmarkEnd w:id="7"/>
     </w:p>
+    <w:bookmarkStart w:id="8" w:name="_GoBack"/>
+    <w:bookmarkEnd w:id="8"/>
     <w:p>
       <w:pPr>
         <w:pStyle w:val="TableofFigures"/>
@@ -4574,7 +4576,7 @@
       <w:r>
         <w:fldChar w:fldCharType="separate"/>
       </w:r>
-      <w:hyperlink w:anchor="_Toc221117439" w:history="1">
+      <w:hyperlink w:anchor="_Toc221665233" w:history="1">
         <w:r>
           <w:rPr>
             <w:rStyle w:val="Hyperlink"/>
@@ -4625,7 +4627,7 @@
             <w:noProof/>
             <w:webHidden/>
           </w:rPr>
-          <w:instrText xml:space="preserve"> PAGEREF _Toc221117439 \h </w:instrText>
+          <w:instrText xml:space="preserve"> PAGEREF _Toc221665233 \h </w:instrText>
         </w:r>
         <w:r>
           <w:rPr>
@@ -4668,7 +4670,7 @@
           <w:lang w:val="en-US"/>
         </w:rPr>
       </w:pPr>
-      <w:hyperlink w:anchor="_Toc221117440" w:history="1">
+      <w:hyperlink w:anchor="_Toc221665234" w:history="1">
         <w:r>
           <w:rPr>
             <w:rStyle w:val="Hyperlink"/>
@@ -4710,7 +4712,7 @@
             <w:noProof/>
             <w:webHidden/>
           </w:rPr>
-          <w:instrText xml:space="preserve"> PAGEREF _Toc221117440 \h </w:instrText>
+          <w:instrText xml:space="preserve"> PAGEREF _Toc221665234 \h </w:instrText>
         </w:r>
         <w:r>
           <w:rPr>
@@ -4753,7 +4755,7 @@
           <w:lang w:val="en-US"/>
         </w:rPr>
       </w:pPr>
-      <w:hyperlink w:anchor="_Toc221117441" w:history="1">
+      <w:hyperlink w:anchor="_Toc221665235" w:history="1">
         <w:r>
           <w:rPr>
             <w:rStyle w:val="Hyperlink"/>
@@ -4803,7 +4805,7 @@
             <w:noProof/>
             <w:webHidden/>
           </w:rPr>
-          <w:instrText xml:space="preserve"> PAGEREF _Toc221117441 \h </w:instrText>
+          <w:instrText xml:space="preserve"> PAGEREF _Toc221665235 \h </w:instrText>
         </w:r>
         <w:r>
           <w:rPr>
@@ -4846,7 +4848,7 @@
           <w:lang w:val="en-US"/>
         </w:rPr>
       </w:pPr>
-      <w:hyperlink w:anchor="_Toc221117442" w:history="1">
+      <w:hyperlink w:anchor="_Toc221665236" w:history="1">
         <w:r>
           <w:rPr>
             <w:rStyle w:val="Hyperlink"/>
@@ -4896,7 +4898,7 @@
             <w:noProof/>
             <w:webHidden/>
           </w:rPr>
-          <w:instrText xml:space="preserve"> PAGEREF _Toc221117442 \h </w:instrText>
+          <w:instrText xml:space="preserve"> PAGEREF _Toc221665236 \h </w:instrText>
         </w:r>
         <w:r>
           <w:rPr>
@@ -4939,7 +4941,7 @@
           <w:lang w:val="en-US"/>
         </w:rPr>
       </w:pPr>
-      <w:hyperlink w:anchor="_Toc221117443" w:history="1">
+      <w:hyperlink w:anchor="_Toc221665237" w:history="1">
         <w:r>
           <w:rPr>
             <w:rStyle w:val="Hyperlink"/>
@@ -4998,7 +5000,7 @@
             <w:noProof/>
             <w:webHidden/>
           </w:rPr>
-          <w:instrText xml:space="preserve"> PAGEREF _Toc221117443 \h </w:instrText>
+          <w:instrText xml:space="preserve"> PAGEREF _Toc221665237 \h </w:instrText>
         </w:r>
         <w:r>
           <w:rPr>
@@ -5041,7 +5043,7 @@
           <w:lang w:val="en-US"/>
         </w:rPr>
       </w:pPr>
-      <w:hyperlink w:anchor="_Toc221117444" w:history="1">
+      <w:hyperlink w:anchor="_Toc221665238" w:history="1">
         <w:r>
           <w:rPr>
             <w:rStyle w:val="Hyperlink"/>
@@ -5091,7 +5093,7 @@
             <w:noProof/>
             <w:webHidden/>
           </w:rPr>
-          <w:instrText xml:space="preserve"> PAGEREF _Toc221117444 \h </w:instrText>
+          <w:instrText xml:space="preserve"> PAGEREF _Toc221665238 \h </w:instrText>
         </w:r>
         <w:r>
           <w:rPr>
@@ -5145,26 +5147,26 @@
       <w:pPr>
         <w:pStyle w:val="Heading1"/>
       </w:pPr>
-      <w:bookmarkStart w:id="8" w:name="_Toc75025329"/>
-      <w:bookmarkStart w:id="9" w:name="_Toc221117416"/>
+      <w:bookmarkStart w:id="9" w:name="_Toc75025329"/>
+      <w:bookmarkStart w:id="10" w:name="_Toc221117416"/>
       <w:r>
         <w:lastRenderedPageBreak/>
         <w:t>BAB 1 PENDAHULUAN</w:t>
       </w:r>
-      <w:bookmarkEnd w:id="8"/>
       <w:bookmarkEnd w:id="9"/>
+      <w:bookmarkEnd w:id="10"/>
     </w:p>
     <w:p>
       <w:pPr>
         <w:pStyle w:val="Heading2"/>
       </w:pPr>
-      <w:bookmarkStart w:id="10" w:name="_Toc75025330"/>
-      <w:bookmarkStart w:id="11" w:name="_Toc221117417"/>
+      <w:bookmarkStart w:id="11" w:name="_Toc75025330"/>
+      <w:bookmarkStart w:id="12" w:name="_Toc221117417"/>
       <w:r>
         <w:t>1.1 Latar Belakang</w:t>
       </w:r>
-      <w:bookmarkEnd w:id="10"/>
       <w:bookmarkEnd w:id="11"/>
+      <w:bookmarkEnd w:id="12"/>
     </w:p>
     <w:p>
       <w:pPr>
@@ -5236,22 +5238,10 @@
         <w:t xml:space="preserve">) yang mampu mendukung keberlanjutan dan efisiensi </w:t>
       </w:r>
       <w:r>
-        <w:fldChar w:fldCharType="begin"/>
-      </w:r>
-      <w:r>
-        <w:instrText xml:space="preserve"> ADDIN ZOTERO_ITEM CSL_CITATION {"citationID":"7CnuAFwA","properties":{"formattedCitation":"[1], [2], [3]","plainCitation":"[1], [2], [3]","noteIndex":0},"citationItems":[{"id":118,"uris":["http://zotero.org/users/local/fMw9Ltvi/items/Q36K3WCS"],"itemData":{"id":118,"type":"article-journal","abstract":"The implementation of artiﬁcial intelligence on very tiny chips plays an important role in the future of IoT. Typically, these chips do not conduct artiﬁcial intelligence operations locally. They mostly send collected data to a cloud service, where artiﬁcial intelligence is implemented for decision making. This leads to a time lag and signiﬁcant dependency of the system on an internet connection, making it unsuitable for systems requiring immediate action. In a hydroponic system, there is an immediate need to control the speed of a pump to maintain pH level. However, there are many challenges in designing an intelligent system using low- powered chips with low computational power. Therefore, achieving high AI accuracy is very difficult for these devices. Additionally, tiny devices need to communicate with the user to execute IoT operations. To overcome these challenges, a hydroponic system was designed in this study to incorporate an ESP32 chip-based microcontroller with sensors and actuators attached to it, so that AI on edge and IoT tasks can be executed simultaneously. A dedicated android app was implemented to monitor and control the system remotely via IoT. Results show that the predicted pump speed just falls behind the expected speed by an average of 2.94%. The overall designed system was stable and reliable. Komatsuna plants were grown in a hydroponic system and the yield was compared with the plants grown in standard potting compost.","container-title":"AI, Computer Science and Robotics Technology","DOI":"10.5772/acrt.20240016","ISSN":"2754-6292","journalAbbreviation":"ACRT","language":"en","license":"https://creativecommons.org/licenses/by/4.0/","source":"DOI.org (Crossref)","title":"A Machine Learning Method on a Tiny Hardware for Monitoring and Controlling a Hydroponic System","URL":"https://www.intechopen.com/journals/1/articles/532","volume":"4","author":[{"family":"Sharma","given":"Arpit"},{"family":"Taherkhani","given":"Anahita"},{"family":"Orba","given":"Ezekiel"},{"family":"Taherkhani","given":"Aboozar"}],"accessed":{"date-parts":[["2026",1,28]]},"issued":{"date-parts":[["2025",1,24]]}}},{"id":131,"uris":["http://zotero.org/users/local/fMw9Ltvi/items/FUGM257W"],"itemData":{"id":131,"type":"article-journal","abstract":"Munculnya Internet Of Things (IOT) sebagai bidang ilmu baru pada ilmu komputer memiliki efek yang besar terhadap konektivitas teknologi. IOT merupakan sebuah konsep teknologi yang bertujuan untuk menghubungkan objek-objek dalam rangka transfer data dan kendali melalui Internet. Maka IOT merupakan solusi pada sistem-sistem sebelumnya yang memiliki keterbatasan jarak pada aplikasinya. Seperti sistem monitoring suhu dan kelembaban, dimana pada penelitian sebelumnya sistem monitoring suhu dan kelembaban ruangan terbatas jarak karena menggunakan modul bluethoot untuk transfer datanya. Penelitian ini bertujuan untuk menggunakan konsep IOT pada sistem monitoring suhu dan kelembaban. Dengan menggunakan esp32 yang mana sudah terdapat modul wifi pada boardnya, maka keterbatasan jarak akan dapat diatasi dengan terhubungnya sistem dengan koneksi internet. Menggunakan sensor DHT11 sebagai pendeteksi suhu dan kelembaban ruangan. Sensor ini terbilang cukup akurat dalam mendeteksi suhu dan kelembaban ruangan. Kemudian sistem ini akan mengirimkan output pembacaan sensor ke database realtime firebase melalui jaringan internet. Database tersebut akan menyimpan hasil pembacaan sensor DHT11. Kemudian pengguna menggunakan sebuah aplikasi android untuk melakukan monitoring suhu dan kelembaban. Dimana aplikasi ini dibuat menggunakan kodular. Aplikasi akan mengambil data yang ada pada database firebase, dan akan selalu update setiap terjadi perubahan data pada database. Setelah melakukan pengujian keseluruhan, sistem monitoring suhu dan kelembaban dapat bekerja dengan baik. Monitoring suhu dan kelembaban dapat dilakukan dari jarak yang jauh dari posisi ruangan dengan menggunakan aplikasi android","container-title":"JATI (Jurnal Mahasiswa Teknik Informatika)","DOI":"10.36040/jati.v9i1.12874","ISSN":"2598-828X","issue":"1","journalAbbreviation":"jati","language":"id","license":"https://creativecommons.org/licenses/by-sa/4.0","page":"1781-1787","source":"DOI.org (Crossref)","title":"IMPLEMENTASI IOT PADA SISTEM MONITORING SUHU DAN KELEMBABAN MENGGUNAKAN ESP32, FIREBASE DAN KODULAR","volume":"9","author":[{"family":"Kurnia Ar","given":"Harlan"}],"issued":{"date-parts":[["2025",1,19]]}}},{"id":132,"uris":["http://zotero.org/users/local/fMw9Ltvi/items/CXAG5SZ7"],"itemData":{"id":132,"type":"article-journal","abstract":"This project presents a comprehensive pothole detection and navigation system aimed at improving road safety and reducing vehicle wear and tear. The system utilizes an ESP32 microcontroller, a gyroscope, and a GPS module, integrated into car tires to enable real-time detection of potholes. The gyroscope measures vibrations and deviations caused by uneven road surfaces, while the GPS module pinpoints the exact geographic location of the detected potholes. The system also measures the depth and width of the potholes to provide detailed information. This data is transmitted wirelessly to a central server, where an AI-based algorithm processes it to eliminate duplicate entries and filter out false detections. Once validated, the pothole information is mapped onto a user-friendly mobile application, providing users with real-time updates on road conditions. By allowing users to choose safer and smoother routes with minimal potholes, this system ensures enhanced driving safety, reduced maintenance costs, and a more efficient travel experience. Additionally, the mapped pothole data can serve as valuable feedback for road maintenance authorities to prioritize repairs and improve infrastructure.","container-title":"INTERANTIONAL JOURNAL OF SCIENTIFIC RESEARCH IN ENGINEERING AND MANAGEMENT","DOI":"10.55041/IJSREM40900","ISSN":"25823930","issue":"01","journalAbbreviation":"IJSREM","language":"en","page":"1-9","source":"DOI.org (Crossref)","title":"IOT based Smart Pothole Detection System using ESP32","volume":"09","author":[{"literal":"ECE &amp; IARE"},{"family":"Veeraswamy","given":"D"}],"issued":{"date-parts":[["2025",1,19]]}}}],"schema":"https://github.com/citation-style-language/schema/raw/master/csl-citation.json"} </w:instrText>
-      </w:r>
-      <w:r>
-        <w:fldChar w:fldCharType="separate"/>
-      </w:r>
-      <w:r>
-        <w:rPr>
-          <w:rFonts w:cs="Arial"/>
-        </w:rPr>
-        <w:t>[1], [2], [3]</w:t>
-      </w:r>
-      <w:r>
-        <w:fldChar w:fldCharType="end"/>
+        <w:rPr>
+          <w:lang w:val="en-US"/>
+        </w:rPr>
+        <w:t>bel</w:t>
       </w:r>
       <w:r>
         <w:t xml:space="preserve">. Teknologi </w:t>
@@ -5351,15 +5341,7 @@
         <w:t>sinkronisasi cloud</w:t>
       </w:r>
       <w:r>
-        <w:t xml:space="preserve">, di mana data </w:t>
-      </w:r>
-      <w:proofErr w:type="gramStart"/>
-      <w:r>
-        <w:t>akan</w:t>
-      </w:r>
-      <w:proofErr w:type="gramEnd"/>
-      <w:r>
-        <w:t xml:space="preserve"> dikirim ke server saat koneksi tersedia, sehingga sistem dapat diakses dan dikontrol secara jarak jauh. Dengan pendekatan ini, sistem monitoring dan kontrol rumah kaca tetap adaptif baik dalam kondisi </w:t>
+        <w:t xml:space="preserve">, di mana data akan dikirim ke server saat koneksi tersedia, sehingga sistem dapat diakses dan dikontrol secara jarak jauh. Dengan pendekatan ini, sistem monitoring dan kontrol rumah kaca tetap adaptif baik dalam kondisi </w:t>
       </w:r>
       <w:r>
         <w:rPr>
@@ -5961,13 +5943,13 @@
       <w:pPr>
         <w:pStyle w:val="Heading2"/>
       </w:pPr>
-      <w:bookmarkStart w:id="12" w:name="_Toc75025331"/>
-      <w:bookmarkStart w:id="13" w:name="_Toc221117418"/>
+      <w:bookmarkStart w:id="13" w:name="_Toc75025331"/>
+      <w:bookmarkStart w:id="14" w:name="_Toc221117418"/>
       <w:r>
         <w:t>1.2 Rumusan Masalah</w:t>
       </w:r>
-      <w:bookmarkEnd w:id="12"/>
       <w:bookmarkEnd w:id="13"/>
+      <w:bookmarkEnd w:id="14"/>
     </w:p>
     <w:p>
       <w:pPr>
@@ -6114,13 +6096,13 @@
       <w:pPr>
         <w:pStyle w:val="Heading2"/>
       </w:pPr>
-      <w:bookmarkStart w:id="14" w:name="_Toc75025333"/>
-      <w:bookmarkStart w:id="15" w:name="_Toc221117419"/>
+      <w:bookmarkStart w:id="15" w:name="_Toc75025333"/>
+      <w:bookmarkStart w:id="16" w:name="_Toc221117419"/>
       <w:r>
         <w:t>1.3 Tujuan Penelitian</w:t>
       </w:r>
-      <w:bookmarkEnd w:id="14"/>
       <w:bookmarkEnd w:id="15"/>
+      <w:bookmarkEnd w:id="16"/>
     </w:p>
     <w:p>
       <w:pPr>
@@ -6311,11 +6293,11 @@
       <w:pPr>
         <w:pStyle w:val="Heading2"/>
       </w:pPr>
-      <w:bookmarkStart w:id="16" w:name="_Toc221117420"/>
+      <w:bookmarkStart w:id="17" w:name="_Toc221117420"/>
       <w:r>
         <w:t>1.4 Manfaat Penelitian</w:t>
       </w:r>
-      <w:bookmarkEnd w:id="16"/>
+      <w:bookmarkEnd w:id="17"/>
     </w:p>
     <w:p>
       <w:pPr>
@@ -6370,11 +6352,11 @@
       <w:pPr>
         <w:pStyle w:val="Heading2"/>
       </w:pPr>
-      <w:bookmarkStart w:id="17" w:name="_Toc221117421"/>
+      <w:bookmarkStart w:id="18" w:name="_Toc221117421"/>
       <w:r>
         <w:t>1.5 Batasan Masalah</w:t>
       </w:r>
-      <w:bookmarkEnd w:id="17"/>
+      <w:bookmarkEnd w:id="18"/>
     </w:p>
     <w:p>
       <w:pPr>
@@ -6634,12 +6616,12 @@
       <w:pPr>
         <w:pStyle w:val="Heading1"/>
       </w:pPr>
-      <w:bookmarkStart w:id="18" w:name="_Toc221117422"/>
+      <w:bookmarkStart w:id="19" w:name="_Toc221117422"/>
       <w:r>
         <w:lastRenderedPageBreak/>
         <w:t>BAB 2 TINJAUAN PUSTAKA</w:t>
       </w:r>
-      <w:bookmarkEnd w:id="18"/>
+      <w:bookmarkEnd w:id="19"/>
     </w:p>
     <w:p>
       <w:pPr>
@@ -6648,14 +6630,14 @@
           <w:lang w:val="en-US"/>
         </w:rPr>
       </w:pPr>
-      <w:bookmarkStart w:id="19" w:name="_Toc221117423"/>
+      <w:bookmarkStart w:id="20" w:name="_Toc221117423"/>
       <w:r>
         <w:rPr>
           <w:lang w:val="en-US"/>
         </w:rPr>
         <w:t>2.1 Deskripsi Masalah</w:t>
       </w:r>
-      <w:bookmarkEnd w:id="19"/>
+      <w:bookmarkEnd w:id="20"/>
     </w:p>
     <w:p>
       <w:pPr>
@@ -6668,21 +6650,7 @@
         <w:rPr>
           <w:lang w:val="en-US"/>
         </w:rPr>
-        <w:t xml:space="preserve">Pertanian hortikultura skala kecil menghadapi tantangan besar akibat perubahan iklim, keterbatasan sumber daya, serta ancaman </w:t>
-      </w:r>
-      <w:proofErr w:type="gramStart"/>
-      <w:r>
-        <w:rPr>
-          <w:lang w:val="en-US"/>
-        </w:rPr>
-        <w:t>hama</w:t>
-      </w:r>
-      <w:proofErr w:type="gramEnd"/>
-      <w:r>
-        <w:rPr>
-          <w:lang w:val="en-US"/>
-        </w:rPr>
-        <w:t xml:space="preserve"> dan penyakit tanaman. Perubahan iklim meningkatkan ketidakpastian pola cuaca, yang berdampak pada ketersediaan air, produktivitas tanaman, dan kerent</w:t>
+        <w:t>Pertanian hortikultura skala kecil menghadapi tantangan besar akibat perubahan iklim, keterbatasan sumber daya, serta ancaman hama dan penyakit tanaman. Perubahan iklim meningkatkan ketidakpastian pola cuaca, yang berdampak pada ketersediaan air, produktivitas tanaman, dan kerent</w:t>
       </w:r>
       <w:r>
         <w:rPr>
@@ -7156,14 +7124,14 @@
           <w:lang w:val="en-US"/>
         </w:rPr>
       </w:pPr>
-      <w:bookmarkStart w:id="20" w:name="_Toc221117424"/>
+      <w:bookmarkStart w:id="21" w:name="_Toc221117424"/>
       <w:r>
         <w:rPr>
           <w:lang w:val="en-US"/>
         </w:rPr>
         <w:t>2.2 Metode Pendekatan Masalah</w:t>
       </w:r>
-      <w:bookmarkEnd w:id="20"/>
+      <w:bookmarkEnd w:id="21"/>
     </w:p>
     <w:p>
       <w:pPr>
@@ -7189,42 +7157,14 @@
         <w:rPr>
           <w:lang w:val="en-US"/>
         </w:rPr>
-        <w:t xml:space="preserve"> yang dapat diakses secara efektif dan mudah digunakan. Karena sistem ini </w:t>
-      </w:r>
-      <w:proofErr w:type="gramStart"/>
-      <w:r>
-        <w:rPr>
-          <w:lang w:val="en-US"/>
-        </w:rPr>
-        <w:t>akan</w:t>
-      </w:r>
-      <w:proofErr w:type="gramEnd"/>
-      <w:r>
-        <w:rPr>
-          <w:lang w:val="en-US"/>
-        </w:rPr>
-        <w:t xml:space="preserve"> digunakan oleh petani hortikultura skala kecil dan harus beradaptasi dengan kondisi </w:t>
+        <w:t xml:space="preserve"> yang dapat diakses secara efektif dan mudah digunakan. Karena sistem ini akan digunakan oleh petani hortikultura skala kecil dan harus beradaptasi dengan kondisi </w:t>
       </w:r>
       <w:r>
         <w:rPr>
           <w:lang w:val="en-US"/>
         </w:rPr>
         <w:lastRenderedPageBreak/>
-        <w:t xml:space="preserve">lingkungan yang dinamis, maka pendekatan pengembangan yang dipilih tidak bisa statis. Proses pemilihan metodologi dilakukan melalui perbandingan beberapa pendekatan yang umum digunakan, mencakup metode pengembangan perangkat lunak serta metodologi perancangan antarmuka pengguna. Metodologi pengembangan perangkat lunak menentukan </w:t>
-      </w:r>
-      <w:proofErr w:type="gramStart"/>
-      <w:r>
-        <w:rPr>
-          <w:lang w:val="en-US"/>
-        </w:rPr>
-        <w:t>cara</w:t>
-      </w:r>
-      <w:proofErr w:type="gramEnd"/>
-      <w:r>
-        <w:rPr>
-          <w:lang w:val="en-US"/>
-        </w:rPr>
-        <w:t xml:space="preserve"> bekerja dalam merencanakan, mengimplementasikan, menguji, dan merilis sistem. Di antara metode yang dipertimbangkan adalah </w:t>
+        <w:t xml:space="preserve">lingkungan yang dinamis, maka pendekatan pengembangan yang dipilih tidak bisa statis. Proses pemilihan metodologi dilakukan melalui perbandingan beberapa pendekatan yang umum digunakan, mencakup metode pengembangan perangkat lunak serta metodologi perancangan antarmuka pengguna. Metodologi pengembangan perangkat lunak menentukan cara bekerja dalam merencanakan, mengimplementasikan, menguji, dan merilis sistem. Di antara metode yang dipertimbangkan adalah </w:t>
       </w:r>
       <w:r>
         <w:rPr>
@@ -7309,21 +7249,7 @@
         <w:rPr>
           <w:lang w:val="en-US"/>
         </w:rPr>
-        <w:t xml:space="preserve"> berlangsung, revisi </w:t>
-      </w:r>
-      <w:proofErr w:type="gramStart"/>
-      <w:r>
-        <w:rPr>
-          <w:lang w:val="en-US"/>
-        </w:rPr>
-        <w:t>akan</w:t>
-      </w:r>
-      <w:proofErr w:type="gramEnd"/>
-      <w:r>
-        <w:rPr>
-          <w:lang w:val="en-US"/>
-        </w:rPr>
-        <w:t xml:space="preserve"> memakan waktu karena harus kembali ke langkah awal. Hal ini sangat krusial bagi sistem rumah kaca, di mana kondisi lingkungan dan </w:t>
+        <w:t xml:space="preserve"> berlangsung, revisi akan memakan waktu karena harus kembali ke langkah awal. Hal ini sangat krusial bagi sistem rumah kaca, di mana kondisi lingkungan dan </w:t>
       </w:r>
       <w:r>
         <w:rPr>
@@ -7503,7 +7429,6 @@
         </w:rPr>
         <w:t xml:space="preserve"> memerlukan kemampuan beradaptasi dengan variabel lingkungan, dan </w:t>
       </w:r>
-      <w:proofErr w:type="gramStart"/>
       <w:r>
         <w:rPr>
           <w:i/>
@@ -7511,7 +7436,6 @@
         </w:rPr>
         <w:t>Agile</w:t>
       </w:r>
-      <w:proofErr w:type="gramEnd"/>
       <w:r>
         <w:rPr>
           <w:lang w:val="en-US"/>
@@ -7599,21 +7523,7 @@
         <w:rPr>
           <w:lang w:val="en-US"/>
         </w:rPr>
-        <w:t xml:space="preserve">) adalah langkah penting dalam penelitian ini karena sistem </w:t>
-      </w:r>
-      <w:proofErr w:type="gramStart"/>
-      <w:r>
-        <w:rPr>
-          <w:lang w:val="en-US"/>
-        </w:rPr>
-        <w:t>akan</w:t>
-      </w:r>
-      <w:proofErr w:type="gramEnd"/>
-      <w:r>
-        <w:rPr>
-          <w:lang w:val="en-US"/>
-        </w:rPr>
-        <w:t xml:space="preserve"> digunakan langsung oleh petani hortikultura, yang mungkin tidak terbiasa dengan teknologi canggih. Tujuannya bukan hanya membuat sistem yang berfungsi, tetapi juga yang nyaman, mudah dipelajari, dan membantu pekerjaan mereka. Untuk itu, beberapa pendekatan desain dipertimbangkan tiga metode antara lain </w:t>
+        <w:t xml:space="preserve">) adalah langkah penting dalam penelitian ini karena sistem akan digunakan langsung oleh petani hortikultura, yang mungkin tidak terbiasa dengan teknologi canggih. Tujuannya bukan hanya membuat sistem yang berfungsi, tetapi juga yang nyaman, mudah dipelajari, dan membantu pekerjaan mereka. Untuk itu, beberapa pendekatan desain dipertimbangkan tiga metode antara lain </w:t>
       </w:r>
       <w:r>
         <w:rPr>
@@ -7757,21 +7667,7 @@
         <w:rPr>
           <w:lang w:val="en-US"/>
         </w:rPr>
-        <w:t xml:space="preserve"> dipilih karena paling sesuai dengan konteks penelitian. Sistem rumah kaca ini </w:t>
-      </w:r>
-      <w:proofErr w:type="gramStart"/>
-      <w:r>
-        <w:rPr>
-          <w:lang w:val="en-US"/>
-        </w:rPr>
-        <w:t>akan</w:t>
-      </w:r>
-      <w:proofErr w:type="gramEnd"/>
-      <w:r>
-        <w:rPr>
-          <w:lang w:val="en-US"/>
-        </w:rPr>
-        <w:t xml:space="preserve"> dipakai oleh petani dengan berbagai latar belakang, sehingga keterlibatan mereka sangat penting. Dengan </w:t>
+        <w:t xml:space="preserve"> dipilih karena paling sesuai dengan konteks penelitian. Sistem rumah kaca ini akan dipakai oleh petani dengan berbagai latar belakang, sehingga keterlibatan mereka sangat penting. Dengan </w:t>
       </w:r>
       <w:r>
         <w:rPr>
@@ -7874,7 +7770,7 @@
           <w:lang w:val="en-US"/>
         </w:rPr>
       </w:pPr>
-      <w:bookmarkStart w:id="21" w:name="_Toc221117425"/>
+      <w:bookmarkStart w:id="22" w:name="_Toc221117425"/>
       <w:r>
         <w:rPr>
           <w:lang w:val="en-US"/>
@@ -7882,7 +7778,7 @@
         <w:lastRenderedPageBreak/>
         <w:t>2.3 Teknologi dan Tools Pendukung Pembuatan Solusi</w:t>
       </w:r>
-      <w:bookmarkEnd w:id="21"/>
+      <w:bookmarkEnd w:id="22"/>
     </w:p>
     <w:p>
       <w:pPr>
@@ -8583,21 +8479,7 @@
         <w:rPr>
           <w:lang w:val="en-US"/>
         </w:rPr>
-        <w:t xml:space="preserve">. Ukurannya sangat kecil sekitar 3 </w:t>
-      </w:r>
-      <w:proofErr w:type="gramStart"/>
-      <w:r>
-        <w:rPr>
-          <w:lang w:val="en-US"/>
-        </w:rPr>
-        <w:t>KB ,</w:t>
-      </w:r>
-      <w:proofErr w:type="gramEnd"/>
-      <w:r>
-        <w:rPr>
-          <w:lang w:val="en-US"/>
-        </w:rPr>
-        <w:t xml:space="preserve"> tetapi </w:t>
+        <w:t xml:space="preserve">. Ukurannya sangat kecil sekitar 3 KB , tetapi </w:t>
       </w:r>
       <w:r>
         <w:rPr>
@@ -8766,21 +8648,7 @@
         <w:rPr>
           <w:lang w:val="en-US"/>
         </w:rPr>
-        <w:t xml:space="preserve">, </w:t>
-      </w:r>
-      <w:proofErr w:type="gramStart"/>
-      <w:r>
-        <w:rPr>
-          <w:lang w:val="en-US"/>
-        </w:rPr>
-        <w:t>dan</w:t>
-      </w:r>
-      <w:proofErr w:type="gramEnd"/>
-      <w:r>
-        <w:rPr>
-          <w:lang w:val="en-US"/>
-        </w:rPr>
-        <w:t xml:space="preserve"> </w:t>
+        <w:t xml:space="preserve">, dan </w:t>
       </w:r>
       <w:r>
         <w:rPr>
@@ -8896,21 +8764,7 @@
         <w:rPr>
           <w:lang w:val="en-US"/>
         </w:rPr>
-        <w:t xml:space="preserve"> yang sangat minimalis. Kelebihannya ukuran file sangat kecil, sehingga cepat dimuat, serta tidak memerlukan build process atau konfigurasi rumit. </w:t>
-      </w:r>
-      <w:proofErr w:type="gramStart"/>
-      <w:r>
-        <w:rPr>
-          <w:lang w:val="en-US"/>
-        </w:rPr>
-        <w:t>kekurangannya</w:t>
-      </w:r>
-      <w:proofErr w:type="gramEnd"/>
-      <w:r>
-        <w:rPr>
-          <w:lang w:val="en-US"/>
-        </w:rPr>
-        <w:t xml:space="preserve">, opsi kustomisasi tidak sebanyak </w:t>
+        <w:t xml:space="preserve"> yang sangat minimalis. Kelebihannya ukuran file sangat kecil, sehingga cepat dimuat, serta tidak memerlukan build process atau konfigurasi rumit. kekurangannya, opsi kustomisasi tidak sebanyak </w:t>
       </w:r>
       <w:r>
         <w:rPr>
@@ -9209,21 +9063,7 @@
         <w:rPr>
           <w:lang w:val="en-US"/>
         </w:rPr>
-        <w:t xml:space="preserve"> yang kompleks. Kelemahan utama, terutama pada versi gratisnya adalah batas pengetahuan. Model ini tidak memiliki pengetahuan, data, </w:t>
-      </w:r>
-      <w:proofErr w:type="gramStart"/>
-      <w:r>
-        <w:rPr>
-          <w:lang w:val="en-US"/>
-        </w:rPr>
-        <w:t>atau</w:t>
-      </w:r>
-      <w:proofErr w:type="gramEnd"/>
-      <w:r>
-        <w:rPr>
-          <w:lang w:val="en-US"/>
-        </w:rPr>
-        <w:t xml:space="preserve"> publikasi yang terjadi setelah tanggal pelatihannya. Untuk penelitian yang membutuhkan data terkini, ini merupakan hambatan signifikan. </w:t>
+        <w:t xml:space="preserve"> yang kompleks. Kelemahan utama, terutama pada versi gratisnya adalah batas pengetahuan. Model ini tidak memiliki pengetahuan, data, atau publikasi yang terjadi setelah tanggal pelatihannya. Untuk penelitian yang membutuhkan data terkini, ini merupakan hambatan signifikan. </w:t>
       </w:r>
     </w:p>
     <w:p>
@@ -9486,21 +9326,7 @@
         <w:rPr>
           <w:lang w:val="en-US"/>
         </w:rPr>
-        <w:t xml:space="preserve">, reasoning tingkat lanjut, serta window konteks yang lebih besar, </w:t>
-      </w:r>
-      <w:proofErr w:type="gramStart"/>
-      <w:r>
-        <w:rPr>
-          <w:lang w:val="en-US"/>
-        </w:rPr>
-        <w:t>sehingga</w:t>
-      </w:r>
-      <w:proofErr w:type="gramEnd"/>
-      <w:r>
-        <w:rPr>
-          <w:lang w:val="en-US"/>
-        </w:rPr>
-        <w:t xml:space="preserve"> memungkinkan prompt yang lebih kompleks dan kaya konteks. Keunggulan lain dari </w:t>
+        <w:t xml:space="preserve">, reasoning tingkat lanjut, serta window konteks yang lebih besar, sehingga memungkinkan prompt yang lebih kompleks dan kaya konteks. Keunggulan lain dari </w:t>
       </w:r>
       <w:r>
         <w:rPr>
@@ -9915,21 +9741,7 @@
         <w:rPr>
           <w:lang w:val="en-US"/>
         </w:rPr>
-        <w:t xml:space="preserve"> </w:t>
-      </w:r>
-      <w:proofErr w:type="gramStart"/>
-      <w:r>
-        <w:rPr>
-          <w:lang w:val="en-US"/>
-        </w:rPr>
-        <w:t>akan</w:t>
-      </w:r>
-      <w:proofErr w:type="gramEnd"/>
-      <w:r>
-        <w:rPr>
-          <w:lang w:val="en-US"/>
-        </w:rPr>
-        <w:t xml:space="preserve"> disertai alasan berbasis data sensor. Misalnya, jika </w:t>
+        <w:t xml:space="preserve"> akan disertai alasan berbasis data sensor. Misalnya, jika </w:t>
       </w:r>
       <w:r>
         <w:rPr>
@@ -10229,14 +10041,14 @@
           <w:lang w:val="en-US"/>
         </w:rPr>
       </w:pPr>
-      <w:bookmarkStart w:id="22" w:name="_Toc221117426"/>
+      <w:bookmarkStart w:id="23" w:name="_Toc221117426"/>
       <w:r>
         <w:rPr>
           <w:lang w:val="en-US"/>
         </w:rPr>
         <w:t>2.4 Metode Evaluasi dan Validasi Solusi</w:t>
       </w:r>
-      <w:bookmarkEnd w:id="22"/>
+      <w:bookmarkEnd w:id="23"/>
     </w:p>
     <w:p>
       <w:pPr>
@@ -10698,27 +10510,13 @@
         <w:rPr>
           <w:lang w:val="en-US"/>
         </w:rPr>
-        <w:t xml:space="preserve"> </w:t>
-      </w:r>
-      <w:proofErr w:type="gramStart"/>
-      <w:r>
-        <w:rPr>
-          <w:lang w:val="en-US"/>
-        </w:rPr>
-        <w:t>oleh  p</w:t>
-      </w:r>
-      <w:r>
-        <w:rPr>
-          <w:lang w:val="en-US"/>
-        </w:rPr>
-        <w:t>etani</w:t>
-      </w:r>
-      <w:proofErr w:type="gramEnd"/>
-      <w:r>
-        <w:rPr>
-          <w:lang w:val="en-US"/>
-        </w:rPr>
-        <w:t xml:space="preserve"> yang mencoba sistem, lalu memberikan umpan balik terkait apakah rekomendasi mudah dipahami, apakah dapat membantu mengambil keputusan , dan </w:t>
+        <w:t xml:space="preserve"> oleh  p</w:t>
+      </w:r>
+      <w:r>
+        <w:rPr>
+          <w:lang w:val="en-US"/>
+        </w:rPr>
+        <w:t xml:space="preserve">etani yang mencoba sistem, lalu memberikan umpan balik terkait apakah rekomendasi mudah dipahami, apakah dapat membantu mengambil keputusan , dan </w:t>
       </w:r>
       <w:r>
         <w:rPr>
@@ -10730,21 +10528,7 @@
         <w:rPr>
           <w:lang w:val="en-US"/>
         </w:rPr>
-        <w:t xml:space="preserve">pakah rekomendasi relevan dengan kondisi nyata di lapangan. Data sensor yang </w:t>
-      </w:r>
-      <w:proofErr w:type="gramStart"/>
-      <w:r>
-        <w:rPr>
-          <w:lang w:val="en-US"/>
-        </w:rPr>
-        <w:t>sama</w:t>
-      </w:r>
-      <w:proofErr w:type="gramEnd"/>
-      <w:r>
-        <w:rPr>
-          <w:lang w:val="en-US"/>
-        </w:rPr>
-        <w:t xml:space="preserve"> dikirim beberapa kali, lalu diperiksa apakah </w:t>
+        <w:t xml:space="preserve">pakah rekomendasi relevan dengan kondisi nyata di lapangan. Data sensor yang sama dikirim beberapa kali, lalu diperiksa apakah </w:t>
       </w:r>
       <w:r>
         <w:rPr>
@@ -10797,7 +10581,7 @@
           <w:lang w:val="en-US"/>
         </w:rPr>
       </w:pPr>
-      <w:bookmarkStart w:id="23" w:name="_Toc221117427"/>
+      <w:bookmarkStart w:id="24" w:name="_Toc221117427"/>
       <w:r>
         <w:rPr>
           <w:lang w:val="en-US"/>
@@ -10811,7 +10595,7 @@
         </w:rPr>
         <w:t>State of The Art</w:t>
       </w:r>
-      <w:bookmarkEnd w:id="23"/>
+      <w:bookmarkEnd w:id="24"/>
     </w:p>
     <w:p>
       <w:pPr>
@@ -10848,21 +10632,7 @@
         <w:rPr>
           <w:lang w:val="en-US"/>
         </w:rPr>
-        <w:t xml:space="preserve">Beberapa jurnal penelitian yang terkait dengan penelitian yang </w:t>
-      </w:r>
-      <w:proofErr w:type="gramStart"/>
-      <w:r>
-        <w:rPr>
-          <w:lang w:val="en-US"/>
-        </w:rPr>
-        <w:t>akan</w:t>
-      </w:r>
-      <w:proofErr w:type="gramEnd"/>
-      <w:r>
-        <w:rPr>
-          <w:lang w:val="en-US"/>
-        </w:rPr>
-        <w:t xml:space="preserve"> dilaksanakan penulis dapat dilihat pada tabel berikut.</w:t>
+        <w:t>Beberapa jurnal penelitian yang terkait dengan penelitian yang akan dilaksanakan penulis dapat dilihat pada tabel berikut.</w:t>
       </w:r>
     </w:p>
     <w:p>
@@ -10872,7 +10642,7 @@
           <w:lang w:val="en-US"/>
         </w:rPr>
       </w:pPr>
-      <w:bookmarkStart w:id="24" w:name="_Toc221117439"/>
+      <w:bookmarkStart w:id="25" w:name="_Toc221665233"/>
       <w:r>
         <w:t xml:space="preserve">Tabel </w:t>
       </w:r>
@@ -10922,7 +10692,7 @@
         </w:rPr>
         <w:t>State of The Art</w:t>
       </w:r>
-      <w:bookmarkEnd w:id="24"/>
+      <w:bookmarkEnd w:id="25"/>
     </w:p>
     <w:tbl>
       <w:tblPr>
@@ -11959,16 +11729,34 @@
         <w:rPr>
           <w:lang w:val="en-US"/>
         </w:rPr>
-        <w:t xml:space="preserve"> untuk interaksi berbasis </w:t>
-      </w:r>
-      <w:proofErr w:type="gramStart"/>
-      <w:r>
-        <w:rPr>
-          <w:lang w:val="en-US"/>
-        </w:rPr>
-        <w:t>tanya</w:t>
-      </w:r>
-      <w:proofErr w:type="gramEnd"/>
+        <w:t xml:space="preserve"> untuk interaksi berbasis tanya </w:t>
+      </w:r>
+      <w:r>
+        <w:rPr>
+          <w:lang w:val="en-US"/>
+        </w:rPr>
+        <w:t xml:space="preserve">jawab.  Dengan kombinasi tersebut, penelitian ini menghadirkan solusi praktis, adaptif, dan ramah pengguna untuk mendukung pengelolaan rumah kaca skala kecil. Pendekatan ini mengintegrasikan beberapa instrumen berupa </w:t>
+      </w:r>
+      <w:r>
+        <w:rPr>
+          <w:i/>
+          <w:lang w:val="en-US"/>
+        </w:rPr>
+        <w:t>IoT</w:t>
+      </w:r>
+      <w:r>
+        <w:rPr>
+          <w:lang w:val="en-US"/>
+        </w:rPr>
+        <w:t xml:space="preserve">, </w:t>
+      </w:r>
+      <w:r>
+        <w:rPr>
+          <w:i/>
+          <w:lang w:val="en-US"/>
+        </w:rPr>
+        <w:t>lightweight</w:t>
+      </w:r>
       <w:r>
         <w:rPr>
           <w:lang w:val="en-US"/>
@@ -11977,38 +11765,6 @@
       </w:r>
       <w:r>
         <w:rPr>
-          <w:lang w:val="en-US"/>
-        </w:rPr>
-        <w:t xml:space="preserve">jawab.  Dengan kombinasi tersebut, penelitian ini menghadirkan solusi praktis, adaptif, dan ramah pengguna untuk mendukung pengelolaan rumah kaca skala kecil. Pendekatan ini mengintegrasikan beberapa instrumen berupa </w:t>
-      </w:r>
-      <w:r>
-        <w:rPr>
-          <w:i/>
-          <w:lang w:val="en-US"/>
-        </w:rPr>
-        <w:t>IoT</w:t>
-      </w:r>
-      <w:r>
-        <w:rPr>
-          <w:lang w:val="en-US"/>
-        </w:rPr>
-        <w:t xml:space="preserve">, </w:t>
-      </w:r>
-      <w:r>
-        <w:rPr>
-          <w:i/>
-          <w:lang w:val="en-US"/>
-        </w:rPr>
-        <w:t>lightweight</w:t>
-      </w:r>
-      <w:r>
-        <w:rPr>
-          <w:lang w:val="en-US"/>
-        </w:rPr>
-        <w:t xml:space="preserve"> </w:t>
-      </w:r>
-      <w:r>
-        <w:rPr>
           <w:i/>
           <w:lang w:val="en-US"/>
         </w:rPr>
@@ -12061,12 +11817,12 @@
       <w:pPr>
         <w:pStyle w:val="Heading1"/>
       </w:pPr>
-      <w:bookmarkStart w:id="25" w:name="_Toc221117428"/>
+      <w:bookmarkStart w:id="26" w:name="_Toc221117428"/>
       <w:r>
         <w:lastRenderedPageBreak/>
         <w:t>BAB 3 METODE PENELITIAN</w:t>
       </w:r>
-      <w:bookmarkEnd w:id="25"/>
+      <w:bookmarkEnd w:id="26"/>
     </w:p>
     <w:p>
       <w:pPr>
@@ -12075,7 +11831,7 @@
           <w:lang w:val="en-US"/>
         </w:rPr>
       </w:pPr>
-      <w:bookmarkStart w:id="26" w:name="_Toc221117429"/>
+      <w:bookmarkStart w:id="27" w:name="_Toc221117429"/>
       <w:r>
         <w:t xml:space="preserve">3.1 </w:t>
       </w:r>
@@ -12085,7 +11841,7 @@
         </w:rPr>
         <w:t>Jadwal, Lokasi, dan Alur Penelitian</w:t>
       </w:r>
-      <w:bookmarkEnd w:id="26"/>
+      <w:bookmarkEnd w:id="27"/>
     </w:p>
     <w:p>
       <w:pPr>
@@ -12112,7 +11868,6 @@
         </w:rPr>
         <w:t xml:space="preserve"> bulan dengan tahapan yang sistematis sesuai metode </w:t>
       </w:r>
-      <w:proofErr w:type="gramStart"/>
       <w:r>
         <w:rPr>
           <w:i/>
@@ -12120,7 +11875,6 @@
         </w:rPr>
         <w:t>Agile</w:t>
       </w:r>
-      <w:proofErr w:type="gramEnd"/>
       <w:r>
         <w:rPr>
           <w:lang w:val="en-US"/>
@@ -12163,7 +11917,7 @@
       <w:pPr>
         <w:pStyle w:val="Caption"/>
       </w:pPr>
-      <w:bookmarkStart w:id="27" w:name="_Toc221117440"/>
+      <w:bookmarkStart w:id="28" w:name="_Toc221665234"/>
       <w:r>
         <w:t xml:space="preserve">Tabel </w:t>
       </w:r>
@@ -12183,7 +11937,7 @@
         <w:rPr>
           <w:noProof/>
         </w:rPr>
-        <w:instrText xml:space="preserve"> SEQ Tabel \* ARABIC </w:instrText>
+        <w:instrText xml:space="preserve"> SEQ Tabel \* ARABIC \r 1 </w:instrText>
       </w:r>
       <w:r>
         <w:rPr>
@@ -12206,7 +11960,7 @@
       <w:r>
         <w:t>. Jadwal Pelaksanaan Penelitian</w:t>
       </w:r>
-      <w:bookmarkEnd w:id="27"/>
+      <w:bookmarkEnd w:id="28"/>
     </w:p>
     <w:tbl>
       <w:tblPr>
@@ -13842,23 +13596,8 @@
         <w:rPr>
           <w:lang w:val="en-US"/>
         </w:rPr>
-        <w:t xml:space="preserve">Lokasi penelitian ditetapkan di Pancasari, Kabupaten Buleleng, Bali, yang merupakan salah satu daerah sentra hortikultura. Pemilihan lokasi ini didasarkan pada kondisi geografis dan iklim Pancasari yang mendukung kegiatan pertanian rumah kaca, namun tetap menghadapi tantangan terkait cuaca, serangan </w:t>
-      </w:r>
-      <w:proofErr w:type="gramStart"/>
-      <w:r>
-        <w:rPr>
-          <w:lang w:val="en-US"/>
-        </w:rPr>
-        <w:t>hama</w:t>
-      </w:r>
-      <w:proofErr w:type="gramEnd"/>
-      <w:r>
-        <w:rPr>
-          <w:lang w:val="en-US"/>
-        </w:rPr>
-        <w:t xml:space="preserve">, serta keterbatasan sumber daya. Alur penelitian disusun mengikuti kerangka </w:t>
-      </w:r>
-      <w:proofErr w:type="gramStart"/>
+        <w:t xml:space="preserve">Lokasi penelitian ditetapkan di Pancasari, Kabupaten Buleleng, Bali, yang merupakan salah satu daerah sentra hortikultura. Pemilihan lokasi ini didasarkan pada kondisi geografis dan iklim Pancasari yang mendukung kegiatan pertanian rumah kaca, namun tetap menghadapi tantangan terkait cuaca, serangan hama, serta keterbatasan sumber daya. Alur penelitian disusun mengikuti kerangka </w:t>
+      </w:r>
       <w:r>
         <w:rPr>
           <w:i/>
@@ -13866,7 +13605,6 @@
         </w:rPr>
         <w:t>Agile</w:t>
       </w:r>
-      <w:proofErr w:type="gramEnd"/>
       <w:r>
         <w:rPr>
           <w:lang w:val="en-US"/>
@@ -13976,7 +13714,7 @@
           <w:lang w:val="en-US"/>
         </w:rPr>
       </w:pPr>
-      <w:bookmarkStart w:id="28" w:name="_Toc221109400"/>
+      <w:bookmarkStart w:id="29" w:name="_Toc221665222"/>
       <w:r>
         <w:t xml:space="preserve">Gambar </w:t>
       </w:r>
@@ -13986,43 +13724,21 @@
         </w:rPr>
         <w:t>3.</w:t>
       </w:r>
-      <w:r>
-        <w:rPr>
-          <w:noProof/>
-        </w:rPr>
-        <w:fldChar w:fldCharType="begin"/>
-      </w:r>
-      <w:r>
-        <w:rPr>
-          <w:noProof/>
-        </w:rPr>
-        <w:instrText xml:space="preserve"> SEQ Gambar \* ARABIC </w:instrText>
-      </w:r>
-      <w:r>
-        <w:rPr>
-          <w:noProof/>
-        </w:rPr>
-        <w:fldChar w:fldCharType="separate"/>
-      </w:r>
-      <w:r>
-        <w:rPr>
-          <w:noProof/>
-        </w:rPr>
-        <w:t>1</w:t>
-      </w:r>
-      <w:r>
-        <w:rPr>
-          <w:noProof/>
-        </w:rPr>
-        <w:fldChar w:fldCharType="end"/>
-      </w:r>
+      <w:fldSimple w:instr=" SEQ Gambar \* ARABIC ">
+        <w:r>
+          <w:rPr>
+            <w:noProof/>
+          </w:rPr>
+          <w:t>1</w:t>
+        </w:r>
+      </w:fldSimple>
       <w:r>
         <w:rPr>
           <w:lang w:val="en-US"/>
         </w:rPr>
         <w:t>. Alur Penelitian</w:t>
       </w:r>
-      <w:bookmarkEnd w:id="28"/>
+      <w:bookmarkEnd w:id="29"/>
     </w:p>
     <w:p>
       <w:pPr>
@@ -14037,7 +13753,19 @@
         <w:rPr>
           <w:lang w:val="en-US"/>
         </w:rPr>
-        <w:t xml:space="preserve">Mengacu pada gambar 3.1, tahapan diawali dengan perencanaan yang terdiri </w:t>
+        <w:t>Mengacu pada gambar 3.</w:t>
+      </w:r>
+      <w:r>
+        <w:rPr>
+          <w:lang w:val="en-US"/>
+        </w:rPr>
+        <w:t>1</w:t>
+      </w:r>
+      <w:r>
+        <w:rPr>
+          <w:lang w:val="en-US"/>
+        </w:rPr>
+        <w:t xml:space="preserve">, tahapan diawali dengan perencanaan yang terdiri </w:t>
       </w:r>
       <w:r>
         <w:rPr>
@@ -14150,7 +13878,7 @@
           <w:lang w:val="en-US"/>
         </w:rPr>
       </w:pPr>
-      <w:bookmarkStart w:id="29" w:name="_Toc221117430"/>
+      <w:bookmarkStart w:id="30" w:name="_Toc221117430"/>
       <w:r>
         <w:t xml:space="preserve">3.2 Gambaran Besar </w:t>
       </w:r>
@@ -14160,7 +13888,7 @@
         </w:rPr>
         <w:t>Solusi</w:t>
       </w:r>
-      <w:bookmarkEnd w:id="29"/>
+      <w:bookmarkEnd w:id="30"/>
     </w:p>
     <w:p>
       <w:pPr>
@@ -14282,7 +14010,7 @@
           <w:lang w:val="en-US"/>
         </w:rPr>
       </w:pPr>
-      <w:bookmarkStart w:id="30" w:name="_Toc221109401"/>
+      <w:bookmarkStart w:id="31" w:name="_Toc221665223"/>
       <w:r>
         <w:t xml:space="preserve">Gambar </w:t>
       </w:r>
@@ -14316,7 +14044,7 @@
         </w:rPr>
         <w:t>mode offline</w:t>
       </w:r>
-      <w:bookmarkEnd w:id="30"/>
+      <w:bookmarkEnd w:id="31"/>
     </w:p>
     <w:p>
       <w:pPr>
@@ -14349,6 +14077,9 @@
         <w:t>3.</w:t>
       </w:r>
       <w:r>
+        <w:rPr>
+          <w:lang w:val="en-US"/>
+        </w:rPr>
         <w:t>2</w:t>
       </w:r>
       <w:r>
@@ -14434,7 +14165,7 @@
           <w:lang w:val="en-US"/>
         </w:rPr>
       </w:pPr>
-      <w:bookmarkStart w:id="31" w:name="_Toc221109402"/>
+      <w:bookmarkStart w:id="32" w:name="_Toc221665224"/>
       <w:r>
         <w:rPr>
           <w:noProof/>
@@ -14509,6 +14240,12 @@
       </w:r>
       <w:r>
         <w:rPr>
+          <w:lang w:val="en-US"/>
+        </w:rPr>
+        <w:t>3.</w:t>
+      </w:r>
+      <w:r>
+        <w:rPr>
           <w:noProof/>
         </w:rPr>
         <w:fldChar w:fldCharType="begin"/>
@@ -14538,20 +14275,99 @@
         <w:fldChar w:fldCharType="end"/>
       </w:r>
       <w:r>
-        <w:rPr>
-          <w:noProof/>
+        <w:t xml:space="preserve">. </w:t>
+      </w:r>
+      <w:r>
+        <w:rPr>
+          <w:lang w:val="en-US"/>
+        </w:rPr>
+        <w:t xml:space="preserve">Gambaran besar solusi </w:t>
+      </w:r>
+      <w:r>
+        <w:rPr>
+          <w:i/>
+          <w:lang w:val="en-US"/>
+        </w:rPr>
+        <w:t>mode online</w:t>
+      </w:r>
+      <w:bookmarkEnd w:id="32"/>
+    </w:p>
+    <w:p>
+      <w:pPr>
+        <w:jc w:val="both"/>
+        <w:rPr>
+          <w:lang w:val="en-US"/>
+        </w:rPr>
+      </w:pPr>
+      <w:r>
+        <w:rPr>
+          <w:lang w:val="en-US"/>
+        </w:rPr>
+        <w:t xml:space="preserve">Skenario operasional kedua adalah </w:t>
+      </w:r>
+      <w:r>
+        <w:rPr>
+          <w:i/>
+          <w:lang w:val="en-US"/>
+        </w:rPr>
+        <w:t>mode online</w:t>
+      </w:r>
+      <w:r>
+        <w:rPr>
+          <w:lang w:val="en-US"/>
+        </w:rPr>
+        <w:t xml:space="preserve"> yang dapat dilihat pada gambar 3</w:t>
+      </w:r>
+      <w:r>
+        <w:rPr>
           <w:lang w:val="en-US"/>
         </w:rPr>
         <w:t>.3</w:t>
       </w:r>
       <w:r>
-        <w:t xml:space="preserve">. </w:t>
-      </w:r>
-      <w:r>
-        <w:rPr>
-          <w:lang w:val="en-US"/>
-        </w:rPr>
-        <w:t xml:space="preserve">Gambaran besar solusi </w:t>
+        <w:rPr>
+          <w:lang w:val="en-US"/>
+        </w:rPr>
+        <w:t xml:space="preserve">, yang aktif ketika koneksi internet tersedia. Dalam </w:t>
+      </w:r>
+      <w:r>
+        <w:rPr>
+          <w:i/>
+          <w:lang w:val="en-US"/>
+        </w:rPr>
+        <w:t>mode</w:t>
+      </w:r>
+      <w:r>
+        <w:rPr>
+          <w:lang w:val="en-US"/>
+        </w:rPr>
+        <w:t xml:space="preserve"> ini, </w:t>
+      </w:r>
+      <w:r>
+        <w:rPr>
+          <w:i/>
+          <w:lang w:val="en-US"/>
+        </w:rPr>
+        <w:t>ESP32</w:t>
+      </w:r>
+      <w:r>
+        <w:rPr>
+          <w:lang w:val="en-US"/>
+        </w:rPr>
+        <w:t xml:space="preserve"> secara berkala mengirimkan data sensor ke </w:t>
+      </w:r>
+      <w:r>
+        <w:rPr>
+          <w:i/>
+          <w:lang w:val="en-US"/>
+        </w:rPr>
+        <w:t>server cloud</w:t>
+      </w:r>
+      <w:r>
+        <w:rPr>
+          <w:lang w:val="en-US"/>
+        </w:rPr>
+        <w:t xml:space="preserve">. Tidak hanya memberikan kemudahan akses pemantauan jarak jauh bagi pengguna, tetapi juga memungkinkan penyimpanan data historis untuk analisis lebih lanjut. Yang terpenting, </w:t>
       </w:r>
       <w:r>
         <w:rPr>
@@ -14560,7 +14376,77 @@
         </w:rPr>
         <w:t>mode online</w:t>
       </w:r>
-      <w:bookmarkEnd w:id="31"/>
+      <w:r>
+        <w:rPr>
+          <w:lang w:val="en-US"/>
+        </w:rPr>
+        <w:t xml:space="preserve"> merupakan syarat untuk dapat menggunakan </w:t>
+      </w:r>
+      <w:r>
+        <w:rPr>
+          <w:i/>
+          <w:lang w:val="en-US"/>
+        </w:rPr>
+        <w:t xml:space="preserve">Decision Support System </w:t>
+      </w:r>
+      <w:r>
+        <w:rPr>
+          <w:lang w:val="en-US"/>
+        </w:rPr>
+        <w:t xml:space="preserve">(DSS), di mana </w:t>
+      </w:r>
+      <w:r>
+        <w:rPr>
+          <w:i/>
+          <w:lang w:val="en-US"/>
+        </w:rPr>
+        <w:t>platform</w:t>
+      </w:r>
+      <w:r>
+        <w:rPr>
+          <w:lang w:val="en-US"/>
+        </w:rPr>
+        <w:t xml:space="preserve"> </w:t>
+      </w:r>
+      <w:r>
+        <w:rPr>
+          <w:i/>
+          <w:lang w:val="en-US"/>
+        </w:rPr>
+        <w:t>cloud</w:t>
+      </w:r>
+      <w:r>
+        <w:rPr>
+          <w:lang w:val="en-US"/>
+        </w:rPr>
+        <w:t xml:space="preserve"> bertindak sebagai perantara untuk mengumpulkan data, menyusun </w:t>
+      </w:r>
+      <w:r>
+        <w:rPr>
+          <w:i/>
+          <w:lang w:val="en-US"/>
+        </w:rPr>
+        <w:t>prompt</w:t>
+      </w:r>
+      <w:r>
+        <w:rPr>
+          <w:lang w:val="en-US"/>
+        </w:rPr>
+        <w:t xml:space="preserve">, dan berkomunikasi dengan API eksternal </w:t>
+      </w:r>
+      <w:r>
+        <w:rPr>
+          <w:i/>
+          <w:lang w:val="en-US"/>
+        </w:rPr>
+        <w:t>Gemini AI</w:t>
+      </w:r>
+      <w:r>
+        <w:rPr>
+          <w:lang w:val="en-US"/>
+        </w:rPr>
+        <w:t xml:space="preserve"> untuk menghasilkan rekomendasi atas data yang diberikan. </w:t>
+      </w:r>
     </w:p>
     <w:p>
       <w:pPr>
@@ -14573,162 +14459,6 @@
         <w:rPr>
           <w:lang w:val="en-US"/>
         </w:rPr>
-        <w:t xml:space="preserve">Skenario operasional kedua adalah </w:t>
-      </w:r>
-      <w:r>
-        <w:rPr>
-          <w:i/>
-          <w:lang w:val="en-US"/>
-        </w:rPr>
-        <w:t>mode online</w:t>
-      </w:r>
-      <w:r>
-        <w:rPr>
-          <w:lang w:val="en-US"/>
-        </w:rPr>
-        <w:t xml:space="preserve"> yang dapat dilihat pada gambar 3</w:t>
-      </w:r>
-      <w:r>
-        <w:rPr>
-          <w:lang w:val="en-US"/>
-        </w:rPr>
-        <w:t>.3</w:t>
-      </w:r>
-      <w:r>
-        <w:rPr>
-          <w:lang w:val="en-US"/>
-        </w:rPr>
-        <w:t xml:space="preserve">, yang aktif ketika koneksi internet tersedia. Dalam </w:t>
-      </w:r>
-      <w:r>
-        <w:rPr>
-          <w:i/>
-          <w:lang w:val="en-US"/>
-        </w:rPr>
-        <w:t>mode</w:t>
-      </w:r>
-      <w:r>
-        <w:rPr>
-          <w:lang w:val="en-US"/>
-        </w:rPr>
-        <w:t xml:space="preserve"> ini, </w:t>
-      </w:r>
-      <w:r>
-        <w:rPr>
-          <w:i/>
-          <w:lang w:val="en-US"/>
-        </w:rPr>
-        <w:t>ESP32</w:t>
-      </w:r>
-      <w:r>
-        <w:rPr>
-          <w:lang w:val="en-US"/>
-        </w:rPr>
-        <w:t xml:space="preserve"> secara berkala mengirimkan data sensor ke </w:t>
-      </w:r>
-      <w:r>
-        <w:rPr>
-          <w:i/>
-          <w:lang w:val="en-US"/>
-        </w:rPr>
-        <w:t>server cloud</w:t>
-      </w:r>
-      <w:r>
-        <w:rPr>
-          <w:lang w:val="en-US"/>
-        </w:rPr>
-        <w:t xml:space="preserve">. Tidak hanya memberikan kemudahan akses pemantauan jarak jauh bagi pengguna, tetapi juga memungkinkan penyimpanan data historis untuk analisis lebih lanjut. Yang terpenting, </w:t>
-      </w:r>
-      <w:r>
-        <w:rPr>
-          <w:i/>
-          <w:lang w:val="en-US"/>
-        </w:rPr>
-        <w:t>mode online</w:t>
-      </w:r>
-      <w:r>
-        <w:rPr>
-          <w:lang w:val="en-US"/>
-        </w:rPr>
-        <w:t xml:space="preserve"> merupakan syarat untuk dapat menggunakan </w:t>
-      </w:r>
-      <w:r>
-        <w:rPr>
-          <w:i/>
-          <w:lang w:val="en-US"/>
-        </w:rPr>
-        <w:t xml:space="preserve">Decision Support System </w:t>
-      </w:r>
-      <w:r>
-        <w:rPr>
-          <w:lang w:val="en-US"/>
-        </w:rPr>
-        <w:t xml:space="preserve">(DSS), di mana </w:t>
-      </w:r>
-      <w:r>
-        <w:rPr>
-          <w:i/>
-          <w:lang w:val="en-US"/>
-        </w:rPr>
-        <w:t>platform</w:t>
-      </w:r>
-      <w:r>
-        <w:rPr>
-          <w:lang w:val="en-US"/>
-        </w:rPr>
-        <w:t xml:space="preserve"> </w:t>
-      </w:r>
-      <w:r>
-        <w:rPr>
-          <w:i/>
-          <w:lang w:val="en-US"/>
-        </w:rPr>
-        <w:t>cloud</w:t>
-      </w:r>
-      <w:r>
-        <w:rPr>
-          <w:lang w:val="en-US"/>
-        </w:rPr>
-        <w:t xml:space="preserve"> bertindak sebagai perantara untuk mengumpulkan data, menyusun </w:t>
-      </w:r>
-      <w:r>
-        <w:rPr>
-          <w:i/>
-          <w:lang w:val="en-US"/>
-        </w:rPr>
-        <w:t>prompt</w:t>
-      </w:r>
-      <w:r>
-        <w:rPr>
-          <w:lang w:val="en-US"/>
-        </w:rPr>
-        <w:t xml:space="preserve">, dan berkomunikasi dengan API eksternal </w:t>
-      </w:r>
-      <w:r>
-        <w:rPr>
-          <w:i/>
-          <w:lang w:val="en-US"/>
-        </w:rPr>
-        <w:t>Gemini AI</w:t>
-      </w:r>
-      <w:r>
-        <w:rPr>
-          <w:lang w:val="en-US"/>
-        </w:rPr>
-        <w:t xml:space="preserve"> untuk menghasilkan rekomendasi atas data yang diberikan. </w:t>
-      </w:r>
-    </w:p>
-    <w:p>
-      <w:pPr>
-        <w:jc w:val="both"/>
-        <w:rPr>
-          <w:lang w:val="en-US"/>
-        </w:rPr>
-      </w:pPr>
-      <w:r>
-        <w:rPr>
-          <w:lang w:val="en-US"/>
-        </w:rPr>
         <w:t xml:space="preserve">Dalam mode </w:t>
       </w:r>
       <w:r>
@@ -14755,21 +14485,7 @@
         <w:rPr>
           <w:lang w:val="en-US"/>
         </w:rPr>
-        <w:t xml:space="preserve"> sensor </w:t>
-      </w:r>
-      <w:proofErr w:type="gramStart"/>
-      <w:r>
-        <w:rPr>
-          <w:lang w:val="en-US"/>
-        </w:rPr>
-        <w:t>akan</w:t>
-      </w:r>
-      <w:proofErr w:type="gramEnd"/>
-      <w:r>
-        <w:rPr>
-          <w:lang w:val="en-US"/>
-        </w:rPr>
-        <w:t xml:space="preserve"> mengukur parameter lingkungan rumah kaca. Data sensor inilah yang menjadi dasar bagi keseluruhan sistem untuk memberikan rekomendasi pengelolaan rumah kaca. </w:t>
+        <w:t xml:space="preserve"> sensor akan mengukur parameter lingkungan rumah kaca. Data sensor inilah yang menjadi dasar bagi keseluruhan sistem untuk memberikan rekomendasi pengelolaan rumah kaca. </w:t>
       </w:r>
       <w:r>
         <w:rPr>
@@ -14969,21 +14685,7 @@
         <w:rPr>
           <w:lang w:val="en-US"/>
         </w:rPr>
-        <w:t xml:space="preserve">ada penelitian ini </w:t>
-      </w:r>
-      <w:proofErr w:type="gramStart"/>
-      <w:r>
-        <w:rPr>
-          <w:lang w:val="en-US"/>
-        </w:rPr>
-        <w:t>akan</w:t>
-      </w:r>
-      <w:proofErr w:type="gramEnd"/>
-      <w:r>
-        <w:rPr>
-          <w:lang w:val="en-US"/>
-        </w:rPr>
-        <w:t xml:space="preserve"> difokuskan hanya untuk pembuatan antarmuka (</w:t>
+        <w:t>ada penelitian ini akan difokuskan hanya untuk pembuatan antarmuka (</w:t>
       </w:r>
       <w:r>
         <w:rPr>
@@ -15058,7 +14760,7 @@
           <w:lang w:val="en-US"/>
         </w:rPr>
       </w:pPr>
-      <w:bookmarkStart w:id="32" w:name="_Toc221117431"/>
+      <w:bookmarkStart w:id="33" w:name="_Toc221117431"/>
       <w:r>
         <w:t xml:space="preserve">3.3 </w:t>
       </w:r>
@@ -15068,7 +14770,7 @@
         </w:rPr>
         <w:t>Tata Cara Implementasi Solusi</w:t>
       </w:r>
-      <w:bookmarkEnd w:id="32"/>
+      <w:bookmarkEnd w:id="33"/>
     </w:p>
     <w:p>
       <w:pPr>
@@ -15081,21 +14783,7 @@
         <w:rPr>
           <w:lang w:val="en-US"/>
         </w:rPr>
-        <w:t xml:space="preserve">Tata </w:t>
-      </w:r>
-      <w:proofErr w:type="gramStart"/>
-      <w:r>
-        <w:rPr>
-          <w:lang w:val="en-US"/>
-        </w:rPr>
-        <w:t>cara</w:t>
-      </w:r>
-      <w:proofErr w:type="gramEnd"/>
-      <w:r>
-        <w:rPr>
-          <w:lang w:val="en-US"/>
-        </w:rPr>
-        <w:t xml:space="preserve"> implementasi solusi pada penelitian ini dirancang mengikuti kerangka metodologi </w:t>
+        <w:t xml:space="preserve">Tata cara implementasi solusi pada penelitian ini dirancang mengikuti kerangka metodologi </w:t>
       </w:r>
       <w:r>
         <w:rPr>
@@ -15171,14 +14859,14 @@
           <w:lang w:val="en-US"/>
         </w:rPr>
       </w:pPr>
-      <w:bookmarkStart w:id="33" w:name="_Toc221117432"/>
+      <w:bookmarkStart w:id="34" w:name="_Toc221117432"/>
       <w:r>
         <w:rPr>
           <w:lang w:val="en-US"/>
         </w:rPr>
         <w:t>3.3.1 Tahap Perencanaan</w:t>
       </w:r>
-      <w:bookmarkEnd w:id="33"/>
+      <w:bookmarkEnd w:id="34"/>
     </w:p>
     <w:p>
       <w:pPr>
@@ -15262,7 +14950,7 @@
         <w:ind w:firstLine="709"/>
         <w:jc w:val="both"/>
       </w:pPr>
-      <w:bookmarkStart w:id="34" w:name="_Toc221117433"/>
+      <w:bookmarkStart w:id="35" w:name="_Toc221117433"/>
       <w:r>
         <w:rPr>
           <w:rFonts w:cs="Arial"/>
@@ -15271,7 +14959,7 @@
         <w:lastRenderedPageBreak/>
         <w:t>3.3.2 Tahap Perancangan</w:t>
       </w:r>
-      <w:bookmarkEnd w:id="34"/>
+      <w:bookmarkEnd w:id="35"/>
     </w:p>
     <w:p>
       <w:pPr>
@@ -15453,7 +15141,7 @@
         <w:ind w:firstLine="720"/>
         <w:jc w:val="both"/>
       </w:pPr>
-      <w:bookmarkStart w:id="35" w:name="_Toc221117434"/>
+      <w:bookmarkStart w:id="36" w:name="_Toc221117434"/>
       <w:r>
         <w:rPr>
           <w:rFonts w:cs="Arial"/>
@@ -15461,7 +15149,7 @@
         </w:rPr>
         <w:t>3.3.3 Tahap Implementasi Sistem</w:t>
       </w:r>
-      <w:bookmarkEnd w:id="35"/>
+      <w:bookmarkEnd w:id="36"/>
     </w:p>
     <w:p>
       <w:pPr>
@@ -15635,7 +15323,6 @@
         </w:rPr>
         <w:t xml:space="preserve">, sesuai dengan prinsip iteratif </w:t>
       </w:r>
-      <w:proofErr w:type="gramStart"/>
       <w:r>
         <w:rPr>
           <w:rFonts w:ascii="Arial" w:hAnsi="Arial" w:cs="Arial"/>
@@ -15646,7 +15333,6 @@
         </w:rPr>
         <w:t>Agile</w:t>
       </w:r>
-      <w:proofErr w:type="gramEnd"/>
       <w:r>
         <w:rPr>
           <w:rFonts w:ascii="Arial" w:hAnsi="Arial" w:cs="Arial"/>
@@ -15663,7 +15349,7 @@
         <w:ind w:left="720"/>
         <w:jc w:val="both"/>
       </w:pPr>
-      <w:bookmarkStart w:id="36" w:name="_Toc221117435"/>
+      <w:bookmarkStart w:id="37" w:name="_Toc221117435"/>
       <w:r>
         <w:rPr>
           <w:rFonts w:cs="Arial"/>
@@ -15671,7 +15357,7 @@
         </w:rPr>
         <w:t>3.3.4 Tahap Pengujian dan Evaluasi</w:t>
       </w:r>
-      <w:bookmarkEnd w:id="36"/>
+      <w:bookmarkEnd w:id="37"/>
     </w:p>
     <w:p>
       <w:pPr>
@@ -15826,7 +15512,7 @@
           <w:lang w:val="en-US"/>
         </w:rPr>
       </w:pPr>
-      <w:bookmarkStart w:id="37" w:name="_Toc221117441"/>
+      <w:bookmarkStart w:id="38" w:name="_Toc221665235"/>
       <w:r>
         <w:lastRenderedPageBreak/>
         <w:t xml:space="preserve">Tabel </w:t>
@@ -15837,36 +15523,14 @@
         </w:rPr>
         <w:t>3.</w:t>
       </w:r>
-      <w:r>
-        <w:rPr>
-          <w:noProof/>
-        </w:rPr>
-        <w:fldChar w:fldCharType="begin"/>
-      </w:r>
-      <w:r>
-        <w:rPr>
-          <w:noProof/>
-        </w:rPr>
-        <w:instrText xml:space="preserve"> SEQ Tabel \* ARABIC </w:instrText>
-      </w:r>
-      <w:r>
-        <w:rPr>
-          <w:noProof/>
-        </w:rPr>
-        <w:fldChar w:fldCharType="separate"/>
-      </w:r>
-      <w:r>
-        <w:rPr>
-          <w:noProof/>
-        </w:rPr>
-        <w:t>2</w:t>
-      </w:r>
-      <w:r>
-        <w:rPr>
-          <w:noProof/>
-        </w:rPr>
-        <w:fldChar w:fldCharType="end"/>
-      </w:r>
+      <w:fldSimple w:instr=" SEQ Tabel \* ARABIC ">
+        <w:r>
+          <w:rPr>
+            <w:noProof/>
+          </w:rPr>
+          <w:t>2</w:t>
+        </w:r>
+      </w:fldSimple>
       <w:r>
         <w:t xml:space="preserve">. </w:t>
       </w:r>
@@ -15876,7 +15540,7 @@
         </w:rPr>
         <w:t>Contoh data</w:t>
       </w:r>
-      <w:bookmarkEnd w:id="37"/>
+      <w:bookmarkEnd w:id="38"/>
     </w:p>
     <w:tbl>
       <w:tblPr>
@@ -16773,7 +16437,15 @@
           <w:color w:val="000000"/>
           <w:lang w:val="en-US"/>
         </w:rPr>
-        <w:t>Pada tabel 3.2 diatas merupakan c</w:t>
+        <w:t>Pada tabel 3.2</w:t>
+      </w:r>
+      <w:r>
+        <w:rPr>
+          <w:rFonts w:cs="Arial"/>
+          <w:color w:val="000000"/>
+          <w:lang w:val="en-US"/>
+        </w:rPr>
+        <w:t xml:space="preserve"> diatas merupakan c</w:t>
       </w:r>
       <w:r>
         <w:rPr>
@@ -16797,25 +16469,7 @@
           <w:color w:val="000000"/>
           <w:lang w:val="en-US"/>
         </w:rPr>
-        <w:t xml:space="preserve"> </w:t>
-      </w:r>
-      <w:proofErr w:type="gramStart"/>
-      <w:r>
-        <w:rPr>
-          <w:rFonts w:cs="Arial"/>
-          <w:color w:val="000000"/>
-          <w:lang w:val="en-US"/>
-        </w:rPr>
-        <w:t>akan</w:t>
-      </w:r>
-      <w:proofErr w:type="gramEnd"/>
-      <w:r>
-        <w:rPr>
-          <w:rFonts w:cs="Arial"/>
-          <w:color w:val="000000"/>
-          <w:lang w:val="en-US"/>
-        </w:rPr>
-        <w:t xml:space="preserve"> diformat ke dalam bentuk teks, seperti: “</w:t>
+        <w:t xml:space="preserve"> akan diformat ke dalam bentuk teks, seperti: “</w:t>
       </w:r>
       <w:r>
         <w:rPr>
@@ -16824,19 +16478,18 @@
           <w:color w:val="000000"/>
           <w:lang w:val="en-US"/>
         </w:rPr>
-        <w:t xml:space="preserve">Saya membaca power sensor di rumah kaca saya menunjukan angka 58 hertz 280 volt. Saya menyalakan beban sebuah pompa listrik bermerek </w:t>
-      </w:r>
-      <w:proofErr w:type="gramStart"/>
+        <w:t xml:space="preserve">Saya membaca power sensor di rumah kaca saya menunjukan angka 58 hertz 280 volt. Saya menyalakan beban sebuah pompa listrik bermerek shimizu 300 watt untuk menyiram tanaman tomat yang berumur 3 bulan setelah tanam. Sistem pengairan menggunakan sistem tetes dengan pupuk A B </w:t>
+      </w:r>
       <w:r>
         <w:rPr>
           <w:rFonts w:cs="Arial"/>
           <w:b/>
-          <w:color w:val="000000"/>
-          <w:lang w:val="en-US"/>
-        </w:rPr>
-        <w:t>shimizu</w:t>
-      </w:r>
-      <w:proofErr w:type="gramEnd"/>
+          <w:i/>
+          <w:color w:val="000000"/>
+          <w:lang w:val="en-US"/>
+        </w:rPr>
+        <w:t>Mix</w:t>
+      </w:r>
       <w:r>
         <w:rPr>
           <w:rFonts w:cs="Arial"/>
@@ -16844,25 +16497,6 @@
           <w:color w:val="000000"/>
           <w:lang w:val="en-US"/>
         </w:rPr>
-        <w:t xml:space="preserve"> 300 watt untuk menyiram tanaman tomat yang berumur 3 bulan setelah tanam. Sistem pengairan menggunakan sistem tetes dengan pupuk A B </w:t>
-      </w:r>
-      <w:r>
-        <w:rPr>
-          <w:rFonts w:cs="Arial"/>
-          <w:b/>
-          <w:i/>
-          <w:color w:val="000000"/>
-          <w:lang w:val="en-US"/>
-        </w:rPr>
-        <w:t>Mix</w:t>
-      </w:r>
-      <w:r>
-        <w:rPr>
-          <w:rFonts w:cs="Arial"/>
-          <w:b/>
-          <w:color w:val="000000"/>
-          <w:lang w:val="en-US"/>
-        </w:rPr>
         <w:t>. Power sensor juga menunjukan nilai beban sebesar 380 watt ketika pompa dinyalakan. Buatkan saya analisis kesehatan sumber listrik dan kesehatan instrumen dan instalasi pengairan saya, serta tindakan apa yang harus dilakukan</w:t>
       </w:r>
       <w:r>
@@ -16956,25 +16590,7 @@
           <w:color w:val="000000"/>
           <w:lang w:val="en-US"/>
         </w:rPr>
-        <w:t xml:space="preserve"> dalam format bahasa sehari hari, </w:t>
-      </w:r>
-      <w:proofErr w:type="gramStart"/>
-      <w:r>
-        <w:rPr>
-          <w:rFonts w:cs="Arial"/>
-          <w:color w:val="000000"/>
-          <w:lang w:val="en-US"/>
-        </w:rPr>
-        <w:t>seperti</w:t>
-      </w:r>
-      <w:proofErr w:type="gramEnd"/>
-      <w:r>
-        <w:rPr>
-          <w:rFonts w:cs="Arial"/>
-          <w:color w:val="000000"/>
-          <w:lang w:val="en-US"/>
-        </w:rPr>
-        <w:t xml:space="preserve"> rekomendasi untuk mematikan pompa air karena tegangan yang tidak normal. Hasil ini kemudian dikirim kembali ke antarmuka agar dapat dibaca oleh pengguna secara </w:t>
+        <w:t xml:space="preserve"> dalam format bahasa sehari hari, seperti rekomendasi untuk mematikan pompa air karena tegangan yang tidak normal. Hasil ini kemudian dikirim kembali ke antarmuka agar dapat dibaca oleh pengguna secara </w:t>
       </w:r>
       <w:r>
         <w:rPr>
@@ -17002,7 +16618,7 @@
           <w:rFonts w:ascii="Times New Roman" w:hAnsi="Times New Roman"/>
         </w:rPr>
       </w:pPr>
-      <w:bookmarkStart w:id="38" w:name="_Toc221117436"/>
+      <w:bookmarkStart w:id="39" w:name="_Toc221117436"/>
       <w:r>
         <w:rPr>
           <w:rFonts w:cs="Arial"/>
@@ -17010,7 +16626,7 @@
         </w:rPr>
         <w:t>3.3.5 Tahap Revisi dan Deploy</w:t>
       </w:r>
-      <w:bookmarkEnd w:id="38"/>
+      <w:bookmarkEnd w:id="39"/>
     </w:p>
     <w:p>
       <w:pPr>
@@ -17157,7 +16773,7 @@
           <w:rFonts w:ascii="Times New Roman" w:hAnsi="Times New Roman"/>
         </w:rPr>
       </w:pPr>
-      <w:bookmarkStart w:id="39" w:name="_Toc221117437"/>
+      <w:bookmarkStart w:id="40" w:name="_Toc221117437"/>
       <w:r>
         <w:rPr>
           <w:rFonts w:cs="Arial"/>
@@ -17167,7 +16783,7 @@
         <w:lastRenderedPageBreak/>
         <w:t>3.4 Tata Cara Evaluasi dan Validasi Solusi</w:t>
       </w:r>
-      <w:bookmarkEnd w:id="39"/>
+      <w:bookmarkEnd w:id="40"/>
     </w:p>
     <w:p>
       <w:pPr>
@@ -17793,7 +17409,43 @@
           <w:sz w:val="22"/>
           <w:szCs w:val="22"/>
         </w:rPr>
-        <w:t xml:space="preserve"> seperti berikut:</w:t>
+        <w:t xml:space="preserve"> seperti </w:t>
+      </w:r>
+      <w:r>
+        <w:rPr>
+          <w:rFonts w:ascii="Arial" w:hAnsi="Arial" w:cs="Arial"/>
+          <w:color w:val="000000"/>
+          <w:sz w:val="22"/>
+          <w:szCs w:val="22"/>
+        </w:rPr>
+        <w:t>pada table 3.</w:t>
+      </w:r>
+      <w:r>
+        <w:rPr>
+          <w:rFonts w:ascii="Arial" w:hAnsi="Arial" w:cs="Arial"/>
+          <w:color w:val="000000"/>
+          <w:sz w:val="22"/>
+          <w:szCs w:val="22"/>
+        </w:rPr>
+        <w:t>3</w:t>
+      </w:r>
+      <w:r>
+        <w:rPr>
+          <w:rFonts w:ascii="Arial" w:hAnsi="Arial" w:cs="Arial"/>
+          <w:color w:val="000000"/>
+          <w:sz w:val="22"/>
+          <w:szCs w:val="22"/>
+        </w:rPr>
+        <w:t xml:space="preserve"> </w:t>
+      </w:r>
+      <w:r>
+        <w:rPr>
+          <w:rFonts w:ascii="Arial" w:hAnsi="Arial" w:cs="Arial"/>
+          <w:color w:val="000000"/>
+          <w:sz w:val="22"/>
+          <w:szCs w:val="22"/>
+        </w:rPr>
+        <w:t>berikut:</w:t>
       </w:r>
     </w:p>
     <w:p>
@@ -17803,7 +17455,7 @@
           <w:lang w:val="en-US"/>
         </w:rPr>
       </w:pPr>
-      <w:bookmarkStart w:id="40" w:name="_Toc221117442"/>
+      <w:bookmarkStart w:id="41" w:name="_Toc221665236"/>
       <w:r>
         <w:t xml:space="preserve">Tabel </w:t>
       </w:r>
@@ -17813,36 +17465,14 @@
         </w:rPr>
         <w:t>3.</w:t>
       </w:r>
-      <w:r>
-        <w:rPr>
-          <w:noProof/>
-        </w:rPr>
-        <w:fldChar w:fldCharType="begin"/>
-      </w:r>
-      <w:r>
-        <w:rPr>
-          <w:noProof/>
-        </w:rPr>
-        <w:instrText xml:space="preserve"> SEQ Tabel \* ARABIC </w:instrText>
-      </w:r>
-      <w:r>
-        <w:rPr>
-          <w:noProof/>
-        </w:rPr>
-        <w:fldChar w:fldCharType="separate"/>
-      </w:r>
-      <w:r>
-        <w:rPr>
-          <w:noProof/>
-        </w:rPr>
-        <w:t>3</w:t>
-      </w:r>
-      <w:r>
-        <w:rPr>
-          <w:noProof/>
-        </w:rPr>
-        <w:fldChar w:fldCharType="end"/>
-      </w:r>
+      <w:fldSimple w:instr=" SEQ Tabel \* ARABIC ">
+        <w:r>
+          <w:rPr>
+            <w:noProof/>
+          </w:rPr>
+          <w:t>3</w:t>
+        </w:r>
+      </w:fldSimple>
       <w:r>
         <w:t xml:space="preserve">. </w:t>
       </w:r>
@@ -17852,7 +17482,7 @@
         </w:rPr>
         <w:t>Detail skala penelitian</w:t>
       </w:r>
-      <w:bookmarkEnd w:id="40"/>
+      <w:bookmarkEnd w:id="41"/>
     </w:p>
     <w:tbl>
       <w:tblPr>
@@ -18313,8 +17943,16 @@
         <w:rPr>
           <w:rFonts w:cs="Arial"/>
           <w:color w:val="000000"/>
-        </w:rPr>
-        <w:t>4.</w:t>
+          <w:lang w:val="en-US"/>
+        </w:rPr>
+        <w:t>4</w:t>
+      </w:r>
+      <w:r>
+        <w:rPr>
+          <w:rFonts w:cs="Arial"/>
+          <w:color w:val="000000"/>
+        </w:rPr>
+        <w:t>.</w:t>
       </w:r>
     </w:p>
     <w:p>
@@ -18324,7 +17962,7 @@
           <w:lang w:val="en-US"/>
         </w:rPr>
       </w:pPr>
-      <w:bookmarkStart w:id="41" w:name="_Toc221117443"/>
+      <w:bookmarkStart w:id="42" w:name="_Toc221665237"/>
       <w:r>
         <w:t xml:space="preserve">Tabel </w:t>
       </w:r>
@@ -18334,36 +17972,14 @@
         </w:rPr>
         <w:t>3.</w:t>
       </w:r>
-      <w:r>
-        <w:rPr>
-          <w:noProof/>
-        </w:rPr>
-        <w:fldChar w:fldCharType="begin"/>
-      </w:r>
-      <w:r>
-        <w:rPr>
-          <w:noProof/>
-        </w:rPr>
-        <w:instrText xml:space="preserve"> SEQ Tabel \* ARABIC </w:instrText>
-      </w:r>
-      <w:r>
-        <w:rPr>
-          <w:noProof/>
-        </w:rPr>
-        <w:fldChar w:fldCharType="separate"/>
-      </w:r>
-      <w:r>
-        <w:rPr>
-          <w:noProof/>
-        </w:rPr>
-        <w:t>4</w:t>
-      </w:r>
-      <w:r>
-        <w:rPr>
-          <w:noProof/>
-        </w:rPr>
-        <w:fldChar w:fldCharType="end"/>
-      </w:r>
+      <w:fldSimple w:instr=" SEQ Tabel \* ARABIC ">
+        <w:r>
+          <w:rPr>
+            <w:noProof/>
+          </w:rPr>
+          <w:t>4</w:t>
+        </w:r>
+      </w:fldSimple>
       <w:r>
         <w:t xml:space="preserve">. </w:t>
       </w:r>
@@ -18380,7 +17996,7 @@
         </w:rPr>
         <w:t xml:space="preserve"> nilai SUS</w:t>
       </w:r>
-      <w:bookmarkEnd w:id="41"/>
+      <w:bookmarkEnd w:id="42"/>
     </w:p>
     <w:tbl>
       <w:tblPr>
@@ -18878,7 +18494,13 @@
         <w:t>3.</w:t>
       </w:r>
       <w:r>
-        <w:t>5 berikut.</w:t>
+        <w:rPr>
+          <w:lang w:val="en-US"/>
+        </w:rPr>
+        <w:t>5</w:t>
+      </w:r>
+      <w:r>
+        <w:t xml:space="preserve"> berikut.</w:t>
       </w:r>
     </w:p>
     <w:tbl>
@@ -19720,7 +19342,7 @@
           <w:lang w:val="en-US"/>
         </w:rPr>
       </w:pPr>
-      <w:bookmarkStart w:id="42" w:name="_Toc221117444"/>
+      <w:bookmarkStart w:id="43" w:name="_Toc221665238"/>
       <w:r>
         <w:t xml:space="preserve">Tabel </w:t>
       </w:r>
@@ -19730,36 +19352,14 @@
         </w:rPr>
         <w:t>3.</w:t>
       </w:r>
-      <w:r>
-        <w:rPr>
-          <w:noProof/>
-        </w:rPr>
-        <w:fldChar w:fldCharType="begin"/>
-      </w:r>
-      <w:r>
-        <w:rPr>
-          <w:noProof/>
-        </w:rPr>
-        <w:instrText xml:space="preserve"> SEQ Tabel \* ARABIC </w:instrText>
-      </w:r>
-      <w:r>
-        <w:rPr>
-          <w:noProof/>
-        </w:rPr>
-        <w:fldChar w:fldCharType="separate"/>
-      </w:r>
-      <w:r>
-        <w:rPr>
-          <w:noProof/>
-        </w:rPr>
-        <w:t>5</w:t>
-      </w:r>
-      <w:r>
-        <w:rPr>
-          <w:noProof/>
-        </w:rPr>
-        <w:fldChar w:fldCharType="end"/>
-      </w:r>
+      <w:fldSimple w:instr=" SEQ Tabel \* ARABIC ">
+        <w:r>
+          <w:rPr>
+            <w:noProof/>
+          </w:rPr>
+          <w:t>5</w:t>
+        </w:r>
+      </w:fldSimple>
       <w:r>
         <w:t xml:space="preserve">. </w:t>
       </w:r>
@@ -19769,7 +19369,7 @@
         </w:rPr>
         <w:t>Daftar pertanyaan SUS</w:t>
       </w:r>
-      <w:bookmarkEnd w:id="42"/>
+      <w:bookmarkEnd w:id="43"/>
     </w:p>
     <w:p>
       <w:pPr>
@@ -20310,7 +19910,6 @@
         <w:lastRenderedPageBreak/>
         <w:t xml:space="preserve">menemukan pola kelemahan sistem, aspek antarmuka yang perlu diperbaiki, serta peluang pengembangan fitur baru. Melalui ketiga indikator ini, evaluasi sistem dilakukan secara terukur dan transparan. Pendekatan kuantitatif pada </w:t>
       </w:r>
-      <w:bookmarkStart w:id="43" w:name="_GoBack"/>
       <w:r>
         <w:rPr>
           <w:rFonts w:cs="Arial"/>
@@ -20319,7 +19918,6 @@
         </w:rPr>
         <w:t>SUS</w:t>
       </w:r>
-      <w:bookmarkEnd w:id="43"/>
       <w:r>
         <w:rPr>
           <w:rFonts w:cs="Arial"/>
@@ -21479,6 +21077,7 @@
         <w:docPartUnique/>
       </w:docPartObj>
     </w:sdtPr>
+    <w:sdtEndPr/>
     <w:sdtContent>
       <w:p>
         <w:pPr>
@@ -21536,6 +21135,7 @@
         <w:docPartUnique/>
       </w:docPartObj>
     </w:sdtPr>
+    <w:sdtEndPr/>
     <w:sdtContent>
       <w:p>
         <w:pPr>
@@ -21564,7 +21164,7 @@
           <w:rPr>
             <w:noProof/>
           </w:rPr>
-          <w:t>20</w:t>
+          <w:t>15</w:t>
         </w:r>
         <w:r>
           <w:rPr>
@@ -21593,6 +21193,7 @@
         <w:docPartUnique/>
       </w:docPartObj>
     </w:sdtPr>
+    <w:sdtEndPr/>
     <w:sdtContent>
       <w:p>
         <w:pPr>
@@ -21621,7 +21222,7 @@
           <w:rPr>
             <w:noProof/>
           </w:rPr>
-          <w:t>27</w:t>
+          <w:t>23</w:t>
         </w:r>
         <w:r>
           <w:rPr>
@@ -23227,7 +22828,7 @@
 </file>
 
 <file path=customXml/itemProps1.xml><?xml version="1.0" encoding="utf-8"?>
-<ds:datastoreItem xmlns:ds="http://schemas.openxmlformats.org/officeDocument/2006/customXml" ds:itemID="{D55C4EE4-EFC9-41F0-BEC8-2E1E26EC66C2}">
+<ds:datastoreItem xmlns:ds="http://schemas.openxmlformats.org/officeDocument/2006/customXml" ds:itemID="{E869C316-3BC3-4CE3-B5C1-A468226EB0F6}">
   <ds:schemaRefs>
     <ds:schemaRef ds:uri="http://schemas.openxmlformats.org/officeDocument/2006/bibliography"/>
   </ds:schemaRefs>

</xml_diff>

<commit_message>
Refactor code structure for improved readability and maintainability bab 4.1
</commit_message>
<xml_diff>
--- a/NASKAH/Dokumen Proposal Skripsi - NIM - NAMA - TAHUN ANGKATAN - TAHUN SKRIPSI.docx
+++ b/NASKAH/Dokumen Proposal Skripsi - NIM - NAMA - TAHUN ANGKATAN - TAHUN SKRIPSI.docx
@@ -58,11 +58,19 @@
           <w:b/>
         </w:rPr>
       </w:pPr>
+      <w:bookmarkStart w:id="0" w:name="_GoBack"/>
       <w:r>
         <w:rPr>
           <w:b/>
         </w:rPr>
-        <w:t>PROPOSAL SKRIPSI</w:t>
+        <w:t xml:space="preserve">PROPOSAL </w:t>
+      </w:r>
+      <w:bookmarkEnd w:id="0"/>
+      <w:r>
+        <w:rPr>
+          <w:b/>
+        </w:rPr>
+        <w:t>SKRIPSI</w:t>
       </w:r>
     </w:p>
     <w:p>
@@ -1145,17 +1153,17 @@
       <w:pPr>
         <w:pStyle w:val="Heading1"/>
       </w:pPr>
-      <w:bookmarkStart w:id="0" w:name="_Toc75025325"/>
-      <w:bookmarkStart w:id="1" w:name="_Toc221665432"/>
+      <w:bookmarkStart w:id="1" w:name="_Toc75025325"/>
+      <w:bookmarkStart w:id="2" w:name="_Toc221665432"/>
       <w:r>
         <w:lastRenderedPageBreak/>
         <w:t>HALAMAN PENGESAHAN</w:t>
       </w:r>
-      <w:bookmarkEnd w:id="0"/>
+      <w:bookmarkEnd w:id="1"/>
       <w:r>
         <w:t xml:space="preserve"> PROPOSAL SKRIPSI</w:t>
       </w:r>
-      <w:bookmarkEnd w:id="1"/>
+      <w:bookmarkEnd w:id="2"/>
     </w:p>
     <w:p/>
     <w:tbl>
@@ -1375,6 +1383,12 @@
               <w:t>pada Antar</w:t>
             </w:r>
             <w:r>
+              <w:rPr>
+                <w:lang w:val="en-US"/>
+              </w:rPr>
+              <w:t>muka</w:t>
+            </w:r>
+            <w:r>
               <w:t xml:space="preserve"> </w:t>
             </w:r>
             <w:r>
@@ -1438,7 +1452,52 @@
         <w:rPr>
           <w:szCs w:val="28"/>
         </w:rPr>
-        <w:t>Proposal ini telah ditinjau, diuji dan disetujui pada tanggal ...../...../.......... untuk masuk ke jenjang pengerjaan skripsi melalui ujian proposal skripsi oleh:</w:t>
+        <w:t xml:space="preserve">Proposal ini telah ditinjau, diuji </w:t>
+      </w:r>
+      <w:r>
+        <w:rPr>
+          <w:szCs w:val="28"/>
+        </w:rPr>
+        <w:t xml:space="preserve">dan disetujui pada tanggal </w:t>
+      </w:r>
+      <w:r>
+        <w:rPr>
+          <w:szCs w:val="28"/>
+          <w:lang w:val="en-US"/>
+        </w:rPr>
+        <w:t>12</w:t>
+      </w:r>
+      <w:r>
+        <w:rPr>
+          <w:szCs w:val="28"/>
+        </w:rPr>
+        <w:t>/</w:t>
+      </w:r>
+      <w:r>
+        <w:rPr>
+          <w:szCs w:val="28"/>
+          <w:lang w:val="en-US"/>
+        </w:rPr>
+        <w:t>02</w:t>
+      </w:r>
+      <w:r>
+        <w:rPr>
+          <w:szCs w:val="28"/>
+        </w:rPr>
+        <w:t>/</w:t>
+      </w:r>
+      <w:r>
+        <w:rPr>
+          <w:szCs w:val="28"/>
+          <w:lang w:val="en-US"/>
+        </w:rPr>
+        <w:t>2026</w:t>
+      </w:r>
+      <w:r>
+        <w:rPr>
+          <w:szCs w:val="28"/>
+        </w:rPr>
+        <w:t xml:space="preserve"> untuk masuk ke jenjang pengerjaan skripsi melalui ujian proposal skripsi oleh:</w:t>
       </w:r>
     </w:p>
     <w:p>
@@ -1454,6 +1513,13 @@
       <w:pPr>
         <w:spacing w:line="240" w:lineRule="auto"/>
         <w:ind w:firstLine="0"/>
+        <w:rPr>
+          <w:szCs w:val="28"/>
+        </w:rPr>
+      </w:pPr>
+    </w:p>
+    <w:p>
+      <w:pPr>
         <w:rPr>
           <w:szCs w:val="28"/>
         </w:rPr>
@@ -1473,10 +1539,10 @@
                   <wp:posOffset>-38100</wp:posOffset>
                 </wp:positionH>
                 <wp:positionV relativeFrom="paragraph">
-                  <wp:posOffset>346075</wp:posOffset>
+                  <wp:posOffset>184785</wp:posOffset>
                 </wp:positionV>
-                <wp:extent cx="3000375" cy="1524000"/>
-                <wp:effectExtent l="1905" t="1905" r="0" b="0"/>
+                <wp:extent cx="3870960" cy="2034540"/>
+                <wp:effectExtent l="0" t="0" r="0" b="3810"/>
                 <wp:wrapNone/>
                 <wp:docPr id="7" name="Text Box 2"/>
                 <wp:cNvGraphicFramePr>
@@ -1491,7 +1557,7 @@
                       <wps:spPr bwMode="auto">
                         <a:xfrm>
                           <a:off x="0" y="0"/>
-                          <a:ext cx="3000375" cy="1524000"/>
+                          <a:ext cx="3870960" cy="2034540"/>
                         </a:xfrm>
                         <a:prstGeom prst="rect">
                           <a:avLst/>
@@ -1569,12 +1635,64 @@
                               </w:tabs>
                               <w:ind w:firstLine="0"/>
                             </w:pPr>
+                          </w:p>
+                          <w:p>
+                            <w:pPr>
+                              <w:tabs>
+                                <w:tab w:val="left" w:pos="567"/>
+                                <w:tab w:val="left" w:pos="1134"/>
+                              </w:tabs>
+                              <w:ind w:firstLine="0"/>
+                            </w:pPr>
+                          </w:p>
+                          <w:p>
+                            <w:pPr>
+                              <w:tabs>
+                                <w:tab w:val="left" w:pos="567"/>
+                                <w:tab w:val="left" w:pos="1134"/>
+                              </w:tabs>
+                              <w:ind w:firstLine="0"/>
+                              <w:rPr>
+                                <w:lang w:val="en-US"/>
+                              </w:rPr>
+                            </w:pPr>
                             <w:r>
-                              <w:t>(____________________________)</w:t>
+                              <w:t>(</w:t>
+                            </w:r>
+                            <w:r>
+                              <w:rPr>
+                                <w:rFonts w:cs="Arial"/>
+                                <w:color w:val="212121"/>
+                                <w:u w:val="single"/>
+                              </w:rPr>
+                              <w:t>Ni Luh Putu Ika Candrawengi, S.Stat., M.Stat</w:t>
+                            </w:r>
+                            <w:r>
+                              <w:t>)</w:t>
                             </w:r>
                             <w:r>
                               <w:br/>
-                              <w:t>NPP.</w:t>
+                            </w:r>
+                            <w:r>
+                              <w:rPr>
+                                <w:lang w:val="en-US"/>
+                              </w:rPr>
+                              <w:t>NIDK</w:t>
+                            </w:r>
+                            <w:r>
+                              <w:t>.</w:t>
+                            </w:r>
+                            <w:r>
+                              <w:rPr>
+                                <w:lang w:val="en-US"/>
+                              </w:rPr>
+                              <w:t xml:space="preserve"> </w:t>
+                            </w:r>
+                            <w:r>
+                              <w:rPr>
+                                <w:lang w:val="en-US"/>
+                              </w:rPr>
+                              <w:t>8925101024</w:t>
                             </w:r>
                           </w:p>
                         </w:txbxContent>
@@ -1600,7 +1718,7 @@
                 <v:stroke joinstyle="miter"/>
                 <v:path gradientshapeok="t" o:connecttype="rect"/>
               </v:shapetype>
-              <v:shape id="Text Box 2" o:spid="_x0000_s1026" type="#_x0000_t202" style="position:absolute;margin-left:-3pt;margin-top:27.25pt;width:236.25pt;height:120pt;z-index:251659264;visibility:visible;mso-wrap-style:square;mso-width-percent:0;mso-height-percent:0;mso-wrap-distance-left:9pt;mso-wrap-distance-top:0;mso-wrap-distance-right:9pt;mso-wrap-distance-bottom:0;mso-position-horizontal:absolute;mso-position-horizontal-relative:margin;mso-position-vertical:absolute;mso-position-vertical-relative:text;mso-width-percent:0;mso-height-percent:0;mso-width-relative:page;mso-height-relative:page;v-text-anchor:top" o:gfxdata="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" filled="f" stroked="f">
+              <v:shape id="Text Box 2" o:spid="_x0000_s1026" type="#_x0000_t202" style="position:absolute;left:0;text-align:left;margin-left:-3pt;margin-top:14.55pt;width:304.8pt;height:160.2pt;z-index:251659264;visibility:visible;mso-wrap-style:square;mso-width-percent:0;mso-height-percent:0;mso-wrap-distance-left:9pt;mso-wrap-distance-top:0;mso-wrap-distance-right:9pt;mso-wrap-distance-bottom:0;mso-position-horizontal:absolute;mso-position-horizontal-relative:margin;mso-position-vertical:absolute;mso-position-vertical-relative:text;mso-width-percent:0;mso-height-percent:0;mso-width-relative:page;mso-height-relative:page;v-text-anchor:top" o:gfxdata="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" filled="f" stroked="f">
                 <v:textbox>
                   <w:txbxContent>
                     <w:p>
@@ -1650,12 +1768,64 @@
                         </w:tabs>
                         <w:ind w:firstLine="0"/>
                       </w:pPr>
+                    </w:p>
+                    <w:p>
+                      <w:pPr>
+                        <w:tabs>
+                          <w:tab w:val="left" w:pos="567"/>
+                          <w:tab w:val="left" w:pos="1134"/>
+                        </w:tabs>
+                        <w:ind w:firstLine="0"/>
+                      </w:pPr>
+                    </w:p>
+                    <w:p>
+                      <w:pPr>
+                        <w:tabs>
+                          <w:tab w:val="left" w:pos="567"/>
+                          <w:tab w:val="left" w:pos="1134"/>
+                        </w:tabs>
+                        <w:ind w:firstLine="0"/>
+                        <w:rPr>
+                          <w:lang w:val="en-US"/>
+                        </w:rPr>
+                      </w:pPr>
                       <w:r>
-                        <w:t>(____________________________)</w:t>
+                        <w:t>(</w:t>
+                      </w:r>
+                      <w:r>
+                        <w:rPr>
+                          <w:rFonts w:cs="Arial"/>
+                          <w:color w:val="212121"/>
+                          <w:u w:val="single"/>
+                        </w:rPr>
+                        <w:t>Ni Luh Putu Ika Candrawengi, S.Stat., M.Stat</w:t>
+                      </w:r>
+                      <w:r>
+                        <w:t>)</w:t>
                       </w:r>
                       <w:r>
                         <w:br/>
-                        <w:t>NPP.</w:t>
+                      </w:r>
+                      <w:r>
+                        <w:rPr>
+                          <w:lang w:val="en-US"/>
+                        </w:rPr>
+                        <w:t>NIDK</w:t>
+                      </w:r>
+                      <w:r>
+                        <w:t>.</w:t>
+                      </w:r>
+                      <w:r>
+                        <w:rPr>
+                          <w:lang w:val="en-US"/>
+                        </w:rPr>
+                        <w:t xml:space="preserve"> </w:t>
+                      </w:r>
+                      <w:r>
+                        <w:rPr>
+                          <w:lang w:val="en-US"/>
+                        </w:rPr>
+                        <w:t>8925101024</w:t>
                       </w:r>
                     </w:p>
                   </w:txbxContent>
@@ -1729,13 +1899,6 @@
           <w:szCs w:val="28"/>
         </w:rPr>
       </w:pPr>
-    </w:p>
-    <w:p>
-      <w:pPr>
-        <w:rPr>
-          <w:szCs w:val="28"/>
-        </w:rPr>
-      </w:pPr>
       <w:r>
         <w:rPr>
           <w:noProof/>
@@ -1748,13 +1911,13 @@
               <wp:anchor distT="0" distB="0" distL="114300" distR="114300" simplePos="0" relativeHeight="251661312" behindDoc="0" locked="0" layoutInCell="1" allowOverlap="1" wp14:anchorId="363C17E7" wp14:editId="3A6DB9CE">
                 <wp:simplePos x="0" y="0"/>
                 <wp:positionH relativeFrom="margin">
-                  <wp:posOffset>2830195</wp:posOffset>
+                  <wp:posOffset>2865120</wp:posOffset>
                 </wp:positionH>
                 <wp:positionV relativeFrom="paragraph">
-                  <wp:posOffset>24130</wp:posOffset>
+                  <wp:posOffset>226060</wp:posOffset>
                 </wp:positionV>
-                <wp:extent cx="2615565" cy="1533525"/>
-                <wp:effectExtent l="3175" t="0" r="635" b="635"/>
+                <wp:extent cx="2615565" cy="2171700"/>
+                <wp:effectExtent l="0" t="0" r="0" b="0"/>
                 <wp:wrapNone/>
                 <wp:docPr id="6" name="Text Box 5"/>
                 <wp:cNvGraphicFramePr>
@@ -1769,7 +1932,7 @@
                       <wps:spPr bwMode="auto">
                         <a:xfrm>
                           <a:off x="0" y="0"/>
-                          <a:ext cx="2615565" cy="1533525"/>
+                          <a:ext cx="2615565" cy="2171700"/>
                         </a:xfrm>
                         <a:prstGeom prst="rect">
                           <a:avLst/>
@@ -1847,12 +2010,52 @@
                               </w:tabs>
                               <w:ind w:firstLine="0"/>
                             </w:pPr>
+                          </w:p>
+                          <w:p>
+                            <w:pPr>
+                              <w:tabs>
+                                <w:tab w:val="left" w:pos="567"/>
+                                <w:tab w:val="left" w:pos="1134"/>
+                              </w:tabs>
+                              <w:ind w:firstLine="0"/>
+                            </w:pPr>
+                          </w:p>
+                          <w:p>
+                            <w:pPr>
+                              <w:tabs>
+                                <w:tab w:val="left" w:pos="567"/>
+                                <w:tab w:val="left" w:pos="1134"/>
+                              </w:tabs>
+                              <w:ind w:firstLine="0"/>
+                            </w:pPr>
                             <w:r>
-                              <w:t>(____________________________)</w:t>
+                              <w:t>(</w:t>
+                            </w:r>
+                            <w:r>
+                              <w:rPr>
+                                <w:rFonts w:cs="Arial"/>
+                                <w:color w:val="212121"/>
+                                <w:u w:val="single"/>
+                              </w:rPr>
+                              <w:t>Yadhurani Dewi Amritha, S.Si., M.Sc</w:t>
+                            </w:r>
+                            <w:r>
+                              <w:t>)</w:t>
                             </w:r>
                             <w:r>
                               <w:br/>
-                              <w:t>NPP.</w:t>
+                            </w:r>
+                            <w:r>
+                              <w:rPr>
+                                <w:lang w:val="en-US"/>
+                              </w:rPr>
+                              <w:t>NIDK</w:t>
+                            </w:r>
+                            <w:r>
+                              <w:t>.</w:t>
+                            </w:r>
+                            <w:r>
+                              <w:t xml:space="preserve"> 8935101024</w:t>
                             </w:r>
                           </w:p>
                           <w:p>
@@ -1883,7 +2086,7 @@
           </mc:Choice>
           <mc:Fallback>
             <w:pict>
-              <v:shape w14:anchorId="363C17E7" id="Text Box 5" o:spid="_x0000_s1027" type="#_x0000_t202" style="position:absolute;left:0;text-align:left;margin-left:222.85pt;margin-top:1.9pt;width:205.95pt;height:120.75pt;z-index:251661312;visibility:visible;mso-wrap-style:square;mso-width-percent:0;mso-height-percent:0;mso-wrap-distance-left:9pt;mso-wrap-distance-top:0;mso-wrap-distance-right:9pt;mso-wrap-distance-bottom:0;mso-position-horizontal:absolute;mso-position-horizontal-relative:margin;mso-position-vertical:absolute;mso-position-vertical-relative:text;mso-width-percent:0;mso-height-percent:0;mso-width-relative:page;mso-height-relative:page;v-text-anchor:top" o:gfxdata="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" filled="f" stroked="f">
+              <v:shape w14:anchorId="363C17E7" id="Text Box 5" o:spid="_x0000_s1027" type="#_x0000_t202" style="position:absolute;left:0;text-align:left;margin-left:225.6pt;margin-top:17.8pt;width:205.95pt;height:171pt;z-index:251661312;visibility:visible;mso-wrap-style:square;mso-width-percent:0;mso-height-percent:0;mso-wrap-distance-left:9pt;mso-wrap-distance-top:0;mso-wrap-distance-right:9pt;mso-wrap-distance-bottom:0;mso-position-horizontal:absolute;mso-position-horizontal-relative:margin;mso-position-vertical:absolute;mso-position-vertical-relative:text;mso-width-percent:0;mso-height-percent:0;mso-width-relative:page;mso-height-relative:page;v-text-anchor:top" o:gfxdata="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" filled="f" stroked="f">
                 <v:textbox>
                   <w:txbxContent>
                     <w:p>
@@ -1933,12 +2136,52 @@
                         </w:tabs>
                         <w:ind w:firstLine="0"/>
                       </w:pPr>
+                    </w:p>
+                    <w:p>
+                      <w:pPr>
+                        <w:tabs>
+                          <w:tab w:val="left" w:pos="567"/>
+                          <w:tab w:val="left" w:pos="1134"/>
+                        </w:tabs>
+                        <w:ind w:firstLine="0"/>
+                      </w:pPr>
+                    </w:p>
+                    <w:p>
+                      <w:pPr>
+                        <w:tabs>
+                          <w:tab w:val="left" w:pos="567"/>
+                          <w:tab w:val="left" w:pos="1134"/>
+                        </w:tabs>
+                        <w:ind w:firstLine="0"/>
+                      </w:pPr>
                       <w:r>
-                        <w:t>(____________________________)</w:t>
+                        <w:t>(</w:t>
+                      </w:r>
+                      <w:r>
+                        <w:rPr>
+                          <w:rFonts w:cs="Arial"/>
+                          <w:color w:val="212121"/>
+                          <w:u w:val="single"/>
+                        </w:rPr>
+                        <w:t>Yadhurani Dewi Amritha, S.Si., M.Sc</w:t>
+                      </w:r>
+                      <w:r>
+                        <w:t>)</w:t>
                       </w:r>
                       <w:r>
                         <w:br/>
-                        <w:t>NPP.</w:t>
+                      </w:r>
+                      <w:r>
+                        <w:rPr>
+                          <w:lang w:val="en-US"/>
+                        </w:rPr>
+                        <w:t>NIDK</w:t>
+                      </w:r>
+                      <w:r>
+                        <w:t>.</w:t>
+                      </w:r>
+                      <w:r>
+                        <w:t xml:space="preserve"> 8935101024</w:t>
                       </w:r>
                     </w:p>
                     <w:p>
@@ -1958,6 +2201,15 @@
           </mc:Fallback>
         </mc:AlternateContent>
       </w:r>
+    </w:p>
+    <w:p>
+      <w:pPr>
+        <w:spacing w:after="200" w:line="276" w:lineRule="auto"/>
+        <w:ind w:firstLine="0"/>
+        <w:rPr>
+          <w:szCs w:val="28"/>
+        </w:rPr>
+      </w:pPr>
       <w:r>
         <w:rPr>
           <w:noProof/>
@@ -1970,13 +2222,13 @@
               <wp:anchor distT="0" distB="0" distL="114300" distR="114300" simplePos="0" relativeHeight="251660288" behindDoc="0" locked="0" layoutInCell="1" allowOverlap="1" wp14:anchorId="1E7DF937" wp14:editId="61CE839A">
                 <wp:simplePos x="0" y="0"/>
                 <wp:positionH relativeFrom="margin">
-                  <wp:posOffset>-27305</wp:posOffset>
+                  <wp:align>left</wp:align>
                 </wp:positionH>
                 <wp:positionV relativeFrom="paragraph">
-                  <wp:posOffset>24130</wp:posOffset>
+                  <wp:posOffset>7620</wp:posOffset>
                 </wp:positionV>
-                <wp:extent cx="2615565" cy="1533525"/>
-                <wp:effectExtent l="3175" t="0" r="635" b="635"/>
+                <wp:extent cx="2811780" cy="2362200"/>
+                <wp:effectExtent l="0" t="0" r="0" b="0"/>
                 <wp:wrapNone/>
                 <wp:docPr id="4" name="Text Box 3"/>
                 <wp:cNvGraphicFramePr>
@@ -1991,7 +2243,7 @@
                       <wps:spPr bwMode="auto">
                         <a:xfrm>
                           <a:off x="0" y="0"/>
-                          <a:ext cx="2615565" cy="1533525"/>
+                          <a:ext cx="2811780" cy="2362200"/>
                         </a:xfrm>
                         <a:prstGeom prst="rect">
                           <a:avLst/>
@@ -2069,12 +2321,62 @@
                               </w:tabs>
                               <w:ind w:firstLine="0"/>
                             </w:pPr>
+                          </w:p>
+                          <w:p>
+                            <w:pPr>
+                              <w:tabs>
+                                <w:tab w:val="left" w:pos="567"/>
+                                <w:tab w:val="left" w:pos="1134"/>
+                              </w:tabs>
+                              <w:ind w:firstLine="0"/>
+                            </w:pPr>
+                          </w:p>
+                          <w:p>
+                            <w:pPr>
+                              <w:tabs>
+                                <w:tab w:val="left" w:pos="567"/>
+                                <w:tab w:val="left" w:pos="1134"/>
+                              </w:tabs>
+                              <w:ind w:firstLine="0"/>
+                            </w:pPr>
                             <w:r>
-                              <w:t>(____________________________)</w:t>
+                              <w:t>(</w:t>
+                            </w:r>
+                            <w:r>
+                              <w:rPr>
+                                <w:rFonts w:cs="Arial"/>
+                                <w:color w:val="212121"/>
+                                <w:u w:val="single"/>
+                              </w:rPr>
+                              <w:t>Ir. I Gusti Ngurah Darma Paramartha, S.T., M.T., IPM</w:t>
+                            </w:r>
+                            <w:r>
+                              <w:t>)</w:t>
                             </w:r>
                             <w:r>
                               <w:br/>
-                              <w:t>NPP.</w:t>
+                            </w:r>
+                            <w:r>
+                              <w:rPr>
+                                <w:rFonts w:cs="Arial"/>
+                                <w:color w:val="212121"/>
+                                <w:lang w:val="en-US"/>
+                              </w:rPr>
+                              <w:t>NPP</w:t>
+                            </w:r>
+                            <w:r>
+                              <w:rPr>
+                                <w:rFonts w:cs="Arial"/>
+                                <w:color w:val="212121"/>
+                              </w:rPr>
+                              <w:t xml:space="preserve">: </w:t>
+                            </w:r>
+                            <w:r>
+                              <w:rPr>
+                                <w:rFonts w:cs="Arial"/>
+                                <w:color w:val="212121"/>
+                              </w:rPr>
+                              <w:t>02.06.15.243</w:t>
                             </w:r>
                           </w:p>
                           <w:p>
@@ -2105,7 +2407,7 @@
           </mc:Choice>
           <mc:Fallback>
             <w:pict>
-              <v:shape w14:anchorId="1E7DF937" id="Text Box 3" o:spid="_x0000_s1028" type="#_x0000_t202" style="position:absolute;left:0;text-align:left;margin-left:-2.15pt;margin-top:1.9pt;width:205.95pt;height:120.75pt;z-index:251660288;visibility:visible;mso-wrap-style:square;mso-width-percent:0;mso-height-percent:0;mso-wrap-distance-left:9pt;mso-wrap-distance-top:0;mso-wrap-distance-right:9pt;mso-wrap-distance-bottom:0;mso-position-horizontal:absolute;mso-position-horizontal-relative:margin;mso-position-vertical:absolute;mso-position-vertical-relative:text;mso-width-percent:0;mso-height-percent:0;mso-width-relative:page;mso-height-relative:page;v-text-anchor:top" o:gfxdata="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" filled="f" stroked="f">
+              <v:shape w14:anchorId="1E7DF937" id="Text Box 3" o:spid="_x0000_s1028" type="#_x0000_t202" style="position:absolute;margin-left:0;margin-top:.6pt;width:221.4pt;height:186pt;z-index:251660288;visibility:visible;mso-wrap-style:square;mso-width-percent:0;mso-height-percent:0;mso-wrap-distance-left:9pt;mso-wrap-distance-top:0;mso-wrap-distance-right:9pt;mso-wrap-distance-bottom:0;mso-position-horizontal:left;mso-position-horizontal-relative:margin;mso-position-vertical:absolute;mso-position-vertical-relative:text;mso-width-percent:0;mso-height-percent:0;mso-width-relative:page;mso-height-relative:page;v-text-anchor:top" o:gfxdata="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" filled="f" stroked="f">
                 <v:textbox>
                   <w:txbxContent>
                     <w:p>
@@ -2155,12 +2457,62 @@
                         </w:tabs>
                         <w:ind w:firstLine="0"/>
                       </w:pPr>
+                    </w:p>
+                    <w:p>
+                      <w:pPr>
+                        <w:tabs>
+                          <w:tab w:val="left" w:pos="567"/>
+                          <w:tab w:val="left" w:pos="1134"/>
+                        </w:tabs>
+                        <w:ind w:firstLine="0"/>
+                      </w:pPr>
+                    </w:p>
+                    <w:p>
+                      <w:pPr>
+                        <w:tabs>
+                          <w:tab w:val="left" w:pos="567"/>
+                          <w:tab w:val="left" w:pos="1134"/>
+                        </w:tabs>
+                        <w:ind w:firstLine="0"/>
+                      </w:pPr>
                       <w:r>
-                        <w:t>(____________________________)</w:t>
+                        <w:t>(</w:t>
+                      </w:r>
+                      <w:r>
+                        <w:rPr>
+                          <w:rFonts w:cs="Arial"/>
+                          <w:color w:val="212121"/>
+                          <w:u w:val="single"/>
+                        </w:rPr>
+                        <w:t>Ir. I Gusti Ngurah Darma Paramartha, S.T., M.T., IPM</w:t>
+                      </w:r>
+                      <w:r>
+                        <w:t>)</w:t>
                       </w:r>
                       <w:r>
                         <w:br/>
-                        <w:t>NPP.</w:t>
+                      </w:r>
+                      <w:r>
+                        <w:rPr>
+                          <w:rFonts w:cs="Arial"/>
+                          <w:color w:val="212121"/>
+                          <w:lang w:val="en-US"/>
+                        </w:rPr>
+                        <w:t>NPP</w:t>
+                      </w:r>
+                      <w:r>
+                        <w:rPr>
+                          <w:rFonts w:cs="Arial"/>
+                          <w:color w:val="212121"/>
+                        </w:rPr>
+                        <w:t xml:space="preserve">: </w:t>
+                      </w:r>
+                      <w:r>
+                        <w:rPr>
+                          <w:rFonts w:cs="Arial"/>
+                          <w:color w:val="212121"/>
+                        </w:rPr>
+                        <w:t>02.06.15.243</w:t>
                       </w:r>
                     </w:p>
                     <w:p>
@@ -2180,19 +2532,10 @@
           </mc:Fallback>
         </mc:AlternateContent>
       </w:r>
-    </w:p>
-    <w:p>
-      <w:pPr>
-        <w:spacing w:after="200" w:line="276" w:lineRule="auto"/>
-        <w:ind w:firstLine="0"/>
+      <w:r>
         <w:rPr>
           <w:szCs w:val="28"/>
         </w:rPr>
-      </w:pPr>
-      <w:r>
-        <w:rPr>
-          <w:szCs w:val="28"/>
-        </w:rPr>
         <w:br w:type="page"/>
       </w:r>
     </w:p>
@@ -2200,17 +2543,15 @@
       <w:pPr>
         <w:pStyle w:val="Heading1"/>
       </w:pPr>
-      <w:bookmarkStart w:id="2" w:name="_Toc75025326"/>
-      <w:bookmarkStart w:id="3" w:name="_Toc221665433"/>
+      <w:bookmarkStart w:id="3" w:name="_Toc75025326"/>
+      <w:bookmarkStart w:id="4" w:name="_Toc221665433"/>
       <w:r>
         <w:lastRenderedPageBreak/>
         <w:t>DAFTAR ISI</w:t>
       </w:r>
-      <w:bookmarkEnd w:id="2"/>
       <w:bookmarkEnd w:id="3"/>
-    </w:p>
-    <w:bookmarkStart w:id="4" w:name="_GoBack"/>
-    <w:bookmarkEnd w:id="4"/>
+      <w:bookmarkEnd w:id="4"/>
+    </w:p>
     <w:p>
       <w:pPr>
         <w:pStyle w:val="TOC1"/>
@@ -5295,15 +5636,7 @@
         <w:t>sinkronisasi cloud</w:t>
       </w:r>
       <w:r>
-        <w:t xml:space="preserve">, di mana data </w:t>
-      </w:r>
-      <w:proofErr w:type="gramStart"/>
-      <w:r>
-        <w:t>akan</w:t>
-      </w:r>
-      <w:proofErr w:type="gramEnd"/>
-      <w:r>
-        <w:t xml:space="preserve"> dikirim ke server saat koneksi tersedia, sehingga sistem dapat diakses dan dikontrol secara jarak jauh. Dengan pendekatan ini, sistem monitoring dan kontrol rumah kaca tetap adaptif baik dalam kondisi </w:t>
+        <w:t xml:space="preserve">, di mana data akan dikirim ke server saat koneksi tersedia, sehingga sistem dapat diakses dan dikontrol secara jarak jauh. Dengan pendekatan ini, sistem monitoring dan kontrol rumah kaca tetap adaptif baik dalam kondisi </w:t>
       </w:r>
       <w:r>
         <w:rPr>
@@ -6612,21 +6945,7 @@
         <w:rPr>
           <w:lang w:val="en-US"/>
         </w:rPr>
-        <w:t xml:space="preserve">Pertanian hortikultura skala kecil menghadapi tantangan besar akibat perubahan iklim, keterbatasan sumber daya, serta ancaman </w:t>
-      </w:r>
-      <w:proofErr w:type="gramStart"/>
-      <w:r>
-        <w:rPr>
-          <w:lang w:val="en-US"/>
-        </w:rPr>
-        <w:t>hama</w:t>
-      </w:r>
-      <w:proofErr w:type="gramEnd"/>
-      <w:r>
-        <w:rPr>
-          <w:lang w:val="en-US"/>
-        </w:rPr>
-        <w:t xml:space="preserve"> dan penyakit tanaman. Perubahan iklim meningkatkan ketidakpastian pola cuaca, yang berdampak pada ketersediaan air, produktivitas tanaman, dan kerent</w:t>
+        <w:t>Pertanian hortikultura skala kecil menghadapi tantangan besar akibat perubahan iklim, keterbatasan sumber daya, serta ancaman hama dan penyakit tanaman. Perubahan iklim meningkatkan ketidakpastian pola cuaca, yang berdampak pada ketersediaan air, produktivitas tanaman, dan kerent</w:t>
       </w:r>
       <w:r>
         <w:rPr>
@@ -7133,42 +7452,14 @@
         <w:rPr>
           <w:lang w:val="en-US"/>
         </w:rPr>
-        <w:t xml:space="preserve"> yang dapat diakses secara efektif dan mudah digunakan. Karena sistem ini </w:t>
-      </w:r>
-      <w:proofErr w:type="gramStart"/>
-      <w:r>
-        <w:rPr>
-          <w:lang w:val="en-US"/>
-        </w:rPr>
-        <w:t>akan</w:t>
-      </w:r>
-      <w:proofErr w:type="gramEnd"/>
-      <w:r>
-        <w:rPr>
-          <w:lang w:val="en-US"/>
-        </w:rPr>
-        <w:t xml:space="preserve"> digunakan oleh petani hortikultura skala kecil dan harus beradaptasi dengan kondisi </w:t>
+        <w:t xml:space="preserve"> yang dapat diakses secara efektif dan mudah digunakan. Karena sistem ini akan digunakan oleh petani hortikultura skala kecil dan harus beradaptasi dengan kondisi </w:t>
       </w:r>
       <w:r>
         <w:rPr>
           <w:lang w:val="en-US"/>
         </w:rPr>
         <w:lastRenderedPageBreak/>
-        <w:t xml:space="preserve">lingkungan yang dinamis, maka pendekatan pengembangan yang dipilih tidak bisa statis. Proses pemilihan metodologi dilakukan melalui perbandingan beberapa pendekatan yang umum digunakan, mencakup metode pengembangan perangkat lunak serta metodologi perancangan antarmuka pengguna. Metodologi pengembangan perangkat lunak menentukan </w:t>
-      </w:r>
-      <w:proofErr w:type="gramStart"/>
-      <w:r>
-        <w:rPr>
-          <w:lang w:val="en-US"/>
-        </w:rPr>
-        <w:t>cara</w:t>
-      </w:r>
-      <w:proofErr w:type="gramEnd"/>
-      <w:r>
-        <w:rPr>
-          <w:lang w:val="en-US"/>
-        </w:rPr>
-        <w:t xml:space="preserve"> bekerja dalam merencanakan, mengimplementasikan, menguji, dan merilis sistem. Di antara metode yang dipertimbangkan adalah </w:t>
+        <w:t xml:space="preserve">lingkungan yang dinamis, maka pendekatan pengembangan yang dipilih tidak bisa statis. Proses pemilihan metodologi dilakukan melalui perbandingan beberapa pendekatan yang umum digunakan, mencakup metode pengembangan perangkat lunak serta metodologi perancangan antarmuka pengguna. Metodologi pengembangan perangkat lunak menentukan cara bekerja dalam merencanakan, mengimplementasikan, menguji, dan merilis sistem. Di antara metode yang dipertimbangkan adalah </w:t>
       </w:r>
       <w:r>
         <w:rPr>
@@ -7253,21 +7544,7 @@
         <w:rPr>
           <w:lang w:val="en-US"/>
         </w:rPr>
-        <w:t xml:space="preserve"> berlangsung, revisi </w:t>
-      </w:r>
-      <w:proofErr w:type="gramStart"/>
-      <w:r>
-        <w:rPr>
-          <w:lang w:val="en-US"/>
-        </w:rPr>
-        <w:t>akan</w:t>
-      </w:r>
-      <w:proofErr w:type="gramEnd"/>
-      <w:r>
-        <w:rPr>
-          <w:lang w:val="en-US"/>
-        </w:rPr>
-        <w:t xml:space="preserve"> memakan waktu karena harus kembali ke langkah awal. Hal ini sangat krusial bagi sistem rumah kaca, di mana kondisi lingkungan dan </w:t>
+        <w:t xml:space="preserve"> berlangsung, revisi akan memakan waktu karena harus kembali ke langkah awal. Hal ini sangat krusial bagi sistem rumah kaca, di mana kondisi lingkungan dan </w:t>
       </w:r>
       <w:r>
         <w:rPr>
@@ -7447,7 +7724,6 @@
         </w:rPr>
         <w:t xml:space="preserve"> memerlukan kemampuan beradaptasi dengan variabel lingkungan, dan </w:t>
       </w:r>
-      <w:proofErr w:type="gramStart"/>
       <w:r>
         <w:rPr>
           <w:i/>
@@ -7455,7 +7731,6 @@
         </w:rPr>
         <w:t>Agile</w:t>
       </w:r>
-      <w:proofErr w:type="gramEnd"/>
       <w:r>
         <w:rPr>
           <w:lang w:val="en-US"/>
@@ -7543,21 +7818,7 @@
         <w:rPr>
           <w:lang w:val="en-US"/>
         </w:rPr>
-        <w:t xml:space="preserve">) adalah langkah penting dalam penelitian ini karena sistem </w:t>
-      </w:r>
-      <w:proofErr w:type="gramStart"/>
-      <w:r>
-        <w:rPr>
-          <w:lang w:val="en-US"/>
-        </w:rPr>
-        <w:t>akan</w:t>
-      </w:r>
-      <w:proofErr w:type="gramEnd"/>
-      <w:r>
-        <w:rPr>
-          <w:lang w:val="en-US"/>
-        </w:rPr>
-        <w:t xml:space="preserve"> digunakan langsung oleh petani hortikultura, yang mungkin tidak terbiasa dengan teknologi canggih. Tujuannya bukan hanya membuat sistem yang berfungsi, tetapi juga yang nyaman, mudah dipelajari, dan membantu pekerjaan mereka. Untuk itu, beberapa pendekatan desain dipertimbangkan tiga metode antara lain </w:t>
+        <w:t xml:space="preserve">) adalah langkah penting dalam penelitian ini karena sistem akan digunakan langsung oleh petani hortikultura, yang mungkin tidak terbiasa dengan teknologi canggih. Tujuannya bukan hanya membuat sistem yang berfungsi, tetapi juga yang nyaman, mudah dipelajari, dan membantu pekerjaan mereka. Untuk itu, beberapa pendekatan desain dipertimbangkan tiga metode antara lain </w:t>
       </w:r>
       <w:r>
         <w:rPr>
@@ -7701,21 +7962,7 @@
         <w:rPr>
           <w:lang w:val="en-US"/>
         </w:rPr>
-        <w:t xml:space="preserve"> dipilih karena paling sesuai dengan konteks penelitian. Sistem rumah kaca ini </w:t>
-      </w:r>
-      <w:proofErr w:type="gramStart"/>
-      <w:r>
-        <w:rPr>
-          <w:lang w:val="en-US"/>
-        </w:rPr>
-        <w:t>akan</w:t>
-      </w:r>
-      <w:proofErr w:type="gramEnd"/>
-      <w:r>
-        <w:rPr>
-          <w:lang w:val="en-US"/>
-        </w:rPr>
-        <w:t xml:space="preserve"> dipakai oleh petani dengan berbagai latar belakang, sehingga keterlibatan mereka sangat penting. Dengan </w:t>
+        <w:t xml:space="preserve"> dipilih karena paling sesuai dengan konteks penelitian. Sistem rumah kaca ini akan dipakai oleh petani dengan berbagai latar belakang, sehingga keterlibatan mereka sangat penting. Dengan </w:t>
       </w:r>
       <w:r>
         <w:rPr>
@@ -8527,21 +8774,7 @@
         <w:rPr>
           <w:lang w:val="en-US"/>
         </w:rPr>
-        <w:t xml:space="preserve">. Ukurannya sangat kecil sekitar 3 </w:t>
-      </w:r>
-      <w:proofErr w:type="gramStart"/>
-      <w:r>
-        <w:rPr>
-          <w:lang w:val="en-US"/>
-        </w:rPr>
-        <w:t>KB ,</w:t>
-      </w:r>
-      <w:proofErr w:type="gramEnd"/>
-      <w:r>
-        <w:rPr>
-          <w:lang w:val="en-US"/>
-        </w:rPr>
-        <w:t xml:space="preserve"> tetapi </w:t>
+        <w:t xml:space="preserve">. Ukurannya sangat kecil sekitar 3 KB , tetapi </w:t>
       </w:r>
       <w:r>
         <w:rPr>
@@ -8710,21 +8943,7 @@
         <w:rPr>
           <w:lang w:val="en-US"/>
         </w:rPr>
-        <w:t xml:space="preserve">, </w:t>
-      </w:r>
-      <w:proofErr w:type="gramStart"/>
-      <w:r>
-        <w:rPr>
-          <w:lang w:val="en-US"/>
-        </w:rPr>
-        <w:t>dan</w:t>
-      </w:r>
-      <w:proofErr w:type="gramEnd"/>
-      <w:r>
-        <w:rPr>
-          <w:lang w:val="en-US"/>
-        </w:rPr>
-        <w:t xml:space="preserve"> </w:t>
+        <w:t xml:space="preserve">, dan </w:t>
       </w:r>
       <w:r>
         <w:rPr>
@@ -8840,21 +9059,7 @@
         <w:rPr>
           <w:lang w:val="en-US"/>
         </w:rPr>
-        <w:t xml:space="preserve"> yang sangat minimalis. Kelebihannya ukuran file sangat kecil, sehingga cepat dimuat, serta tidak memerlukan build process atau konfigurasi rumit. </w:t>
-      </w:r>
-      <w:proofErr w:type="gramStart"/>
-      <w:r>
-        <w:rPr>
-          <w:lang w:val="en-US"/>
-        </w:rPr>
-        <w:t>kekurangannya</w:t>
-      </w:r>
-      <w:proofErr w:type="gramEnd"/>
-      <w:r>
-        <w:rPr>
-          <w:lang w:val="en-US"/>
-        </w:rPr>
-        <w:t xml:space="preserve">, opsi kustomisasi tidak sebanyak </w:t>
+        <w:t xml:space="preserve"> yang sangat minimalis. Kelebihannya ukuran file sangat kecil, sehingga cepat dimuat, serta tidak memerlukan build process atau konfigurasi rumit. kekurangannya, opsi kustomisasi tidak sebanyak </w:t>
       </w:r>
       <w:r>
         <w:rPr>
@@ -9153,21 +9358,7 @@
         <w:rPr>
           <w:lang w:val="en-US"/>
         </w:rPr>
-        <w:t xml:space="preserve"> yang kompleks. Kelemahan utama, terutama pada versi gratisnya adalah batas pengetahuan. Model ini tidak memiliki pengetahuan, data, </w:t>
-      </w:r>
-      <w:proofErr w:type="gramStart"/>
-      <w:r>
-        <w:rPr>
-          <w:lang w:val="en-US"/>
-        </w:rPr>
-        <w:t>atau</w:t>
-      </w:r>
-      <w:proofErr w:type="gramEnd"/>
-      <w:r>
-        <w:rPr>
-          <w:lang w:val="en-US"/>
-        </w:rPr>
-        <w:t xml:space="preserve"> publikasi yang terjadi setelah tanggal pelatihannya. Untuk penelitian yang membutuhkan data terkini, ini merupakan hambatan signifikan. </w:t>
+        <w:t xml:space="preserve"> yang kompleks. Kelemahan utama, terutama pada versi gratisnya adalah batas pengetahuan. Model ini tidak memiliki pengetahuan, data, atau publikasi yang terjadi setelah tanggal pelatihannya. Untuk penelitian yang membutuhkan data terkini, ini merupakan hambatan signifikan. </w:t>
       </w:r>
     </w:p>
     <w:p>
@@ -9430,21 +9621,7 @@
         <w:rPr>
           <w:lang w:val="en-US"/>
         </w:rPr>
-        <w:t xml:space="preserve">, reasoning tingkat lanjut, serta window konteks yang lebih besar, </w:t>
-      </w:r>
-      <w:proofErr w:type="gramStart"/>
-      <w:r>
-        <w:rPr>
-          <w:lang w:val="en-US"/>
-        </w:rPr>
-        <w:t>sehingga</w:t>
-      </w:r>
-      <w:proofErr w:type="gramEnd"/>
-      <w:r>
-        <w:rPr>
-          <w:lang w:val="en-US"/>
-        </w:rPr>
-        <w:t xml:space="preserve"> memungkinkan prompt yang lebih kompleks dan kaya konteks. Keunggulan lain dari </w:t>
+        <w:t xml:space="preserve">, reasoning tingkat lanjut, serta window konteks yang lebih besar, sehingga memungkinkan prompt yang lebih kompleks dan kaya konteks. Keunggulan lain dari </w:t>
       </w:r>
       <w:r>
         <w:rPr>
@@ -9859,21 +10036,7 @@
         <w:rPr>
           <w:lang w:val="en-US"/>
         </w:rPr>
-        <w:t xml:space="preserve"> </w:t>
-      </w:r>
-      <w:proofErr w:type="gramStart"/>
-      <w:r>
-        <w:rPr>
-          <w:lang w:val="en-US"/>
-        </w:rPr>
-        <w:t>akan</w:t>
-      </w:r>
-      <w:proofErr w:type="gramEnd"/>
-      <w:r>
-        <w:rPr>
-          <w:lang w:val="en-US"/>
-        </w:rPr>
-        <w:t xml:space="preserve"> disertai alasan berbasis data sensor. Misalnya, jika </w:t>
+        <w:t xml:space="preserve"> akan disertai alasan berbasis data sensor. Misalnya, jika </w:t>
       </w:r>
       <w:r>
         <w:rPr>
@@ -10642,27 +10805,13 @@
         <w:rPr>
           <w:lang w:val="en-US"/>
         </w:rPr>
-        <w:t xml:space="preserve"> </w:t>
-      </w:r>
-      <w:proofErr w:type="gramStart"/>
-      <w:r>
-        <w:rPr>
-          <w:lang w:val="en-US"/>
-        </w:rPr>
-        <w:t>oleh  p</w:t>
-      </w:r>
-      <w:r>
-        <w:rPr>
-          <w:lang w:val="en-US"/>
-        </w:rPr>
-        <w:t>etani</w:t>
-      </w:r>
-      <w:proofErr w:type="gramEnd"/>
-      <w:r>
-        <w:rPr>
-          <w:lang w:val="en-US"/>
-        </w:rPr>
-        <w:t xml:space="preserve"> yang mencoba sistem, lalu memberikan umpan balik terkait apakah rekomendasi mudah dipahami, apakah dapat membantu mengambil keputusan , dan </w:t>
+        <w:t xml:space="preserve"> oleh  p</w:t>
+      </w:r>
+      <w:r>
+        <w:rPr>
+          <w:lang w:val="en-US"/>
+        </w:rPr>
+        <w:t xml:space="preserve">etani yang mencoba sistem, lalu memberikan umpan balik terkait apakah rekomendasi mudah dipahami, apakah dapat membantu mengambil keputusan , dan </w:t>
       </w:r>
       <w:r>
         <w:rPr>
@@ -10674,21 +10823,7 @@
         <w:rPr>
           <w:lang w:val="en-US"/>
         </w:rPr>
-        <w:t xml:space="preserve">pakah rekomendasi relevan dengan kondisi nyata di lapangan. Data sensor yang </w:t>
-      </w:r>
-      <w:proofErr w:type="gramStart"/>
-      <w:r>
-        <w:rPr>
-          <w:lang w:val="en-US"/>
-        </w:rPr>
-        <w:t>sama</w:t>
-      </w:r>
-      <w:proofErr w:type="gramEnd"/>
-      <w:r>
-        <w:rPr>
-          <w:lang w:val="en-US"/>
-        </w:rPr>
-        <w:t xml:space="preserve"> dikirim beberapa kali, lalu diperiksa apakah </w:t>
+        <w:t xml:space="preserve">pakah rekomendasi relevan dengan kondisi nyata di lapangan. Data sensor yang sama dikirim beberapa kali, lalu diperiksa apakah </w:t>
       </w:r>
       <w:r>
         <w:rPr>
@@ -10792,21 +10927,7 @@
         <w:rPr>
           <w:lang w:val="en-US"/>
         </w:rPr>
-        <w:t xml:space="preserve">Beberapa jurnal penelitian yang terkait dengan penelitian yang </w:t>
-      </w:r>
-      <w:proofErr w:type="gramStart"/>
-      <w:r>
-        <w:rPr>
-          <w:lang w:val="en-US"/>
-        </w:rPr>
-        <w:t>akan</w:t>
-      </w:r>
-      <w:proofErr w:type="gramEnd"/>
-      <w:r>
-        <w:rPr>
-          <w:lang w:val="en-US"/>
-        </w:rPr>
-        <w:t xml:space="preserve"> dilaksanakan penulis dapat dilihat pada tabel berikut.</w:t>
+        <w:t>Beberapa jurnal penelitian yang terkait dengan penelitian yang akan dilaksanakan penulis dapat dilihat pada tabel berikut.</w:t>
       </w:r>
     </w:p>
     <w:p>
@@ -11903,21 +12024,7 @@
         <w:rPr>
           <w:lang w:val="en-US"/>
         </w:rPr>
-        <w:t xml:space="preserve"> untuk interaksi berbasis </w:t>
-      </w:r>
-      <w:proofErr w:type="gramStart"/>
-      <w:r>
-        <w:rPr>
-          <w:lang w:val="en-US"/>
-        </w:rPr>
-        <w:t>tanya</w:t>
-      </w:r>
-      <w:proofErr w:type="gramEnd"/>
-      <w:r>
-        <w:rPr>
-          <w:lang w:val="en-US"/>
-        </w:rPr>
-        <w:t xml:space="preserve"> </w:t>
+        <w:t xml:space="preserve"> untuk interaksi berbasis tanya </w:t>
       </w:r>
       <w:r>
         <w:rPr>
@@ -12056,7 +12163,6 @@
         </w:rPr>
         <w:t xml:space="preserve"> bulan dengan tahapan yang sistematis sesuai metode </w:t>
       </w:r>
-      <w:proofErr w:type="gramStart"/>
       <w:r>
         <w:rPr>
           <w:i/>
@@ -12064,7 +12170,6 @@
         </w:rPr>
         <w:t>Agile</w:t>
       </w:r>
-      <w:proofErr w:type="gramEnd"/>
       <w:r>
         <w:rPr>
           <w:lang w:val="en-US"/>
@@ -13786,23 +13891,8 @@
         <w:rPr>
           <w:lang w:val="en-US"/>
         </w:rPr>
-        <w:t xml:space="preserve">Lokasi penelitian ditetapkan di Pancasari, Kabupaten Buleleng, Bali, yang merupakan salah satu daerah sentra hortikultura. Pemilihan lokasi ini didasarkan pada kondisi geografis dan iklim Pancasari yang mendukung kegiatan pertanian rumah kaca, namun tetap menghadapi tantangan terkait cuaca, serangan </w:t>
-      </w:r>
-      <w:proofErr w:type="gramStart"/>
-      <w:r>
-        <w:rPr>
-          <w:lang w:val="en-US"/>
-        </w:rPr>
-        <w:t>hama</w:t>
-      </w:r>
-      <w:proofErr w:type="gramEnd"/>
-      <w:r>
-        <w:rPr>
-          <w:lang w:val="en-US"/>
-        </w:rPr>
-        <w:t xml:space="preserve">, serta keterbatasan sumber daya. Alur penelitian disusun mengikuti kerangka </w:t>
-      </w:r>
-      <w:proofErr w:type="gramStart"/>
+        <w:t xml:space="preserve">Lokasi penelitian ditetapkan di Pancasari, Kabupaten Buleleng, Bali, yang merupakan salah satu daerah sentra hortikultura. Pemilihan lokasi ini didasarkan pada kondisi geografis dan iklim Pancasari yang mendukung kegiatan pertanian rumah kaca, namun tetap menghadapi tantangan terkait cuaca, serangan hama, serta keterbatasan sumber daya. Alur penelitian disusun mengikuti kerangka </w:t>
+      </w:r>
       <w:r>
         <w:rPr>
           <w:i/>
@@ -13810,7 +13900,6 @@
         </w:rPr>
         <w:t>Agile</w:t>
       </w:r>
-      <w:proofErr w:type="gramEnd"/>
       <w:r>
         <w:rPr>
           <w:lang w:val="en-US"/>
@@ -13931,12 +14020,21 @@
         <w:t>3.</w:t>
       </w:r>
       <w:r>
+        <w:rPr>
+          <w:noProof/>
+        </w:rPr>
         <w:fldChar w:fldCharType="begin"/>
       </w:r>
       <w:r>
+        <w:rPr>
+          <w:noProof/>
+        </w:rPr>
         <w:instrText xml:space="preserve"> SEQ Gambar \* ARABIC </w:instrText>
       </w:r>
       <w:r>
+        <w:rPr>
+          <w:noProof/>
+        </w:rPr>
         <w:fldChar w:fldCharType="separate"/>
       </w:r>
       <w:r>
@@ -13946,6 +14044,9 @@
         <w:t>1</w:t>
       </w:r>
       <w:r>
+        <w:rPr>
+          <w:noProof/>
+        </w:rPr>
         <w:fldChar w:fldCharType="end"/>
       </w:r>
       <w:r>
@@ -14236,14 +14337,36 @@
         </w:rPr>
         <w:t>3.</w:t>
       </w:r>
-      <w:fldSimple w:instr=" SEQ Gambar \* ARABIC ">
-        <w:r>
-          <w:rPr>
-            <w:noProof/>
-          </w:rPr>
-          <w:t>2</w:t>
-        </w:r>
-      </w:fldSimple>
+      <w:r>
+        <w:rPr>
+          <w:noProof/>
+        </w:rPr>
+        <w:fldChar w:fldCharType="begin"/>
+      </w:r>
+      <w:r>
+        <w:rPr>
+          <w:noProof/>
+        </w:rPr>
+        <w:instrText xml:space="preserve"> SEQ Gambar \* ARABIC </w:instrText>
+      </w:r>
+      <w:r>
+        <w:rPr>
+          <w:noProof/>
+        </w:rPr>
+        <w:fldChar w:fldCharType="separate"/>
+      </w:r>
+      <w:r>
+        <w:rPr>
+          <w:noProof/>
+        </w:rPr>
+        <w:t>2</w:t>
+      </w:r>
+      <w:r>
+        <w:rPr>
+          <w:noProof/>
+        </w:rPr>
+        <w:fldChar w:fldCharType="end"/>
+      </w:r>
       <w:r>
         <w:t xml:space="preserve">. </w:t>
       </w:r>
@@ -14701,21 +14824,7 @@
         <w:rPr>
           <w:lang w:val="en-US"/>
         </w:rPr>
-        <w:t xml:space="preserve"> sensor </w:t>
-      </w:r>
-      <w:proofErr w:type="gramStart"/>
-      <w:r>
-        <w:rPr>
-          <w:lang w:val="en-US"/>
-        </w:rPr>
-        <w:t>akan</w:t>
-      </w:r>
-      <w:proofErr w:type="gramEnd"/>
-      <w:r>
-        <w:rPr>
-          <w:lang w:val="en-US"/>
-        </w:rPr>
-        <w:t xml:space="preserve"> mengukur parameter lingkungan rumah kaca. Data sensor inilah yang menjadi dasar bagi keseluruhan sistem untuk memberikan rekomendasi pengelolaan rumah kaca. </w:t>
+        <w:t xml:space="preserve"> sensor akan mengukur parameter lingkungan rumah kaca. Data sensor inilah yang menjadi dasar bagi keseluruhan sistem untuk memberikan rekomendasi pengelolaan rumah kaca. </w:t>
       </w:r>
       <w:r>
         <w:rPr>
@@ -14915,21 +15024,7 @@
         <w:rPr>
           <w:lang w:val="en-US"/>
         </w:rPr>
-        <w:t xml:space="preserve">ada penelitian ini </w:t>
-      </w:r>
-      <w:proofErr w:type="gramStart"/>
-      <w:r>
-        <w:rPr>
-          <w:lang w:val="en-US"/>
-        </w:rPr>
-        <w:t>akan</w:t>
-      </w:r>
-      <w:proofErr w:type="gramEnd"/>
-      <w:r>
-        <w:rPr>
-          <w:lang w:val="en-US"/>
-        </w:rPr>
-        <w:t xml:space="preserve"> difokuskan hanya untuk pembuatan antarmuka (</w:t>
+        <w:t>ada penelitian ini akan difokuskan hanya untuk pembuatan antarmuka (</w:t>
       </w:r>
       <w:r>
         <w:rPr>
@@ -15027,21 +15122,7 @@
         <w:rPr>
           <w:lang w:val="en-US"/>
         </w:rPr>
-        <w:t xml:space="preserve">Tata </w:t>
-      </w:r>
-      <w:proofErr w:type="gramStart"/>
-      <w:r>
-        <w:rPr>
-          <w:lang w:val="en-US"/>
-        </w:rPr>
-        <w:t>cara</w:t>
-      </w:r>
-      <w:proofErr w:type="gramEnd"/>
-      <w:r>
-        <w:rPr>
-          <w:lang w:val="en-US"/>
-        </w:rPr>
-        <w:t xml:space="preserve"> implementasi solusi pada penelitian ini dirancang mengikuti kerangka metodologi </w:t>
+        <w:t xml:space="preserve">Tata cara implementasi solusi pada penelitian ini dirancang mengikuti kerangka metodologi </w:t>
       </w:r>
       <w:r>
         <w:rPr>
@@ -15581,7 +15662,6 @@
         </w:rPr>
         <w:t xml:space="preserve">, sesuai dengan prinsip iteratif </w:t>
       </w:r>
-      <w:proofErr w:type="gramStart"/>
       <w:r>
         <w:rPr>
           <w:rFonts w:ascii="Arial" w:hAnsi="Arial" w:cs="Arial"/>
@@ -15592,7 +15672,6 @@
         </w:rPr>
         <w:t>Agile</w:t>
       </w:r>
-      <w:proofErr w:type="gramEnd"/>
       <w:r>
         <w:rPr>
           <w:rFonts w:ascii="Arial" w:hAnsi="Arial" w:cs="Arial"/>
@@ -15784,12 +15863,21 @@
         <w:t>3.</w:t>
       </w:r>
       <w:r>
+        <w:rPr>
+          <w:noProof/>
+        </w:rPr>
         <w:fldChar w:fldCharType="begin"/>
       </w:r>
       <w:r>
+        <w:rPr>
+          <w:noProof/>
+        </w:rPr>
         <w:instrText xml:space="preserve"> SEQ Tabel \* ARABIC </w:instrText>
       </w:r>
       <w:r>
+        <w:rPr>
+          <w:noProof/>
+        </w:rPr>
         <w:fldChar w:fldCharType="separate"/>
       </w:r>
       <w:r>
@@ -15799,6 +15887,9 @@
         <w:t>2</w:t>
       </w:r>
       <w:r>
+        <w:rPr>
+          <w:noProof/>
+        </w:rPr>
         <w:fldChar w:fldCharType="end"/>
       </w:r>
       <w:r>
@@ -16739,25 +16830,7 @@
           <w:color w:val="000000"/>
           <w:lang w:val="en-US"/>
         </w:rPr>
-        <w:t xml:space="preserve"> </w:t>
-      </w:r>
-      <w:proofErr w:type="gramStart"/>
-      <w:r>
-        <w:rPr>
-          <w:rFonts w:cs="Arial"/>
-          <w:color w:val="000000"/>
-          <w:lang w:val="en-US"/>
-        </w:rPr>
-        <w:t>akan</w:t>
-      </w:r>
-      <w:proofErr w:type="gramEnd"/>
-      <w:r>
-        <w:rPr>
-          <w:rFonts w:cs="Arial"/>
-          <w:color w:val="000000"/>
-          <w:lang w:val="en-US"/>
-        </w:rPr>
-        <w:t xml:space="preserve"> diformat ke dalam bentuk teks, seperti: “</w:t>
+        <w:t xml:space="preserve"> akan diformat ke dalam bentuk teks, seperti: “</w:t>
       </w:r>
       <w:r>
         <w:rPr>
@@ -16766,19 +16839,18 @@
           <w:color w:val="000000"/>
           <w:lang w:val="en-US"/>
         </w:rPr>
-        <w:t xml:space="preserve">Saya membaca power sensor di rumah kaca saya menunjukan angka 58 hertz 280 volt. Saya menyalakan beban sebuah pompa listrik bermerek </w:t>
-      </w:r>
-      <w:proofErr w:type="gramStart"/>
+        <w:t xml:space="preserve">Saya membaca power sensor di rumah kaca saya menunjukan angka 58 hertz 280 volt. Saya menyalakan beban sebuah pompa listrik bermerek shimizu 300 watt untuk menyiram tanaman tomat yang berumur 3 bulan setelah tanam. Sistem pengairan menggunakan sistem tetes dengan pupuk A B </w:t>
+      </w:r>
       <w:r>
         <w:rPr>
           <w:rFonts w:cs="Arial"/>
           <w:b/>
-          <w:color w:val="000000"/>
-          <w:lang w:val="en-US"/>
-        </w:rPr>
-        <w:t>shimizu</w:t>
-      </w:r>
-      <w:proofErr w:type="gramEnd"/>
+          <w:i/>
+          <w:color w:val="000000"/>
+          <w:lang w:val="en-US"/>
+        </w:rPr>
+        <w:t>Mix</w:t>
+      </w:r>
       <w:r>
         <w:rPr>
           <w:rFonts w:cs="Arial"/>
@@ -16786,25 +16858,6 @@
           <w:color w:val="000000"/>
           <w:lang w:val="en-US"/>
         </w:rPr>
-        <w:t xml:space="preserve"> 300 watt untuk menyiram tanaman tomat yang berumur 3 bulan setelah tanam. Sistem pengairan menggunakan sistem tetes dengan pupuk A B </w:t>
-      </w:r>
-      <w:r>
-        <w:rPr>
-          <w:rFonts w:cs="Arial"/>
-          <w:b/>
-          <w:i/>
-          <w:color w:val="000000"/>
-          <w:lang w:val="en-US"/>
-        </w:rPr>
-        <w:t>Mix</w:t>
-      </w:r>
-      <w:r>
-        <w:rPr>
-          <w:rFonts w:cs="Arial"/>
-          <w:b/>
-          <w:color w:val="000000"/>
-          <w:lang w:val="en-US"/>
-        </w:rPr>
         <w:t>. Power sensor juga menunjukan nilai beban sebesar 380 watt ketika pompa dinyalakan. Buatkan saya analisis kesehatan sumber listrik dan kesehatan instrumen dan instalasi pengairan saya, serta tindakan apa yang harus dilakukan</w:t>
       </w:r>
       <w:r>
@@ -16898,25 +16951,7 @@
           <w:color w:val="000000"/>
           <w:lang w:val="en-US"/>
         </w:rPr>
-        <w:t xml:space="preserve"> dalam format bahasa sehari hari, </w:t>
-      </w:r>
-      <w:proofErr w:type="gramStart"/>
-      <w:r>
-        <w:rPr>
-          <w:rFonts w:cs="Arial"/>
-          <w:color w:val="000000"/>
-          <w:lang w:val="en-US"/>
-        </w:rPr>
-        <w:t>seperti</w:t>
-      </w:r>
-      <w:proofErr w:type="gramEnd"/>
-      <w:r>
-        <w:rPr>
-          <w:rFonts w:cs="Arial"/>
-          <w:color w:val="000000"/>
-          <w:lang w:val="en-US"/>
-        </w:rPr>
-        <w:t xml:space="preserve"> rekomendasi untuk mematikan pompa air karena tegangan yang tidak normal. Hasil ini kemudian dikirim kembali ke antarmuka agar dapat dibaca oleh pengguna secara </w:t>
+        <w:t xml:space="preserve"> dalam format bahasa sehari hari, seperti rekomendasi untuk mematikan pompa air karena tegangan yang tidak normal. Hasil ini kemudian dikirim kembali ke antarmuka agar dapat dibaca oleh pengguna secara </w:t>
       </w:r>
       <w:r>
         <w:rPr>
@@ -17792,12 +17827,21 @@
         <w:t>3.</w:t>
       </w:r>
       <w:r>
+        <w:rPr>
+          <w:noProof/>
+        </w:rPr>
         <w:fldChar w:fldCharType="begin"/>
       </w:r>
       <w:r>
+        <w:rPr>
+          <w:noProof/>
+        </w:rPr>
         <w:instrText xml:space="preserve"> SEQ Tabel \* ARABIC </w:instrText>
       </w:r>
       <w:r>
+        <w:rPr>
+          <w:noProof/>
+        </w:rPr>
         <w:fldChar w:fldCharType="separate"/>
       </w:r>
       <w:r>
@@ -17807,6 +17851,9 @@
         <w:t>3</w:t>
       </w:r>
       <w:r>
+        <w:rPr>
+          <w:noProof/>
+        </w:rPr>
         <w:fldChar w:fldCharType="end"/>
       </w:r>
       <w:r>
@@ -18309,12 +18356,21 @@
         <w:t>3.</w:t>
       </w:r>
       <w:r>
+        <w:rPr>
+          <w:noProof/>
+        </w:rPr>
         <w:fldChar w:fldCharType="begin"/>
       </w:r>
       <w:r>
+        <w:rPr>
+          <w:noProof/>
+        </w:rPr>
         <w:instrText xml:space="preserve"> SEQ Tabel \* ARABIC </w:instrText>
       </w:r>
       <w:r>
+        <w:rPr>
+          <w:noProof/>
+        </w:rPr>
         <w:fldChar w:fldCharType="separate"/>
       </w:r>
       <w:r>
@@ -18324,6 +18380,9 @@
         <w:t>4</w:t>
       </w:r>
       <w:r>
+        <w:rPr>
+          <w:noProof/>
+        </w:rPr>
         <w:fldChar w:fldCharType="end"/>
       </w:r>
       <w:r>
@@ -19698,14 +19757,36 @@
         </w:rPr>
         <w:t>3.</w:t>
       </w:r>
-      <w:fldSimple w:instr=" SEQ Tabel \* ARABIC ">
-        <w:r>
-          <w:rPr>
-            <w:noProof/>
-          </w:rPr>
-          <w:t>5</w:t>
-        </w:r>
-      </w:fldSimple>
+      <w:r>
+        <w:rPr>
+          <w:noProof/>
+        </w:rPr>
+        <w:fldChar w:fldCharType="begin"/>
+      </w:r>
+      <w:r>
+        <w:rPr>
+          <w:noProof/>
+        </w:rPr>
+        <w:instrText xml:space="preserve"> SEQ Tabel \* ARABIC </w:instrText>
+      </w:r>
+      <w:r>
+        <w:rPr>
+          <w:noProof/>
+        </w:rPr>
+        <w:fldChar w:fldCharType="separate"/>
+      </w:r>
+      <w:r>
+        <w:rPr>
+          <w:noProof/>
+        </w:rPr>
+        <w:t>5</w:t>
+      </w:r>
+      <w:r>
+        <w:rPr>
+          <w:noProof/>
+        </w:rPr>
+        <w:fldChar w:fldCharType="end"/>
+      </w:r>
       <w:r>
         <w:t xml:space="preserve">. </w:t>
       </w:r>
@@ -19912,6 +19993,77 @@
           <w:lang w:val="en-US"/>
         </w:rPr>
         <w:t xml:space="preserve">: </w:t>
+      </w:r>
+    </w:p>
+    <w:p>
+      <w:pPr>
+        <w:pStyle w:val="ListParagraph"/>
+        <w:numPr>
+          <w:ilvl w:val="0"/>
+          <w:numId w:val="0"/>
+        </w:numPr>
+        <w:spacing w:before="240" w:after="200"/>
+        <w:ind w:left="720"/>
+        <w:jc w:val="center"/>
+        <w:rPr>
+          <w:rFonts w:eastAsiaTheme="minorEastAsia" w:cs="Arial"/>
+          <w:lang w:val="en-US"/>
+        </w:rPr>
+      </w:pPr>
+      <m:oMath>
+        <m:f>
+          <m:fPr>
+            <m:ctrlPr>
+              <w:rPr>
+                <w:rFonts w:ascii="Cambria Math" w:hAnsi="Cambria Math"/>
+              </w:rPr>
+            </m:ctrlPr>
+          </m:fPr>
+          <m:num>
+            <m:r>
+              <m:rPr>
+                <m:sty m:val="p"/>
+              </m:rPr>
+              <w:rPr>
+                <w:rFonts w:ascii="Cambria Math" w:hAnsi="Cambria Math"/>
+              </w:rPr>
+              <m:t>n</m:t>
+            </m:r>
+          </m:num>
+          <m:den>
+            <m:r>
+              <m:rPr>
+                <m:sty m:val="p"/>
+              </m:rPr>
+              <w:rPr>
+                <w:rFonts w:ascii="Cambria Math" w:hAnsi="Cambria Math"/>
+              </w:rPr>
+              <m:t>m</m:t>
+            </m:r>
+          </m:den>
+        </m:f>
+        <m:r>
+          <m:rPr>
+            <m:sty m:val="p"/>
+          </m:rPr>
+          <w:rPr>
+            <w:rFonts w:ascii="Cambria Math" w:hAnsi="Cambria Math"/>
+          </w:rPr>
+          <m:t xml:space="preserve">* 100% = x% </m:t>
+        </m:r>
+      </m:oMath>
+      <w:r>
+        <w:rPr>
+          <w:rFonts w:eastAsiaTheme="minorEastAsia" w:cs="Arial"/>
+        </w:rPr>
+        <w:tab/>
+      </w:r>
+      <w:r>
+        <w:rPr>
+          <w:rFonts w:eastAsiaTheme="minorEastAsia" w:cs="Arial"/>
+          <w:lang w:val="en-US"/>
+        </w:rPr>
+        <w:t>(1)</w:t>
       </w:r>
     </w:p>
     <w:p>
@@ -19926,92 +20078,15 @@
         <w:jc w:val="both"/>
         <w:rPr>
           <w:rFonts w:eastAsiaTheme="minorEastAsia" w:cs="Arial"/>
-        </w:rPr>
-      </w:pPr>
-      <m:oMathPara>
-        <m:oMath>
-          <m:f>
-            <m:fPr>
-              <m:ctrlPr>
-                <w:rPr>
-                  <w:rFonts w:ascii="Cambria Math" w:hAnsi="Cambria Math"/>
-                </w:rPr>
-              </m:ctrlPr>
-            </m:fPr>
-            <m:num>
-              <m:r>
-                <m:rPr>
-                  <m:sty m:val="p"/>
-                </m:rPr>
-                <w:rPr>
-                  <w:rFonts w:ascii="Cambria Math" w:hAnsi="Cambria Math"/>
-                </w:rPr>
-                <m:t>n</m:t>
-              </m:r>
-            </m:num>
-            <m:den>
-              <m:r>
-                <m:rPr>
-                  <m:sty m:val="p"/>
-                </m:rPr>
-                <w:rPr>
-                  <w:rFonts w:ascii="Cambria Math" w:hAnsi="Cambria Math"/>
-                </w:rPr>
-                <m:t>m</m:t>
-              </m:r>
-            </m:den>
-          </m:f>
-          <m:r>
-            <m:rPr>
-              <m:sty m:val="p"/>
-            </m:rPr>
-            <w:rPr>
-              <w:rFonts w:ascii="Cambria Math" w:hAnsi="Cambria Math"/>
-            </w:rPr>
-            <m:t>* 100% = x%</m:t>
-          </m:r>
-          <m:r>
-            <m:rPr>
-              <m:sty m:val="p"/>
-            </m:rPr>
-            <w:rPr>
-              <w:rFonts w:ascii="Cambria Math" w:hAnsi="Cambria Math"/>
-            </w:rPr>
-            <m:t xml:space="preserve"> </m:t>
-          </m:r>
-        </m:oMath>
-      </m:oMathPara>
-    </w:p>
-    <w:p>
-      <w:pPr>
-        <w:pStyle w:val="ListParagraph"/>
-        <w:numPr>
-          <w:ilvl w:val="0"/>
-          <w:numId w:val="0"/>
-        </w:numPr>
-        <w:spacing w:before="240" w:after="200"/>
-        <w:ind w:left="720"/>
-        <w:jc w:val="both"/>
-        <w:rPr>
-          <w:rFonts w:eastAsiaTheme="minorEastAsia" w:cs="Arial"/>
-          <w:lang w:val="en-US"/>
-        </w:rPr>
-      </w:pPr>
-      <w:proofErr w:type="gramStart"/>
-      <w:r>
-        <w:rPr>
-          <w:rFonts w:cs="Arial"/>
-          <w:lang w:val="en-US"/>
-        </w:rPr>
-        <w:t>yang</w:t>
-      </w:r>
-      <w:proofErr w:type="gramEnd"/>
-      <w:r>
-        <w:rPr>
-          <w:rFonts w:cs="Arial"/>
-          <w:lang w:val="en-US"/>
-        </w:rPr>
-        <w:t xml:space="preserve"> dimana </w:t>
+          <w:lang w:val="en-US"/>
+        </w:rPr>
+      </w:pPr>
+      <w:r>
+        <w:rPr>
+          <w:rFonts w:cs="Arial"/>
+          <w:lang w:val="en-US"/>
+        </w:rPr>
+        <w:t xml:space="preserve">yang dimana </w:t>
       </w:r>
       <w:r>
         <w:rPr>
@@ -21493,7 +21568,7 @@
           <w:rPr>
             <w:noProof/>
           </w:rPr>
-          <w:t>iii</w:t>
+          <w:t>iv</w:t>
         </w:r>
         <w:r>
           <w:rPr>
@@ -21609,7 +21684,7 @@
           <w:rPr>
             <w:noProof/>
           </w:rPr>
-          <w:t>25</w:t>
+          <w:t>27</w:t>
         </w:r>
         <w:r>
           <w:rPr>
@@ -22927,544 +23002,6 @@
 </w:styles>
 </file>
 
-<file path=word/glossary/document.xml><?xml version="1.0" encoding="utf-8"?>
-<w:glossaryDocument xmlns:wpc="http://schemas.microsoft.com/office/word/2010/wordprocessingCanvas" xmlns:mc="http://schemas.openxmlformats.org/markup-compatibility/2006" xmlns:o="urn:schemas-microsoft-com:office:office" xmlns:r="http://schemas.openxmlformats.org/officeDocument/2006/relationships" xmlns:m="http://schemas.openxmlformats.org/officeDocument/2006/math" xmlns:v="urn:schemas-microsoft-com:vml" xmlns:wp14="http://schemas.microsoft.com/office/word/2010/wordprocessingDrawing" xmlns:wp="http://schemas.openxmlformats.org/drawingml/2006/wordprocessingDrawing" xmlns:w10="urn:schemas-microsoft-com:office:word" xmlns:w="http://schemas.openxmlformats.org/wordprocessingml/2006/main" xmlns:w14="http://schemas.microsoft.com/office/word/2010/wordml" xmlns:w15="http://schemas.microsoft.com/office/word/2012/wordml" xmlns:wpg="http://schemas.microsoft.com/office/word/2010/wordprocessingGroup" xmlns:wpi="http://schemas.microsoft.com/office/word/2010/wordprocessingInk" xmlns:wne="http://schemas.microsoft.com/office/word/2006/wordml" xmlns:wps="http://schemas.microsoft.com/office/word/2010/wordprocessingShape" mc:Ignorable="w14 w15 wp14"/>
-</file>
-
-<file path=word/glossary/fontTable.xml><?xml version="1.0" encoding="utf-8"?>
-<w:fonts xmlns:mc="http://schemas.openxmlformats.org/markup-compatibility/2006" xmlns:r="http://schemas.openxmlformats.org/officeDocument/2006/relationships" xmlns:w="http://schemas.openxmlformats.org/wordprocessingml/2006/main" xmlns:w14="http://schemas.microsoft.com/office/word/2010/wordml" xmlns:w15="http://schemas.microsoft.com/office/word/2012/wordml" mc:Ignorable="w14 w15">
-  <w:font w:name="Times New Roman">
-    <w:panose1 w:val="02020603050405020304"/>
-    <w:charset w:val="00"/>
-    <w:family w:val="roman"/>
-    <w:pitch w:val="variable"/>
-    <w:sig w:usb0="E0002EFF" w:usb1="C000785B" w:usb2="00000009" w:usb3="00000000" w:csb0="000001FF" w:csb1="00000000"/>
-  </w:font>
-  <w:font w:name="Calibri">
-    <w:panose1 w:val="020F0502020204030204"/>
-    <w:charset w:val="00"/>
-    <w:family w:val="swiss"/>
-    <w:pitch w:val="variable"/>
-    <w:sig w:usb0="E4002EFF" w:usb1="C200247B" w:usb2="00000009" w:usb3="00000000" w:csb0="000001FF" w:csb1="00000000"/>
-  </w:font>
-  <w:font w:name="Arial">
-    <w:panose1 w:val="020B0604020202020204"/>
-    <w:charset w:val="00"/>
-    <w:family w:val="swiss"/>
-    <w:pitch w:val="variable"/>
-    <w:sig w:usb0="E0002EFF" w:usb1="C000785B" w:usb2="00000009" w:usb3="00000000" w:csb0="000001FF" w:csb1="00000000"/>
-  </w:font>
-  <w:font w:name="Tahoma">
-    <w:panose1 w:val="020B0604030504040204"/>
-    <w:charset w:val="00"/>
-    <w:family w:val="swiss"/>
-    <w:pitch w:val="variable"/>
-    <w:sig w:usb0="E1002EFF" w:usb1="C000605B" w:usb2="00000029" w:usb3="00000000" w:csb0="000101FF" w:csb1="00000000"/>
-  </w:font>
-  <w:font w:name="Cambria">
-    <w:panose1 w:val="02040503050406030204"/>
-    <w:charset w:val="00"/>
-    <w:family w:val="roman"/>
-    <w:pitch w:val="variable"/>
-    <w:sig w:usb0="E00006FF" w:usb1="420024FF" w:usb2="02000000" w:usb3="00000000" w:csb0="0000019F" w:csb1="00000000"/>
-  </w:font>
-  <w:font w:name="Cambria Math">
-    <w:panose1 w:val="02040503050406030204"/>
-    <w:charset w:val="00"/>
-    <w:family w:val="roman"/>
-    <w:pitch w:val="variable"/>
-    <w:sig w:usb0="E00006FF" w:usb1="420024FF" w:usb2="02000000" w:usb3="00000000" w:csb0="0000019F" w:csb1="00000000"/>
-  </w:font>
-  <w:font w:name="Calibri Light">
-    <w:panose1 w:val="020F0302020204030204"/>
-    <w:charset w:val="00"/>
-    <w:family w:val="swiss"/>
-    <w:pitch w:val="variable"/>
-    <w:sig w:usb0="E4002EFF" w:usb1="C200247B" w:usb2="00000009" w:usb3="00000000" w:csb0="000001FF" w:csb1="00000000"/>
-  </w:font>
-</w:fonts>
-</file>
-
-<file path=word/glossary/settings.xml><?xml version="1.0" encoding="utf-8"?>
-<w:settings xmlns:mc="http://schemas.openxmlformats.org/markup-compatibility/2006" xmlns:o="urn:schemas-microsoft-com:office:office" xmlns:r="http://schemas.openxmlformats.org/officeDocument/2006/relationships" xmlns:m="http://schemas.openxmlformats.org/officeDocument/2006/math" xmlns:v="urn:schemas-microsoft-com:vml" xmlns:w10="urn:schemas-microsoft-com:office:word" xmlns:w="http://schemas.openxmlformats.org/wordprocessingml/2006/main" xmlns:w14="http://schemas.microsoft.com/office/word/2010/wordml" xmlns:w15="http://schemas.microsoft.com/office/word/2012/wordml" xmlns:sl="http://schemas.openxmlformats.org/schemaLibrary/2006/main" mc:Ignorable="w14 w15">
-  <w:view w:val="normal"/>
-  <w:defaultTabStop w:val="720"/>
-  <w:characterSpacingControl w:val="doNotCompress"/>
-  <w:compat>
-    <w:useFELayout/>
-    <w:compatSetting w:name="compatibilityMode" w:uri="http://schemas.microsoft.com/office/word" w:val="15"/>
-    <w:compatSetting w:name="overrideTableStyleFontSizeAndJustification" w:uri="http://schemas.microsoft.com/office/word" w:val="1"/>
-    <w:compatSetting w:name="enableOpenTypeFeatures" w:uri="http://schemas.microsoft.com/office/word" w:val="1"/>
-    <w:compatSetting w:name="doNotFlipMirrorIndents" w:uri="http://schemas.microsoft.com/office/word" w:val="1"/>
-    <w:compatSetting w:name="differentiateMultirowTableHeaders" w:uri="http://schemas.microsoft.com/office/word" w:val="1"/>
-  </w:compat>
-  <w:rsids>
-    <w:rsidRoot w:val="00B33CA7"/>
-    <w:rsid w:val="00324582"/>
-    <w:rsid w:val="00B33CA7"/>
-  </w:rsids>
-  <m:mathPr>
-    <m:mathFont m:val="Cambria Math"/>
-    <m:brkBin m:val="before"/>
-    <m:brkBinSub m:val="--"/>
-    <m:smallFrac m:val="0"/>
-    <m:dispDef/>
-    <m:lMargin m:val="0"/>
-    <m:rMargin m:val="0"/>
-    <m:defJc m:val="centerGroup"/>
-    <m:wrapIndent m:val="1440"/>
-    <m:intLim m:val="subSup"/>
-    <m:naryLim m:val="undOvr"/>
-  </m:mathPr>
-  <w:themeFontLang w:val="en-US"/>
-  <w:clrSchemeMapping w:bg1="light1" w:t1="dark1" w:bg2="light2" w:t2="dark2" w:accent1="accent1" w:accent2="accent2" w:accent3="accent3" w:accent4="accent4" w:accent5="accent5" w:accent6="accent6" w:hyperlink="hyperlink" w:followedHyperlink="followedHyperlink"/>
-  <w:decimalSymbol w:val="."/>
-  <w:listSeparator w:val=","/>
-  <w15:chartTrackingRefBased/>
-</w:settings>
-</file>
-
-<file path=word/glossary/styles.xml><?xml version="1.0" encoding="utf-8"?>
-<w:styles xmlns:mc="http://schemas.openxmlformats.org/markup-compatibility/2006" xmlns:r="http://schemas.openxmlformats.org/officeDocument/2006/relationships" xmlns:w="http://schemas.openxmlformats.org/wordprocessingml/2006/main" xmlns:w14="http://schemas.microsoft.com/office/word/2010/wordml" xmlns:w15="http://schemas.microsoft.com/office/word/2012/wordml" mc:Ignorable="w14 w15">
-  <w:docDefaults>
-    <w:rPrDefault>
-      <w:rPr>
-        <w:rFonts w:asciiTheme="minorHAnsi" w:eastAsiaTheme="minorEastAsia" w:hAnsiTheme="minorHAnsi" w:cstheme="minorBidi"/>
-        <w:sz w:val="22"/>
-        <w:szCs w:val="22"/>
-        <w:lang w:val="en-US" w:eastAsia="en-US" w:bidi="ar-SA"/>
-      </w:rPr>
-    </w:rPrDefault>
-    <w:pPrDefault>
-      <w:pPr>
-        <w:spacing w:after="160" w:line="259" w:lineRule="auto"/>
-      </w:pPr>
-    </w:pPrDefault>
-  </w:docDefaults>
-  <w:latentStyles w:defLockedState="0" w:defUIPriority="99" w:defSemiHidden="0" w:defUnhideWhenUsed="0" w:defQFormat="0" w:count="371">
-    <w:lsdException w:name="Normal" w:uiPriority="0" w:qFormat="1"/>
-    <w:lsdException w:name="heading 1" w:uiPriority="9" w:qFormat="1"/>
-    <w:lsdException w:name="heading 2" w:semiHidden="1" w:uiPriority="9" w:unhideWhenUsed="1" w:qFormat="1"/>
-    <w:lsdException w:name="heading 3" w:semiHidden="1" w:uiPriority="9" w:unhideWhenUsed="1" w:qFormat="1"/>
-    <w:lsdException w:name="heading 4" w:semiHidden="1" w:uiPriority="9" w:unhideWhenUsed="1" w:qFormat="1"/>
-    <w:lsdException w:name="heading 5" w:semiHidden="1" w:uiPriority="9" w:unhideWhenUsed="1" w:qFormat="1"/>
-    <w:lsdException w:name="heading 6" w:semiHidden="1" w:uiPriority="9" w:unhideWhenUsed="1" w:qFormat="1"/>
-    <w:lsdException w:name="heading 7" w:semiHidden="1" w:uiPriority="9" w:unhideWhenUsed="1" w:qFormat="1"/>
-    <w:lsdException w:name="heading 8" w:semiHidden="1" w:uiPriority="9" w:unhideWhenUsed="1" w:qFormat="1"/>
-    <w:lsdException w:name="heading 9" w:semiHidden="1" w:uiPriority="9" w:unhideWhenUsed="1" w:qFormat="1"/>
-    <w:lsdException w:name="index 1" w:semiHidden="1" w:unhideWhenUsed="1"/>
-    <w:lsdException w:name="index 2" w:semiHidden="1" w:unhideWhenUsed="1"/>
-    <w:lsdException w:name="index 3" w:semiHidden="1" w:unhideWhenUsed="1"/>
-    <w:lsdException w:name="index 4" w:semiHidden="1" w:unhideWhenUsed="1"/>
-    <w:lsdException w:name="index 5" w:semiHidden="1" w:unhideWhenUsed="1"/>
-    <w:lsdException w:name="index 6" w:semiHidden="1" w:unhideWhenUsed="1"/>
-    <w:lsdException w:name="index 7" w:semiHidden="1" w:unhideWhenUsed="1"/>
-    <w:lsdException w:name="index 8" w:semiHidden="1" w:unhideWhenUsed="1"/>
-    <w:lsdException w:name="index 9" w:semiHidden="1" w:unhideWhenUsed="1"/>
-    <w:lsdException w:name="toc 1" w:semiHidden="1" w:uiPriority="39" w:unhideWhenUsed="1"/>
-    <w:lsdException w:name="toc 2" w:semiHidden="1" w:uiPriority="39" w:unhideWhenUsed="1"/>
-    <w:lsdException w:name="toc 3" w:semiHidden="1" w:uiPriority="39" w:unhideWhenUsed="1"/>
-    <w:lsdException w:name="toc 4" w:semiHidden="1" w:uiPriority="39" w:unhideWhenUsed="1"/>
-    <w:lsdException w:name="toc 5" w:semiHidden="1" w:uiPriority="39" w:unhideWhenUsed="1"/>
-    <w:lsdException w:name="toc 6" w:semiHidden="1" w:uiPriority="39" w:unhideWhenUsed="1"/>
-    <w:lsdException w:name="toc 7" w:semiHidden="1" w:uiPriority="39" w:unhideWhenUsed="1"/>
-    <w:lsdException w:name="toc 8" w:semiHidden="1" w:uiPriority="39" w:unhideWhenUsed="1"/>
-    <w:lsdException w:name="toc 9" w:semiHidden="1" w:uiPriority="39" w:unhideWhenUsed="1"/>
-    <w:lsdException w:name="Normal Indent" w:semiHidden="1" w:unhideWhenUsed="1"/>
-    <w:lsdException w:name="footnote text" w:semiHidden="1" w:unhideWhenUsed="1"/>
-    <w:lsdException w:name="annotation text" w:semiHidden="1" w:unhideWhenUsed="1"/>
-    <w:lsdException w:name="header" w:semiHidden="1" w:unhideWhenUsed="1"/>
-    <w:lsdException w:name="footer" w:semiHidden="1" w:unhideWhenUsed="1"/>
-    <w:lsdException w:name="index heading" w:semiHidden="1" w:unhideWhenUsed="1"/>
-    <w:lsdException w:name="caption" w:semiHidden="1" w:uiPriority="35" w:unhideWhenUsed="1" w:qFormat="1"/>
-    <w:lsdException w:name="table of figures" w:semiHidden="1" w:unhideWhenUsed="1"/>
-    <w:lsdException w:name="envelope address" w:semiHidden="1" w:unhideWhenUsed="1"/>
-    <w:lsdException w:name="envelope return" w:semiHidden="1" w:unhideWhenUsed="1"/>
-    <w:lsdException w:name="footnote reference" w:semiHidden="1" w:unhideWhenUsed="1"/>
-    <w:lsdException w:name="annotation reference" w:semiHidden="1" w:unhideWhenUsed="1"/>
-    <w:lsdException w:name="line number" w:semiHidden="1" w:unhideWhenUsed="1"/>
-    <w:lsdException w:name="page number" w:semiHidden="1" w:unhideWhenUsed="1"/>
-    <w:lsdException w:name="endnote reference" w:semiHidden="1" w:unhideWhenUsed="1"/>
-    <w:lsdException w:name="endnote text" w:semiHidden="1" w:unhideWhenUsed="1"/>
-    <w:lsdException w:name="table of authorities" w:semiHidden="1" w:unhideWhenUsed="1"/>
-    <w:lsdException w:name="macro" w:semiHidden="1" w:unhideWhenUsed="1"/>
-    <w:lsdException w:name="toa heading" w:semiHidden="1" w:unhideWhenUsed="1"/>
-    <w:lsdException w:name="List" w:semiHidden="1" w:unhideWhenUsed="1"/>
-    <w:lsdException w:name="List Bullet" w:semiHidden="1" w:unhideWhenUsed="1"/>
-    <w:lsdException w:name="List Number" w:semiHidden="1" w:unhideWhenUsed="1"/>
-    <w:lsdException w:name="List 2" w:semiHidden="1" w:unhideWhenUsed="1"/>
-    <w:lsdException w:name="List 3" w:semiHidden="1" w:unhideWhenUsed="1"/>
-    <w:lsdException w:name="List 4" w:semiHidden="1" w:unhideWhenUsed="1"/>
-    <w:lsdException w:name="List 5" w:semiHidden="1" w:unhideWhenUsed="1"/>
-    <w:lsdException w:name="List Bullet 2" w:semiHidden="1" w:unhideWhenUsed="1"/>
-    <w:lsdException w:name="List Bullet 3" w:semiHidden="1" w:unhideWhenUsed="1"/>
-    <w:lsdException w:name="List Bullet 4" w:semiHidden="1" w:unhideWhenUsed="1"/>
-    <w:lsdException w:name="List Bullet 5" w:semiHidden="1" w:unhideWhenUsed="1"/>
-    <w:lsdException w:name="List Number 2" w:semiHidden="1" w:unhideWhenUsed="1"/>
-    <w:lsdException w:name="List Number 3" w:semiHidden="1" w:unhideWhenUsed="1"/>
-    <w:lsdException w:name="List Number 4" w:semiHidden="1" w:unhideWhenUsed="1"/>
-    <w:lsdException w:name="List Number 5" w:semiHidden="1" w:unhideWhenUsed="1"/>
-    <w:lsdException w:name="Title" w:uiPriority="10" w:qFormat="1"/>
-    <w:lsdException w:name="Closing" w:semiHidden="1" w:unhideWhenUsed="1"/>
-    <w:lsdException w:name="Signature" w:semiHidden="1" w:unhideWhenUsed="1"/>
-    <w:lsdException w:name="Default Paragraph Font" w:semiHidden="1" w:uiPriority="1" w:unhideWhenUsed="1"/>
-    <w:lsdException w:name="Body Text" w:semiHidden="1" w:unhideWhenUsed="1"/>
-    <w:lsdException w:name="Body Text Indent" w:semiHidden="1" w:unhideWhenUsed="1"/>
-    <w:lsdException w:name="List Continue" w:semiHidden="1" w:unhideWhenUsed="1"/>
-    <w:lsdException w:name="List Continue 2" w:semiHidden="1" w:unhideWhenUsed="1"/>
-    <w:lsdException w:name="List Continue 3" w:semiHidden="1" w:unhideWhenUsed="1"/>
-    <w:lsdException w:name="List Continue 4" w:semiHidden="1" w:unhideWhenUsed="1"/>
-    <w:lsdException w:name="List Continue 5" w:semiHidden="1" w:unhideWhenUsed="1"/>
-    <w:lsdException w:name="Message Header" w:semiHidden="1" w:unhideWhenUsed="1"/>
-    <w:lsdException w:name="Subtitle" w:uiPriority="11" w:qFormat="1"/>
-    <w:lsdException w:name="Salutation" w:semiHidden="1" w:unhideWhenUsed="1"/>
-    <w:lsdException w:name="Date" w:semiHidden="1" w:unhideWhenUsed="1"/>
-    <w:lsdException w:name="Body Text First Indent" w:semiHidden="1" w:unhideWhenUsed="1"/>
-    <w:lsdException w:name="Body Text First Indent 2" w:semiHidden="1" w:unhideWhenUsed="1"/>
-    <w:lsdException w:name="Note Heading" w:semiHidden="1" w:unhideWhenUsed="1"/>
-    <w:lsdException w:name="Body Text 2" w:semiHidden="1" w:unhideWhenUsed="1"/>
-    <w:lsdException w:name="Body Text 3" w:semiHidden="1" w:unhideWhenUsed="1"/>
-    <w:lsdException w:name="Body Text Indent 2" w:semiHidden="1" w:unhideWhenUsed="1"/>
-    <w:lsdException w:name="Body Text Indent 3" w:semiHidden="1" w:unhideWhenUsed="1"/>
-    <w:lsdException w:name="Block Text" w:semiHidden="1" w:unhideWhenUsed="1"/>
-    <w:lsdException w:name="Hyperlink" w:semiHidden="1" w:unhideWhenUsed="1"/>
-    <w:lsdException w:name="FollowedHyperlink" w:semiHidden="1" w:unhideWhenUsed="1"/>
-    <w:lsdException w:name="Strong" w:uiPriority="22" w:qFormat="1"/>
-    <w:lsdException w:name="Emphasis" w:uiPriority="20" w:qFormat="1"/>
-    <w:lsdException w:name="Document Map" w:semiHidden="1" w:unhideWhenUsed="1"/>
-    <w:lsdException w:name="Plain Text" w:semiHidden="1" w:unhideWhenUsed="1"/>
-    <w:lsdException w:name="E-mail Signature" w:semiHidden="1" w:unhideWhenUsed="1"/>
-    <w:lsdException w:name="HTML Top of Form" w:semiHidden="1" w:unhideWhenUsed="1"/>
-    <w:lsdException w:name="HTML Bottom of Form" w:semiHidden="1" w:unhideWhenUsed="1"/>
-    <w:lsdException w:name="Normal (Web)" w:semiHidden="1" w:unhideWhenUsed="1"/>
-    <w:lsdException w:name="HTML Acronym" w:semiHidden="1" w:unhideWhenUsed="1"/>
-    <w:lsdException w:name="HTML Address" w:semiHidden="1" w:unhideWhenUsed="1"/>
-    <w:lsdException w:name="HTML Cite" w:semiHidden="1" w:unhideWhenUsed="1"/>
-    <w:lsdException w:name="HTML Code" w:semiHidden="1" w:unhideWhenUsed="1"/>
-    <w:lsdException w:name="HTML Definition" w:semiHidden="1" w:unhideWhenUsed="1"/>
-    <w:lsdException w:name="HTML Keyboard" w:semiHidden="1" w:unhideWhenUsed="1"/>
-    <w:lsdException w:name="HTML Preformatted" w:semiHidden="1" w:unhideWhenUsed="1"/>
-    <w:lsdException w:name="HTML Sample" w:semiHidden="1" w:unhideWhenUsed="1"/>
-    <w:lsdException w:name="HTML Typewriter" w:semiHidden="1" w:unhideWhenUsed="1"/>
-    <w:lsdException w:name="HTML Variable" w:semiHidden="1" w:unhideWhenUsed="1"/>
-    <w:lsdException w:name="Normal Table" w:semiHidden="1" w:unhideWhenUsed="1"/>
-    <w:lsdException w:name="annotation subject" w:semiHidden="1" w:unhideWhenUsed="1"/>
-    <w:lsdException w:name="No List" w:semiHidden="1" w:unhideWhenUsed="1"/>
-    <w:lsdException w:name="Outline List 1" w:semiHidden="1" w:unhideWhenUsed="1"/>
-    <w:lsdException w:name="Outline List 2" w:semiHidden="1" w:unhideWhenUsed="1"/>
-    <w:lsdException w:name="Outline List 3" w:semiHidden="1" w:unhideWhenUsed="1"/>
-    <w:lsdException w:name="Table Simple 1" w:semiHidden="1" w:unhideWhenUsed="1"/>
-    <w:lsdException w:name="Table Simple 2" w:semiHidden="1" w:unhideWhenUsed="1"/>
-    <w:lsdException w:name="Table Simple 3" w:semiHidden="1" w:unhideWhenUsed="1"/>
-    <w:lsdException w:name="Table Classic 1" w:semiHidden="1" w:unhideWhenUsed="1"/>
-    <w:lsdException w:name="Table Classic 2" w:semiHidden="1" w:unhideWhenUsed="1"/>
-    <w:lsdException w:name="Table Classic 3" w:semiHidden="1" w:unhideWhenUsed="1"/>
-    <w:lsdException w:name="Table Classic 4" w:semiHidden="1" w:unhideWhenUsed="1"/>
-    <w:lsdException w:name="Table Colorful 1" w:semiHidden="1" w:unhideWhenUsed="1"/>
-    <w:lsdException w:name="Table Colorful 2" w:semiHidden="1" w:unhideWhenUsed="1"/>
-    <w:lsdException w:name="Table Colorful 3" w:semiHidden="1" w:unhideWhenUsed="1"/>
-    <w:lsdException w:name="Table Columns 1" w:semiHidden="1" w:unhideWhenUsed="1"/>
-    <w:lsdException w:name="Table Columns 2" w:semiHidden="1" w:unhideWhenUsed="1"/>
-    <w:lsdException w:name="Table Columns 3" w:semiHidden="1" w:unhideWhenUsed="1"/>
-    <w:lsdException w:name="Table Columns 4" w:semiHidden="1" w:unhideWhenUsed="1"/>
-    <w:lsdException w:name="Table Columns 5" w:semiHidden="1" w:unhideWhenUsed="1"/>
-    <w:lsdException w:name="Table Grid 1" w:semiHidden="1" w:unhideWhenUsed="1"/>
-    <w:lsdException w:name="Table Grid 2" w:semiHidden="1" w:unhideWhenUsed="1"/>
-    <w:lsdException w:name="Table Grid 3" w:semiHidden="1" w:unhideWhenUsed="1"/>
-    <w:lsdException w:name="Table Grid 4" w:semiHidden="1" w:unhideWhenUsed="1"/>
-    <w:lsdException w:name="Table Grid 5" w:semiHidden="1" w:unhideWhenUsed="1"/>
-    <w:lsdException w:name="Table Grid 6" w:semiHidden="1" w:unhideWhenUsed="1"/>
-    <w:lsdException w:name="Table Grid 7" w:semiHidden="1" w:unhideWhenUsed="1"/>
-    <w:lsdException w:name="Table Grid 8" w:semiHidden="1" w:unhideWhenUsed="1"/>
-    <w:lsdException w:name="Table List 1" w:semiHidden="1" w:unhideWhenUsed="1"/>
-    <w:lsdException w:name="Table List 2" w:semiHidden="1" w:unhideWhenUsed="1"/>
-    <w:lsdException w:name="Table List 3" w:semiHidden="1" w:unhideWhenUsed="1"/>
-    <w:lsdException w:name="Table List 4" w:semiHidden="1" w:unhideWhenUsed="1"/>
-    <w:lsdException w:name="Table List 5" w:semiHidden="1" w:unhideWhenUsed="1"/>
-    <w:lsdException w:name="Table List 6" w:semiHidden="1" w:unhideWhenUsed="1"/>
-    <w:lsdException w:name="Table List 7" w:semiHidden="1" w:unhideWhenUsed="1"/>
-    <w:lsdException w:name="Table List 8" w:semiHidden="1" w:unhideWhenUsed="1"/>
-    <w:lsdException w:name="Table 3D effects 1" w:semiHidden="1" w:unhideWhenUsed="1"/>
-    <w:lsdException w:name="Table 3D effects 2" w:semiHidden="1" w:unhideWhenUsed="1"/>
-    <w:lsdException w:name="Table 3D effects 3" w:semiHidden="1" w:unhideWhenUsed="1"/>
-    <w:lsdException w:name="Table Contemporary" w:semiHidden="1" w:unhideWhenUsed="1"/>
-    <w:lsdException w:name="Table Elegant" w:semiHidden="1" w:unhideWhenUsed="1"/>
-    <w:lsdException w:name="Table Professional" w:semiHidden="1" w:unhideWhenUsed="1"/>
-    <w:lsdException w:name="Table Subtle 1" w:semiHidden="1" w:unhideWhenUsed="1"/>
-    <w:lsdException w:name="Table Subtle 2" w:semiHidden="1" w:unhideWhenUsed="1"/>
-    <w:lsdException w:name="Table Web 1" w:semiHidden="1" w:unhideWhenUsed="1"/>
-    <w:lsdException w:name="Table Web 2" w:semiHidden="1" w:unhideWhenUsed="1"/>
-    <w:lsdException w:name="Table Web 3" w:semiHidden="1" w:unhideWhenUsed="1"/>
-    <w:lsdException w:name="Balloon Text" w:semiHidden="1" w:unhideWhenUsed="1"/>
-    <w:lsdException w:name="Table Grid" w:uiPriority="39"/>
-    <w:lsdException w:name="Table Theme" w:semiHidden="1" w:unhideWhenUsed="1"/>
-    <w:lsdException w:name="Placeholder Text" w:semiHidden="1"/>
-    <w:lsdException w:name="No Spacing" w:uiPriority="1" w:qFormat="1"/>
-    <w:lsdException w:name="Light Shading" w:uiPriority="60"/>
-    <w:lsdException w:name="Light List" w:uiPriority="61"/>
-    <w:lsdException w:name="Light Grid" w:uiPriority="62"/>
-    <w:lsdException w:name="Medium Shading 1" w:uiPriority="63"/>
-    <w:lsdException w:name="Medium Shading 2" w:uiPriority="64"/>
-    <w:lsdException w:name="Medium List 1" w:uiPriority="65"/>
-    <w:lsdException w:name="Medium List 2" w:uiPriority="66"/>
-    <w:lsdException w:name="Medium Grid 1" w:uiPriority="67"/>
-    <w:lsdException w:name="Medium Grid 2" w:uiPriority="68"/>
-    <w:lsdException w:name="Medium Grid 3" w:uiPriority="69"/>
-    <w:lsdException w:name="Dark List" w:uiPriority="70"/>
-    <w:lsdException w:name="Colorful Shading" w:uiPriority="71"/>
-    <w:lsdException w:name="Colorful List" w:uiPriority="72"/>
-    <w:lsdException w:name="Colorful Grid" w:uiPriority="73"/>
-    <w:lsdException w:name="Light Shading Accent 1" w:uiPriority="60"/>
-    <w:lsdException w:name="Light List Accent 1" w:uiPriority="61"/>
-    <w:lsdException w:name="Light Grid Accent 1" w:uiPriority="62"/>
-    <w:lsdException w:name="Medium Shading 1 Accent 1" w:uiPriority="63"/>
-    <w:lsdException w:name="Medium Shading 2 Accent 1" w:uiPriority="64"/>
-    <w:lsdException w:name="Medium List 1 Accent 1" w:uiPriority="65"/>
-    <w:lsdException w:name="Revision" w:semiHidden="1"/>
-    <w:lsdException w:name="List Paragraph" w:uiPriority="34" w:qFormat="1"/>
-    <w:lsdException w:name="Quote" w:uiPriority="29" w:qFormat="1"/>
-    <w:lsdException w:name="Intense Quote" w:uiPriority="30" w:qFormat="1"/>
-    <w:lsdException w:name="Medium List 2 Accent 1" w:uiPriority="66"/>
-    <w:lsdException w:name="Medium Grid 1 Accent 1" w:uiPriority="67"/>
-    <w:lsdException w:name="Medium Grid 2 Accent 1" w:uiPriority="68"/>
-    <w:lsdException w:name="Medium Grid 3 Accent 1" w:uiPriority="69"/>
-    <w:lsdException w:name="Dark List Accent 1" w:uiPriority="70"/>
-    <w:lsdException w:name="Colorful Shading Accent 1" w:uiPriority="71"/>
-    <w:lsdException w:name="Colorful List Accent 1" w:uiPriority="72"/>
-    <w:lsdException w:name="Colorful Grid Accent 1" w:uiPriority="73"/>
-    <w:lsdException w:name="Light Shading Accent 2" w:uiPriority="60"/>
-    <w:lsdException w:name="Light List Accent 2" w:uiPriority="61"/>
-    <w:lsdException w:name="Light Grid Accent 2" w:uiPriority="62"/>
-    <w:lsdException w:name="Medium Shading 1 Accent 2" w:uiPriority="63"/>
-    <w:lsdException w:name="Medium Shading 2 Accent 2" w:uiPriority="64"/>
-    <w:lsdException w:name="Medium List 1 Accent 2" w:uiPriority="65"/>
-    <w:lsdException w:name="Medium List 2 Accent 2" w:uiPriority="66"/>
-    <w:lsdException w:name="Medium Grid 1 Accent 2" w:uiPriority="67"/>
-    <w:lsdException w:name="Medium Grid 2 Accent 2" w:uiPriority="68"/>
-    <w:lsdException w:name="Medium Grid 3 Accent 2" w:uiPriority="69"/>
-    <w:lsdException w:name="Dark List Accent 2" w:uiPriority="70"/>
-    <w:lsdException w:name="Colorful Shading Accent 2" w:uiPriority="71"/>
-    <w:lsdException w:name="Colorful List Accent 2" w:uiPriority="72"/>
-    <w:lsdException w:name="Colorful Grid Accent 2" w:uiPriority="73"/>
-    <w:lsdException w:name="Light Shading Accent 3" w:uiPriority="60"/>
-    <w:lsdException w:name="Light List Accent 3" w:uiPriority="61"/>
-    <w:lsdException w:name="Light Grid Accent 3" w:uiPriority="62"/>
-    <w:lsdException w:name="Medium Shading 1 Accent 3" w:uiPriority="63"/>
-    <w:lsdException w:name="Medium Shading 2 Accent 3" w:uiPriority="64"/>
-    <w:lsdException w:name="Medium List 1 Accent 3" w:uiPriority="65"/>
-    <w:lsdException w:name="Medium List 2 Accent 3" w:uiPriority="66"/>
-    <w:lsdException w:name="Medium Grid 1 Accent 3" w:uiPriority="67"/>
-    <w:lsdException w:name="Medium Grid 2 Accent 3" w:uiPriority="68"/>
-    <w:lsdException w:name="Medium Grid 3 Accent 3" w:uiPriority="69"/>
-    <w:lsdException w:name="Dark List Accent 3" w:uiPriority="70"/>
-    <w:lsdException w:name="Colorful Shading Accent 3" w:uiPriority="71"/>
-    <w:lsdException w:name="Colorful List Accent 3" w:uiPriority="72"/>
-    <w:lsdException w:name="Colorful Grid Accent 3" w:uiPriority="73"/>
-    <w:lsdException w:name="Light Shading Accent 4" w:uiPriority="60"/>
-    <w:lsdException w:name="Light List Accent 4" w:uiPriority="61"/>
-    <w:lsdException w:name="Light Grid Accent 4" w:uiPriority="62"/>
-    <w:lsdException w:name="Medium Shading 1 Accent 4" w:uiPriority="63"/>
-    <w:lsdException w:name="Medium Shading 2 Accent 4" w:uiPriority="64"/>
-    <w:lsdException w:name="Medium List 1 Accent 4" w:uiPriority="65"/>
-    <w:lsdException w:name="Medium List 2 Accent 4" w:uiPriority="66"/>
-    <w:lsdException w:name="Medium Grid 1 Accent 4" w:uiPriority="67"/>
-    <w:lsdException w:name="Medium Grid 2 Accent 4" w:uiPriority="68"/>
-    <w:lsdException w:name="Medium Grid 3 Accent 4" w:uiPriority="69"/>
-    <w:lsdException w:name="Dark List Accent 4" w:uiPriority="70"/>
-    <w:lsdException w:name="Colorful Shading Accent 4" w:uiPriority="71"/>
-    <w:lsdException w:name="Colorful List Accent 4" w:uiPriority="72"/>
-    <w:lsdException w:name="Colorful Grid Accent 4" w:uiPriority="73"/>
-    <w:lsdException w:name="Light Shading Accent 5" w:uiPriority="60"/>
-    <w:lsdException w:name="Light List Accent 5" w:uiPriority="61"/>
-    <w:lsdException w:name="Light Grid Accent 5" w:uiPriority="62"/>
-    <w:lsdException w:name="Medium Shading 1 Accent 5" w:uiPriority="63"/>
-    <w:lsdException w:name="Medium Shading 2 Accent 5" w:uiPriority="64"/>
-    <w:lsdException w:name="Medium List 1 Accent 5" w:uiPriority="65"/>
-    <w:lsdException w:name="Medium List 2 Accent 5" w:uiPriority="66"/>
-    <w:lsdException w:name="Medium Grid 1 Accent 5" w:uiPriority="67"/>
-    <w:lsdException w:name="Medium Grid 2 Accent 5" w:uiPriority="68"/>
-    <w:lsdException w:name="Medium Grid 3 Accent 5" w:uiPriority="69"/>
-    <w:lsdException w:name="Dark List Accent 5" w:uiPriority="70"/>
-    <w:lsdException w:name="Colorful Shading Accent 5" w:uiPriority="71"/>
-    <w:lsdException w:name="Colorful List Accent 5" w:uiPriority="72"/>
-    <w:lsdException w:name="Colorful Grid Accent 5" w:uiPriority="73"/>
-    <w:lsdException w:name="Light Shading Accent 6" w:uiPriority="60"/>
-    <w:lsdException w:name="Light List Accent 6" w:uiPriority="61"/>
-    <w:lsdException w:name="Light Grid Accent 6" w:uiPriority="62"/>
-    <w:lsdException w:name="Medium Shading 1 Accent 6" w:uiPriority="63"/>
-    <w:lsdException w:name="Medium Shading 2 Accent 6" w:uiPriority="64"/>
-    <w:lsdException w:name="Medium List 1 Accent 6" w:uiPriority="65"/>
-    <w:lsdException w:name="Medium List 2 Accent 6" w:uiPriority="66"/>
-    <w:lsdException w:name="Medium Grid 1 Accent 6" w:uiPriority="67"/>
-    <w:lsdException w:name="Medium Grid 2 Accent 6" w:uiPriority="68"/>
-    <w:lsdException w:name="Medium Grid 3 Accent 6" w:uiPriority="69"/>
-    <w:lsdException w:name="Dark List Accent 6" w:uiPriority="70"/>
-    <w:lsdException w:name="Colorful Shading Accent 6" w:uiPriority="71"/>
-    <w:lsdException w:name="Colorful List Accent 6" w:uiPriority="72"/>
-    <w:lsdException w:name="Colorful Grid Accent 6" w:uiPriority="73"/>
-    <w:lsdException w:name="Subtle Emphasis" w:uiPriority="19" w:qFormat="1"/>
-    <w:lsdException w:name="Intense Emphasis" w:uiPriority="21" w:qFormat="1"/>
-    <w:lsdException w:name="Subtle Reference" w:uiPriority="31" w:qFormat="1"/>
-    <w:lsdException w:name="Intense Reference" w:uiPriority="32" w:qFormat="1"/>
-    <w:lsdException w:name="Book Title" w:uiPriority="33" w:qFormat="1"/>
-    <w:lsdException w:name="Bibliography" w:semiHidden="1" w:uiPriority="37" w:unhideWhenUsed="1"/>
-    <w:lsdException w:name="TOC Heading" w:semiHidden="1" w:uiPriority="39" w:unhideWhenUsed="1" w:qFormat="1"/>
-    <w:lsdException w:name="Plain Table 1" w:uiPriority="41"/>
-    <w:lsdException w:name="Plain Table 2" w:uiPriority="42"/>
-    <w:lsdException w:name="Plain Table 3" w:uiPriority="43"/>
-    <w:lsdException w:name="Plain Table 4" w:uiPriority="44"/>
-    <w:lsdException w:name="Plain Table 5" w:uiPriority="45"/>
-    <w:lsdException w:name="Grid Table Light" w:uiPriority="40"/>
-    <w:lsdException w:name="Grid Table 1 Light" w:uiPriority="46"/>
-    <w:lsdException w:name="Grid Table 2" w:uiPriority="47"/>
-    <w:lsdException w:name="Grid Table 3" w:uiPriority="48"/>
-    <w:lsdException w:name="Grid Table 4" w:uiPriority="49"/>
-    <w:lsdException w:name="Grid Table 5 Dark" w:uiPriority="50"/>
-    <w:lsdException w:name="Grid Table 6 Colorful" w:uiPriority="51"/>
-    <w:lsdException w:name="Grid Table 7 Colorful" w:uiPriority="52"/>
-    <w:lsdException w:name="Grid Table 1 Light Accent 1" w:uiPriority="46"/>
-    <w:lsdException w:name="Grid Table 2 Accent 1" w:uiPriority="47"/>
-    <w:lsdException w:name="Grid Table 3 Accent 1" w:uiPriority="48"/>
-    <w:lsdException w:name="Grid Table 4 Accent 1" w:uiPriority="49"/>
-    <w:lsdException w:name="Grid Table 5 Dark Accent 1" w:uiPriority="50"/>
-    <w:lsdException w:name="Grid Table 6 Colorful Accent 1" w:uiPriority="51"/>
-    <w:lsdException w:name="Grid Table 7 Colorful Accent 1" w:uiPriority="52"/>
-    <w:lsdException w:name="Grid Table 1 Light Accent 2" w:uiPriority="46"/>
-    <w:lsdException w:name="Grid Table 2 Accent 2" w:uiPriority="47"/>
-    <w:lsdException w:name="Grid Table 3 Accent 2" w:uiPriority="48"/>
-    <w:lsdException w:name="Grid Table 4 Accent 2" w:uiPriority="49"/>
-    <w:lsdException w:name="Grid Table 5 Dark Accent 2" w:uiPriority="50"/>
-    <w:lsdException w:name="Grid Table 6 Colorful Accent 2" w:uiPriority="51"/>
-    <w:lsdException w:name="Grid Table 7 Colorful Accent 2" w:uiPriority="52"/>
-    <w:lsdException w:name="Grid Table 1 Light Accent 3" w:uiPriority="46"/>
-    <w:lsdException w:name="Grid Table 2 Accent 3" w:uiPriority="47"/>
-    <w:lsdException w:name="Grid Table 3 Accent 3" w:uiPriority="48"/>
-    <w:lsdException w:name="Grid Table 4 Accent 3" w:uiPriority="49"/>
-    <w:lsdException w:name="Grid Table 5 Dark Accent 3" w:uiPriority="50"/>
-    <w:lsdException w:name="Grid Table 6 Colorful Accent 3" w:uiPriority="51"/>
-    <w:lsdException w:name="Grid Table 7 Colorful Accent 3" w:uiPriority="52"/>
-    <w:lsdException w:name="Grid Table 1 Light Accent 4" w:uiPriority="46"/>
-    <w:lsdException w:name="Grid Table 2 Accent 4" w:uiPriority="47"/>
-    <w:lsdException w:name="Grid Table 3 Accent 4" w:uiPriority="48"/>
-    <w:lsdException w:name="Grid Table 4 Accent 4" w:uiPriority="49"/>
-    <w:lsdException w:name="Grid Table 5 Dark Accent 4" w:uiPriority="50"/>
-    <w:lsdException w:name="Grid Table 6 Colorful Accent 4" w:uiPriority="51"/>
-    <w:lsdException w:name="Grid Table 7 Colorful Accent 4" w:uiPriority="52"/>
-    <w:lsdException w:name="Grid Table 1 Light Accent 5" w:uiPriority="46"/>
-    <w:lsdException w:name="Grid Table 2 Accent 5" w:uiPriority="47"/>
-    <w:lsdException w:name="Grid Table 3 Accent 5" w:uiPriority="48"/>
-    <w:lsdException w:name="Grid Table 4 Accent 5" w:uiPriority="49"/>
-    <w:lsdException w:name="Grid Table 5 Dark Accent 5" w:uiPriority="50"/>
-    <w:lsdException w:name="Grid Table 6 Colorful Accent 5" w:uiPriority="51"/>
-    <w:lsdException w:name="Grid Table 7 Colorful Accent 5" w:uiPriority="52"/>
-    <w:lsdException w:name="Grid Table 1 Light Accent 6" w:uiPriority="46"/>
-    <w:lsdException w:name="Grid Table 2 Accent 6" w:uiPriority="47"/>
-    <w:lsdException w:name="Grid Table 3 Accent 6" w:uiPriority="48"/>
-    <w:lsdException w:name="Grid Table 4 Accent 6" w:uiPriority="49"/>
-    <w:lsdException w:name="Grid Table 5 Dark Accent 6" w:uiPriority="50"/>
-    <w:lsdException w:name="Grid Table 6 Colorful Accent 6" w:uiPriority="51"/>
-    <w:lsdException w:name="Grid Table 7 Colorful Accent 6" w:uiPriority="52"/>
-    <w:lsdException w:name="List Table 1 Light" w:uiPriority="46"/>
-    <w:lsdException w:name="List Table 2" w:uiPriority="47"/>
-    <w:lsdException w:name="List Table 3" w:uiPriority="48"/>
-    <w:lsdException w:name="List Table 4" w:uiPriority="49"/>
-    <w:lsdException w:name="List Table 5 Dark" w:uiPriority="50"/>
-    <w:lsdException w:name="List Table 6 Colorful" w:uiPriority="51"/>
-    <w:lsdException w:name="List Table 7 Colorful" w:uiPriority="52"/>
-    <w:lsdException w:name="List Table 1 Light Accent 1" w:uiPriority="46"/>
-    <w:lsdException w:name="List Table 2 Accent 1" w:uiPriority="47"/>
-    <w:lsdException w:name="List Table 3 Accent 1" w:uiPriority="48"/>
-    <w:lsdException w:name="List Table 4 Accent 1" w:uiPriority="49"/>
-    <w:lsdException w:name="List Table 5 Dark Accent 1" w:uiPriority="50"/>
-    <w:lsdException w:name="List Table 6 Colorful Accent 1" w:uiPriority="51"/>
-    <w:lsdException w:name="List Table 7 Colorful Accent 1" w:uiPriority="52"/>
-    <w:lsdException w:name="List Table 1 Light Accent 2" w:uiPriority="46"/>
-    <w:lsdException w:name="List Table 2 Accent 2" w:uiPriority="47"/>
-    <w:lsdException w:name="List Table 3 Accent 2" w:uiPriority="48"/>
-    <w:lsdException w:name="List Table 4 Accent 2" w:uiPriority="49"/>
-    <w:lsdException w:name="List Table 5 Dark Accent 2" w:uiPriority="50"/>
-    <w:lsdException w:name="List Table 6 Colorful Accent 2" w:uiPriority="51"/>
-    <w:lsdException w:name="List Table 7 Colorful Accent 2" w:uiPriority="52"/>
-    <w:lsdException w:name="List Table 1 Light Accent 3" w:uiPriority="46"/>
-    <w:lsdException w:name="List Table 2 Accent 3" w:uiPriority="47"/>
-    <w:lsdException w:name="List Table 3 Accent 3" w:uiPriority="48"/>
-    <w:lsdException w:name="List Table 4 Accent 3" w:uiPriority="49"/>
-    <w:lsdException w:name="List Table 5 Dark Accent 3" w:uiPriority="50"/>
-    <w:lsdException w:name="List Table 6 Colorful Accent 3" w:uiPriority="51"/>
-    <w:lsdException w:name="List Table 7 Colorful Accent 3" w:uiPriority="52"/>
-    <w:lsdException w:name="List Table 1 Light Accent 4" w:uiPriority="46"/>
-    <w:lsdException w:name="List Table 2 Accent 4" w:uiPriority="47"/>
-    <w:lsdException w:name="List Table 3 Accent 4" w:uiPriority="48"/>
-    <w:lsdException w:name="List Table 4 Accent 4" w:uiPriority="49"/>
-    <w:lsdException w:name="List Table 5 Dark Accent 4" w:uiPriority="50"/>
-    <w:lsdException w:name="List Table 6 Colorful Accent 4" w:uiPriority="51"/>
-    <w:lsdException w:name="List Table 7 Colorful Accent 4" w:uiPriority="52"/>
-    <w:lsdException w:name="List Table 1 Light Accent 5" w:uiPriority="46"/>
-    <w:lsdException w:name="List Table 2 Accent 5" w:uiPriority="47"/>
-    <w:lsdException w:name="List Table 3 Accent 5" w:uiPriority="48"/>
-    <w:lsdException w:name="List Table 4 Accent 5" w:uiPriority="49"/>
-    <w:lsdException w:name="List Table 5 Dark Accent 5" w:uiPriority="50"/>
-    <w:lsdException w:name="List Table 6 Colorful Accent 5" w:uiPriority="51"/>
-    <w:lsdException w:name="List Table 7 Colorful Accent 5" w:uiPriority="52"/>
-    <w:lsdException w:name="List Table 1 Light Accent 6" w:uiPriority="46"/>
-    <w:lsdException w:name="List Table 2 Accent 6" w:uiPriority="47"/>
-    <w:lsdException w:name="List Table 3 Accent 6" w:uiPriority="48"/>
-    <w:lsdException w:name="List Table 4 Accent 6" w:uiPriority="49"/>
-    <w:lsdException w:name="List Table 5 Dark Accent 6" w:uiPriority="50"/>
-    <w:lsdException w:name="List Table 6 Colorful Accent 6" w:uiPriority="51"/>
-    <w:lsdException w:name="List Table 7 Colorful Accent 6" w:uiPriority="52"/>
-  </w:latentStyles>
-  <w:style w:type="paragraph" w:default="1" w:styleId="Normal">
-    <w:name w:val="Normal"/>
-    <w:qFormat/>
-  </w:style>
-  <w:style w:type="character" w:default="1" w:styleId="DefaultParagraphFont">
-    <w:name w:val="Default Paragraph Font"/>
-    <w:uiPriority w:val="1"/>
-    <w:semiHidden/>
-    <w:unhideWhenUsed/>
-  </w:style>
-  <w:style w:type="table" w:default="1" w:styleId="TableNormal">
-    <w:name w:val="Normal Table"/>
-    <w:uiPriority w:val="99"/>
-    <w:semiHidden/>
-    <w:unhideWhenUsed/>
-    <w:tblPr>
-      <w:tblInd w:w="0" w:type="dxa"/>
-      <w:tblCellMar>
-        <w:top w:w="0" w:type="dxa"/>
-        <w:left w:w="108" w:type="dxa"/>
-        <w:bottom w:w="0" w:type="dxa"/>
-        <w:right w:w="108" w:type="dxa"/>
-      </w:tblCellMar>
-    </w:tblPr>
-  </w:style>
-  <w:style w:type="numbering" w:default="1" w:styleId="NoList">
-    <w:name w:val="No List"/>
-    <w:uiPriority w:val="99"/>
-    <w:semiHidden/>
-    <w:unhideWhenUsed/>
-  </w:style>
-  <w:style w:type="character" w:styleId="PlaceholderText">
-    <w:name w:val="Placeholder Text"/>
-    <w:basedOn w:val="DefaultParagraphFont"/>
-    <w:uiPriority w:val="99"/>
-    <w:semiHidden/>
-    <w:rsid w:val="00B33CA7"/>
-    <w:rPr>
-      <w:color w:val="808080"/>
-    </w:rPr>
-  </w:style>
-</w:styles>
-</file>
-
-<file path=word/glossary/webSettings.xml><?xml version="1.0" encoding="utf-8"?>
-<w:webSettings xmlns:mc="http://schemas.openxmlformats.org/markup-compatibility/2006" xmlns:r="http://schemas.openxmlformats.org/officeDocument/2006/relationships" xmlns:w="http://schemas.openxmlformats.org/wordprocessingml/2006/main" xmlns:w14="http://schemas.microsoft.com/office/word/2010/wordml" xmlns:w15="http://schemas.microsoft.com/office/word/2012/wordml" mc:Ignorable="w14 w15">
-  <w:optimizeForBrowser/>
-  <w:allowPNG/>
-</w:webSettings>
-</file>
-
 <file path=word/theme/theme1.xml><?xml version="1.0" encoding="utf-8"?>
 <a:theme xmlns:a="http://schemas.openxmlformats.org/drawingml/2006/main" name="Office Theme">
   <a:themeElements>
@@ -23753,7 +23290,7 @@
 </file>
 
 <file path=customXml/itemProps1.xml><?xml version="1.0" encoding="utf-8"?>
-<ds:datastoreItem xmlns:ds="http://schemas.openxmlformats.org/officeDocument/2006/customXml" ds:itemID="{87E06FB7-54AC-4BAB-A6E1-B3A765F7BD4C}">
+<ds:datastoreItem xmlns:ds="http://schemas.openxmlformats.org/officeDocument/2006/customXml" ds:itemID="{913C8B0D-4E9D-4E5C-B78F-5545E5827207}">
   <ds:schemaRefs>
     <ds:schemaRef ds:uri="http://schemas.openxmlformats.org/officeDocument/2006/bibliography"/>
   </ds:schemaRefs>

</xml_diff>